<commit_message>
Docs:Added captions to the wireframe diagrams
</commit_message>
<xml_diff>
--- a/Documentation.docx
+++ b/Documentation.docx
@@ -1199,24 +1199,14 @@
                             <w:r>
                               <w:t xml:space="preserve">Figure </w:t>
                             </w:r>
-                            <w:r>
-                              <w:fldChar w:fldCharType="begin"/>
-                            </w:r>
-                            <w:r>
-                              <w:instrText xml:space="preserve"> SEQ Figure \* ARABIC </w:instrText>
-                            </w:r>
-                            <w:r>
-                              <w:fldChar w:fldCharType="separate"/>
-                            </w:r>
-                            <w:r>
-                              <w:rPr>
-                                <w:noProof/>
-                              </w:rPr>
-                              <w:t>1</w:t>
-                            </w:r>
-                            <w:r>
-                              <w:fldChar w:fldCharType="end"/>
-                            </w:r>
+                            <w:fldSimple w:instr=" SEQ Figure \* ARABIC ">
+                              <w:r>
+                                <w:rPr>
+                                  <w:noProof/>
+                                </w:rPr>
+                                <w:t>1</w:t>
+                              </w:r>
+                            </w:fldSimple>
                             <w:r>
                               <w:t xml:space="preserve">: </w:t>
                             </w:r>
@@ -1267,24 +1257,14 @@
                       <w:r>
                         <w:t xml:space="preserve">Figure </w:t>
                       </w:r>
-                      <w:r>
-                        <w:fldChar w:fldCharType="begin"/>
-                      </w:r>
-                      <w:r>
-                        <w:instrText xml:space="preserve"> SEQ Figure \* ARABIC </w:instrText>
-                      </w:r>
-                      <w:r>
-                        <w:fldChar w:fldCharType="separate"/>
-                      </w:r>
-                      <w:r>
-                        <w:rPr>
-                          <w:noProof/>
-                        </w:rPr>
-                        <w:t>1</w:t>
-                      </w:r>
-                      <w:r>
-                        <w:fldChar w:fldCharType="end"/>
-                      </w:r>
+                      <w:fldSimple w:instr=" SEQ Figure \* ARABIC ">
+                        <w:r>
+                          <w:rPr>
+                            <w:noProof/>
+                          </w:rPr>
+                          <w:t>1</w:t>
+                        </w:r>
+                      </w:fldSimple>
                       <w:r>
                         <w:t xml:space="preserve">: </w:t>
                       </w:r>
@@ -1431,14 +1411,12 @@
         </w:rPr>
         <w:t xml:space="preserve"> </w:t>
       </w:r>
-      <w:proofErr w:type="gramStart"/>
       <w:r>
         <w:rPr>
           <w:lang w:val="en-GB"/>
         </w:rPr>
         <w:t>A</w:t>
       </w:r>
-      <w:proofErr w:type="gramEnd"/>
       <w:r>
         <w:rPr>
           <w:lang w:val="en-GB"/>
@@ -1514,24 +1492,14 @@
       <w:r>
         <w:t xml:space="preserve">Figure </w:t>
       </w:r>
-      <w:r>
-        <w:fldChar w:fldCharType="begin"/>
-      </w:r>
-      <w:r>
-        <w:instrText xml:space="preserve"> SEQ Figure \* ARABIC </w:instrText>
-      </w:r>
-      <w:r>
-        <w:fldChar w:fldCharType="separate"/>
-      </w:r>
-      <w:r>
-        <w:rPr>
-          <w:noProof/>
-        </w:rPr>
-        <w:t>2</w:t>
-      </w:r>
-      <w:r>
-        <w:fldChar w:fldCharType="end"/>
-      </w:r>
+      <w:fldSimple w:instr=" SEQ Figure \* ARABIC ">
+        <w:r>
+          <w:rPr>
+            <w:noProof/>
+          </w:rPr>
+          <w:t>2</w:t>
+        </w:r>
+      </w:fldSimple>
       <w:r>
         <w:rPr>
           <w:lang w:val="en-GB"/>
@@ -1601,38 +1569,30 @@
         </w:rPr>
         <w:t xml:space="preserve"> </w:t>
       </w:r>
+      <w:r>
+        <w:rPr>
+          <w:lang w:val="en-GB"/>
+        </w:rPr>
+        <w:t xml:space="preserve">The actions carried out depend on the role of the user, but all the users can log in and out. A user can record many batches of milk </w:t>
+      </w:r>
       <w:proofErr w:type="gramStart"/>
       <w:r>
         <w:rPr>
           <w:lang w:val="en-GB"/>
         </w:rPr>
-        <w:t>The</w:t>
+        <w:t>deposited</w:t>
+      </w:r>
+      <w:r>
+        <w:rPr>
+          <w:lang w:val="en-GB"/>
+        </w:rPr>
+        <w:t>,</w:t>
       </w:r>
       <w:proofErr w:type="gramEnd"/>
       <w:r>
         <w:rPr>
           <w:lang w:val="en-GB"/>
         </w:rPr>
-        <w:t xml:space="preserve"> actions carried out depend on the role of the user, but all the users can log in and out. A user can record many batches of milk </w:t>
-      </w:r>
-      <w:proofErr w:type="gramStart"/>
-      <w:r>
-        <w:rPr>
-          <w:lang w:val="en-GB"/>
-        </w:rPr>
-        <w:t>deposited</w:t>
-      </w:r>
-      <w:r>
-        <w:rPr>
-          <w:lang w:val="en-GB"/>
-        </w:rPr>
-        <w:t>,</w:t>
-      </w:r>
-      <w:proofErr w:type="gramEnd"/>
-      <w:r>
-        <w:rPr>
-          <w:lang w:val="en-GB"/>
-        </w:rPr>
         <w:t xml:space="preserve"> each batch is verified by the grader</w:t>
       </w:r>
       <w:r>
@@ -1647,19 +1607,11 @@
         </w:rPr>
         <w:t xml:space="preserve"> </w:t>
       </w:r>
-      <w:proofErr w:type="gramStart"/>
-      <w:r>
-        <w:rPr>
-          <w:lang w:val="en-GB"/>
-        </w:rPr>
-        <w:t>One</w:t>
-      </w:r>
-      <w:proofErr w:type="gramEnd"/>
-      <w:r>
-        <w:rPr>
-          <w:lang w:val="en-GB"/>
-        </w:rPr>
-        <w:t xml:space="preserve"> batch one payment.</w:t>
+      <w:r>
+        <w:rPr>
+          <w:lang w:val="en-GB"/>
+        </w:rPr>
+        <w:t>One batch one payment.</w:t>
       </w:r>
       <w:r>
         <w:rPr>
@@ -1763,24 +1715,14 @@
       <w:r>
         <w:t xml:space="preserve">Figure </w:t>
       </w:r>
-      <w:r>
-        <w:fldChar w:fldCharType="begin"/>
-      </w:r>
-      <w:r>
-        <w:instrText xml:space="preserve"> SEQ Figure \* ARABIC </w:instrText>
-      </w:r>
-      <w:r>
-        <w:fldChar w:fldCharType="separate"/>
-      </w:r>
-      <w:r>
-        <w:rPr>
-          <w:noProof/>
-        </w:rPr>
-        <w:t>3</w:t>
-      </w:r>
-      <w:r>
-        <w:fldChar w:fldCharType="end"/>
-      </w:r>
+      <w:fldSimple w:instr=" SEQ Figure \* ARABIC ">
+        <w:r>
+          <w:rPr>
+            <w:noProof/>
+          </w:rPr>
+          <w:t>3</w:t>
+        </w:r>
+      </w:fldSimple>
       <w:r>
         <w:rPr>
           <w:lang w:val="en-GB"/>
@@ -2093,24 +2035,14 @@
       <w:r>
         <w:t xml:space="preserve">Figure </w:t>
       </w:r>
-      <w:r>
-        <w:fldChar w:fldCharType="begin"/>
-      </w:r>
-      <w:r>
-        <w:instrText xml:space="preserve"> SEQ Figure \* ARABIC </w:instrText>
-      </w:r>
-      <w:r>
-        <w:fldChar w:fldCharType="separate"/>
-      </w:r>
-      <w:r>
-        <w:rPr>
-          <w:noProof/>
-        </w:rPr>
-        <w:t>4</w:t>
-      </w:r>
-      <w:r>
-        <w:fldChar w:fldCharType="end"/>
-      </w:r>
+      <w:fldSimple w:instr=" SEQ Figure \* ARABIC ">
+        <w:r>
+          <w:rPr>
+            <w:noProof/>
+          </w:rPr>
+          <w:t>4</w:t>
+        </w:r>
+      </w:fldSimple>
       <w:r>
         <w:rPr>
           <w:lang w:val="en-GB"/>
@@ -2155,21 +2087,7 @@
         <w:rPr>
           <w:lang w:val="en-GB"/>
         </w:rPr>
-        <w:t xml:space="preserve"> as for the database part of the project. </w:t>
-      </w:r>
-      <w:proofErr w:type="gramStart"/>
-      <w:r>
-        <w:rPr>
-          <w:lang w:val="en-GB"/>
-        </w:rPr>
-        <w:t>The</w:t>
-      </w:r>
-      <w:proofErr w:type="gramEnd"/>
-      <w:r>
-        <w:rPr>
-          <w:lang w:val="en-GB"/>
-        </w:rPr>
-        <w:t xml:space="preserve"> figure below is the </w:t>
+        <w:t xml:space="preserve"> as for the database part of the project. The figure below is the </w:t>
       </w:r>
       <w:proofErr w:type="spellStart"/>
       <w:r>
@@ -2249,24 +2167,14 @@
       <w:r>
         <w:t xml:space="preserve">Figure </w:t>
       </w:r>
-      <w:r>
-        <w:fldChar w:fldCharType="begin"/>
-      </w:r>
-      <w:r>
-        <w:instrText xml:space="preserve"> SEQ Figure \* ARABIC </w:instrText>
-      </w:r>
-      <w:r>
-        <w:fldChar w:fldCharType="separate"/>
-      </w:r>
-      <w:r>
-        <w:rPr>
-          <w:noProof/>
-        </w:rPr>
-        <w:t>5</w:t>
-      </w:r>
-      <w:r>
-        <w:fldChar w:fldCharType="end"/>
-      </w:r>
+      <w:fldSimple w:instr=" SEQ Figure \* ARABIC ">
+        <w:r>
+          <w:rPr>
+            <w:noProof/>
+          </w:rPr>
+          <w:t>5</w:t>
+        </w:r>
+      </w:fldSimple>
       <w:r>
         <w:rPr>
           <w:lang w:val="en-GB"/>
@@ -2316,9 +2224,7 @@
     </w:p>
     <w:p>
       <w:pPr>
-        <w:rPr>
-          <w:lang w:val="en-GB"/>
-        </w:rPr>
+        <w:keepNext/>
       </w:pPr>
       <w:r>
         <w:rPr>
@@ -2371,6 +2277,45 @@
     </w:p>
     <w:p>
       <w:pPr>
+        <w:pStyle w:val="Caption"/>
+        <w:rPr>
+          <w:lang w:val="en-GB"/>
+        </w:rPr>
+      </w:pPr>
+      <w:r>
+        <w:t xml:space="preserve">Figure </w:t>
+      </w:r>
+      <w:fldSimple w:instr=" SEQ Figure \* ARABIC ">
+        <w:r>
+          <w:rPr>
+            <w:noProof/>
+          </w:rPr>
+          <w:t>6</w:t>
+        </w:r>
+      </w:fldSimple>
+      <w:r>
+        <w:rPr>
+          <w:lang w:val="en-GB"/>
+        </w:rPr>
+        <w:t>:Login</w:t>
+      </w:r>
+      <w:proofErr w:type="gramStart"/>
+      <w:r>
+        <w:rPr>
+          <w:lang w:val="en-GB"/>
+        </w:rPr>
+        <w:t xml:space="preserve"> ,Register</w:t>
+      </w:r>
+      <w:proofErr w:type="gramEnd"/>
+      <w:r>
+        <w:rPr>
+          <w:lang w:val="en-GB"/>
+        </w:rPr>
+        <w:t xml:space="preserve"> and Help Page Wireframe</w:t>
+      </w:r>
+    </w:p>
+    <w:p>
+      <w:pPr>
         <w:rPr>
           <w:lang w:val="en-GB"/>
         </w:rPr>
@@ -2384,9 +2329,7 @@
     </w:p>
     <w:p>
       <w:pPr>
-        <w:rPr>
-          <w:lang w:val="en-GB"/>
-        </w:rPr>
+        <w:keepNext/>
       </w:pPr>
       <w:r>
         <w:rPr>
@@ -2438,29 +2381,52 @@
     </w:p>
     <w:p>
       <w:pPr>
-        <w:rPr>
-          <w:lang w:val="en-GB"/>
-        </w:rPr>
-      </w:pPr>
-      <w:r>
-        <w:rPr>
-          <w:lang w:val="en-GB"/>
-        </w:rPr>
+        <w:pStyle w:val="Caption"/>
+        <w:rPr>
+          <w:lang w:val="en-GB"/>
+        </w:rPr>
+      </w:pPr>
+      <w:r>
+        <w:t xml:space="preserve">Figure </w:t>
+      </w:r>
+      <w:fldSimple w:instr=" SEQ Figure \* ARABIC ">
+        <w:r>
+          <w:rPr>
+            <w:noProof/>
+          </w:rPr>
+          <w:t>7</w:t>
+        </w:r>
+      </w:fldSimple>
+      <w:r>
+        <w:rPr>
+          <w:lang w:val="en-GB"/>
+        </w:rPr>
+        <w:t>:Farmer Dashboard Wireframe</w:t>
+      </w:r>
+    </w:p>
+    <w:p>
+      <w:pPr>
+        <w:rPr>
+          <w:lang w:val="en-GB"/>
+        </w:rPr>
+      </w:pPr>
+      <w:r>
+        <w:rPr>
+          <w:lang w:val="en-GB"/>
+        </w:rPr>
+        <w:lastRenderedPageBreak/>
         <w:t>2.6.3 Grader Page</w:t>
       </w:r>
     </w:p>
     <w:p>
       <w:pPr>
-        <w:rPr>
-          <w:lang w:val="en-GB"/>
-        </w:rPr>
+        <w:keepNext/>
       </w:pPr>
       <w:r>
         <w:rPr>
           <w:noProof/>
           <w:lang w:val="en-GB"/>
         </w:rPr>
-        <w:lastRenderedPageBreak/>
         <w:drawing>
           <wp:inline distT="0" distB="0" distL="0" distR="0" wp14:anchorId="4BA7890A" wp14:editId="655AB168">
             <wp:extent cx="5731510" cy="4024630"/>
@@ -2506,6 +2472,31 @@
     </w:p>
     <w:p>
       <w:pPr>
+        <w:pStyle w:val="Caption"/>
+        <w:rPr>
+          <w:lang w:val="en-GB"/>
+        </w:rPr>
+      </w:pPr>
+      <w:r>
+        <w:t xml:space="preserve">Figure </w:t>
+      </w:r>
+      <w:fldSimple w:instr=" SEQ Figure \* ARABIC ">
+        <w:r>
+          <w:rPr>
+            <w:noProof/>
+          </w:rPr>
+          <w:t>8</w:t>
+        </w:r>
+      </w:fldSimple>
+      <w:r>
+        <w:rPr>
+          <w:lang w:val="en-GB"/>
+        </w:rPr>
+        <w:t>:Grader Dashboard Wireframe</w:t>
+      </w:r>
+    </w:p>
+    <w:p>
+      <w:pPr>
         <w:rPr>
           <w:lang w:val="en-GB"/>
         </w:rPr>
@@ -2519,15 +2510,14 @@
     </w:p>
     <w:p>
       <w:pPr>
-        <w:rPr>
-          <w:lang w:val="en-GB"/>
-        </w:rPr>
+        <w:keepNext/>
       </w:pPr>
       <w:r>
         <w:rPr>
           <w:noProof/>
           <w:lang w:val="en-GB"/>
         </w:rPr>
+        <w:lastRenderedPageBreak/>
         <w:drawing>
           <wp:inline distT="0" distB="0" distL="0" distR="0" wp14:anchorId="3EACD548" wp14:editId="0C604C45">
             <wp:extent cx="5731510" cy="4024630"/>
@@ -2573,6 +2563,31 @@
     </w:p>
     <w:p>
       <w:pPr>
+        <w:pStyle w:val="Caption"/>
+        <w:rPr>
+          <w:lang w:val="en-GB"/>
+        </w:rPr>
+      </w:pPr>
+      <w:r>
+        <w:t xml:space="preserve">Figure </w:t>
+      </w:r>
+      <w:fldSimple w:instr=" SEQ Figure \* ARABIC ">
+        <w:r>
+          <w:rPr>
+            <w:noProof/>
+          </w:rPr>
+          <w:t>9</w:t>
+        </w:r>
+      </w:fldSimple>
+      <w:r>
+        <w:rPr>
+          <w:lang w:val="en-GB"/>
+        </w:rPr>
+        <w:t>:Admin Approval Wireframe</w:t>
+      </w:r>
+    </w:p>
+    <w:p>
+      <w:pPr>
         <w:rPr>
           <w:lang w:val="en-GB"/>
         </w:rPr>
@@ -2592,9 +2607,7 @@
     </w:p>
     <w:p>
       <w:pPr>
-        <w:rPr>
-          <w:lang w:val="en-GB"/>
-        </w:rPr>
+        <w:keepNext/>
       </w:pPr>
       <w:r>
         <w:rPr>
@@ -2644,6 +2657,44 @@
           </wp:inline>
         </w:drawing>
       </w:r>
+    </w:p>
+    <w:p>
+      <w:pPr>
+        <w:pStyle w:val="Caption"/>
+        <w:rPr>
+          <w:lang w:val="en-GB"/>
+        </w:rPr>
+      </w:pPr>
+      <w:r>
+        <w:t xml:space="preserve">Figure </w:t>
+      </w:r>
+      <w:fldSimple w:instr=" SEQ Figure \* ARABIC ">
+        <w:r>
+          <w:rPr>
+            <w:noProof/>
+          </w:rPr>
+          <w:t>10</w:t>
+        </w:r>
+      </w:fldSimple>
+      <w:r>
+        <w:rPr>
+          <w:lang w:val="en-GB"/>
+        </w:rPr>
+        <w:t>:Audit and Report Wireframe</w:t>
+      </w:r>
+      <w:r>
+        <w:rPr>
+          <w:lang w:val="en-GB"/>
+        </w:rPr>
+        <w:br/>
+      </w:r>
+    </w:p>
+    <w:p>
+      <w:pPr>
+        <w:rPr>
+          <w:lang w:val="en-GB"/>
+        </w:rPr>
+      </w:pPr>
     </w:p>
     <w:sectPr>
       <w:pgSz w:w="11906" w:h="16838"/>
@@ -3631,6 +3682,7 @@
   <w:style w:type="character" w:default="1" w:styleId="DefaultParagraphFont">
     <w:name w:val="Default Paragraph Font"/>
     <w:uiPriority w:val="1"/>
+    <w:semiHidden/>
     <w:unhideWhenUsed/>
   </w:style>
   <w:style w:type="table" w:default="1" w:styleId="TableNormal">

</xml_diff>

<commit_message>
Docs: Fixed the non-visible .drawio figures, also added the gantt chart that I will be auto incrementing after a task is complete
</commit_message>
<xml_diff>
--- a/Documentation.docx
+++ b/Documentation.docx
@@ -4,6 +4,7 @@
   <w:body>
     <w:p>
       <w:pPr>
+        <w:jc w:val="center"/>
         <w:rPr>
           <w:lang w:val="en-GB"/>
         </w:rPr>
@@ -35,6 +36,31 @@
     </w:p>
     <w:p>
       <w:pPr>
+        <w:jc w:val="center"/>
+        <w:rPr>
+          <w:lang w:val="en-GB"/>
+        </w:rPr>
+      </w:pPr>
+    </w:p>
+    <w:p>
+      <w:pPr>
+        <w:jc w:val="center"/>
+        <w:rPr>
+          <w:lang w:val="en-GB"/>
+        </w:rPr>
+      </w:pPr>
+    </w:p>
+    <w:p>
+      <w:pPr>
+        <w:jc w:val="center"/>
+        <w:rPr>
+          <w:lang w:val="en-GB"/>
+        </w:rPr>
+      </w:pPr>
+    </w:p>
+    <w:p>
+      <w:pPr>
+        <w:jc w:val="center"/>
         <w:rPr>
           <w:lang w:val="en-GB"/>
         </w:rPr>
@@ -53,6 +79,7 @@
           <w:ilvl w:val="0"/>
           <w:numId w:val="4"/>
         </w:numPr>
+        <w:jc w:val="center"/>
         <w:rPr>
           <w:lang w:val="en-GB"/>
         </w:rPr>
@@ -106,12 +133,6 @@
           <w:lang w:val="en-GB"/>
         </w:rPr>
         <w:t>Backend Developer</w:t>
-      </w:r>
-      <w:r>
-        <w:rPr>
-          <w:lang w:val="en-GB"/>
-        </w:rPr>
-        <w:t xml:space="preserve"> </w:t>
       </w:r>
     </w:p>
     <w:p>
@@ -121,6 +142,7 @@
           <w:ilvl w:val="0"/>
           <w:numId w:val="4"/>
         </w:numPr>
+        <w:jc w:val="center"/>
         <w:rPr>
           <w:lang w:val="en-GB"/>
         </w:rPr>
@@ -145,6 +167,7 @@
           <w:ilvl w:val="0"/>
           <w:numId w:val="4"/>
         </w:numPr>
+        <w:jc w:val="center"/>
         <w:rPr>
           <w:lang w:val="en-GB"/>
         </w:rPr>
@@ -170,183 +193,183 @@
     </w:p>
     <w:p>
       <w:pPr>
-        <w:rPr>
-          <w:lang w:val="en-GB"/>
-        </w:rPr>
-      </w:pPr>
-    </w:p>
-    <w:p>
-      <w:pPr>
-        <w:rPr>
-          <w:lang w:val="en-GB"/>
-        </w:rPr>
-      </w:pPr>
-    </w:p>
-    <w:p>
-      <w:pPr>
-        <w:rPr>
-          <w:lang w:val="en-GB"/>
-        </w:rPr>
-      </w:pPr>
-    </w:p>
-    <w:p>
-      <w:pPr>
-        <w:rPr>
-          <w:lang w:val="en-GB"/>
-        </w:rPr>
-      </w:pPr>
-    </w:p>
-    <w:p>
-      <w:pPr>
-        <w:rPr>
-          <w:lang w:val="en-GB"/>
-        </w:rPr>
-      </w:pPr>
-    </w:p>
-    <w:p>
-      <w:pPr>
-        <w:rPr>
-          <w:lang w:val="en-GB"/>
-        </w:rPr>
-      </w:pPr>
-    </w:p>
-    <w:p>
-      <w:pPr>
-        <w:rPr>
-          <w:lang w:val="en-GB"/>
-        </w:rPr>
-      </w:pPr>
-    </w:p>
-    <w:p>
-      <w:pPr>
-        <w:rPr>
-          <w:lang w:val="en-GB"/>
-        </w:rPr>
-      </w:pPr>
-    </w:p>
-    <w:p>
-      <w:pPr>
-        <w:rPr>
-          <w:lang w:val="en-GB"/>
-        </w:rPr>
-      </w:pPr>
-    </w:p>
-    <w:p>
-      <w:pPr>
-        <w:rPr>
-          <w:lang w:val="en-GB"/>
-        </w:rPr>
-      </w:pPr>
-    </w:p>
-    <w:p>
-      <w:pPr>
-        <w:rPr>
-          <w:lang w:val="en-GB"/>
-        </w:rPr>
-      </w:pPr>
-    </w:p>
-    <w:p>
-      <w:pPr>
-        <w:rPr>
-          <w:lang w:val="en-GB"/>
-        </w:rPr>
-      </w:pPr>
-    </w:p>
-    <w:p>
-      <w:pPr>
-        <w:rPr>
-          <w:lang w:val="en-GB"/>
-        </w:rPr>
-      </w:pPr>
-    </w:p>
-    <w:p>
-      <w:pPr>
-        <w:rPr>
-          <w:lang w:val="en-GB"/>
-        </w:rPr>
-      </w:pPr>
-    </w:p>
-    <w:p>
-      <w:pPr>
-        <w:rPr>
-          <w:lang w:val="en-GB"/>
-        </w:rPr>
-      </w:pPr>
-    </w:p>
-    <w:p>
-      <w:pPr>
-        <w:rPr>
-          <w:lang w:val="en-GB"/>
-        </w:rPr>
-      </w:pPr>
-    </w:p>
-    <w:p>
-      <w:pPr>
-        <w:rPr>
-          <w:lang w:val="en-GB"/>
-        </w:rPr>
-      </w:pPr>
-    </w:p>
-    <w:p>
-      <w:pPr>
-        <w:rPr>
-          <w:lang w:val="en-GB"/>
-        </w:rPr>
-      </w:pPr>
-    </w:p>
-    <w:p>
-      <w:pPr>
-        <w:rPr>
-          <w:lang w:val="en-GB"/>
-        </w:rPr>
-      </w:pPr>
-    </w:p>
-    <w:p>
-      <w:pPr>
-        <w:rPr>
-          <w:lang w:val="en-GB"/>
-        </w:rPr>
-      </w:pPr>
-    </w:p>
-    <w:p>
-      <w:pPr>
-        <w:rPr>
-          <w:lang w:val="en-GB"/>
-        </w:rPr>
-      </w:pPr>
-    </w:p>
-    <w:p>
-      <w:pPr>
-        <w:rPr>
-          <w:lang w:val="en-GB"/>
-        </w:rPr>
-      </w:pPr>
-    </w:p>
-    <w:p>
-      <w:pPr>
-        <w:rPr>
-          <w:lang w:val="en-GB"/>
-        </w:rPr>
-      </w:pPr>
-    </w:p>
-    <w:p>
-      <w:pPr>
-        <w:rPr>
-          <w:lang w:val="en-GB"/>
-        </w:rPr>
-      </w:pPr>
-    </w:p>
-    <w:p>
-      <w:pPr>
-        <w:rPr>
-          <w:lang w:val="en-GB"/>
-        </w:rPr>
-      </w:pPr>
-      <w:r>
-        <w:rPr>
-          <w:lang w:val="en-GB"/>
-        </w:rPr>
-        <w:lastRenderedPageBreak/>
+        <w:jc w:val="center"/>
+        <w:rPr>
+          <w:lang w:val="en-GB"/>
+        </w:rPr>
+      </w:pPr>
+    </w:p>
+    <w:p>
+      <w:pPr>
+        <w:rPr>
+          <w:lang w:val="en-GB"/>
+        </w:rPr>
+      </w:pPr>
+    </w:p>
+    <w:p>
+      <w:pPr>
+        <w:rPr>
+          <w:lang w:val="en-GB"/>
+        </w:rPr>
+      </w:pPr>
+    </w:p>
+    <w:p>
+      <w:pPr>
+        <w:rPr>
+          <w:lang w:val="en-GB"/>
+        </w:rPr>
+      </w:pPr>
+    </w:p>
+    <w:p>
+      <w:pPr>
+        <w:rPr>
+          <w:lang w:val="en-GB"/>
+        </w:rPr>
+      </w:pPr>
+    </w:p>
+    <w:p>
+      <w:pPr>
+        <w:rPr>
+          <w:lang w:val="en-GB"/>
+        </w:rPr>
+      </w:pPr>
+    </w:p>
+    <w:p>
+      <w:pPr>
+        <w:rPr>
+          <w:lang w:val="en-GB"/>
+        </w:rPr>
+      </w:pPr>
+    </w:p>
+    <w:p>
+      <w:pPr>
+        <w:rPr>
+          <w:lang w:val="en-GB"/>
+        </w:rPr>
+      </w:pPr>
+    </w:p>
+    <w:p>
+      <w:pPr>
+        <w:rPr>
+          <w:lang w:val="en-GB"/>
+        </w:rPr>
+      </w:pPr>
+    </w:p>
+    <w:p>
+      <w:pPr>
+        <w:rPr>
+          <w:lang w:val="en-GB"/>
+        </w:rPr>
+      </w:pPr>
+    </w:p>
+    <w:p>
+      <w:pPr>
+        <w:rPr>
+          <w:lang w:val="en-GB"/>
+        </w:rPr>
+      </w:pPr>
+    </w:p>
+    <w:p>
+      <w:pPr>
+        <w:rPr>
+          <w:lang w:val="en-GB"/>
+        </w:rPr>
+      </w:pPr>
+    </w:p>
+    <w:p>
+      <w:pPr>
+        <w:rPr>
+          <w:lang w:val="en-GB"/>
+        </w:rPr>
+      </w:pPr>
+    </w:p>
+    <w:p>
+      <w:pPr>
+        <w:rPr>
+          <w:lang w:val="en-GB"/>
+        </w:rPr>
+      </w:pPr>
+    </w:p>
+    <w:p>
+      <w:pPr>
+        <w:rPr>
+          <w:lang w:val="en-GB"/>
+        </w:rPr>
+      </w:pPr>
+    </w:p>
+    <w:p>
+      <w:pPr>
+        <w:rPr>
+          <w:lang w:val="en-GB"/>
+        </w:rPr>
+      </w:pPr>
+    </w:p>
+    <w:p>
+      <w:pPr>
+        <w:rPr>
+          <w:lang w:val="en-GB"/>
+        </w:rPr>
+      </w:pPr>
+    </w:p>
+    <w:p>
+      <w:pPr>
+        <w:rPr>
+          <w:lang w:val="en-GB"/>
+        </w:rPr>
+      </w:pPr>
+    </w:p>
+    <w:p>
+      <w:pPr>
+        <w:rPr>
+          <w:lang w:val="en-GB"/>
+        </w:rPr>
+      </w:pPr>
+    </w:p>
+    <w:p>
+      <w:pPr>
+        <w:rPr>
+          <w:lang w:val="en-GB"/>
+        </w:rPr>
+      </w:pPr>
+    </w:p>
+    <w:p>
+      <w:pPr>
+        <w:rPr>
+          <w:lang w:val="en-GB"/>
+        </w:rPr>
+      </w:pPr>
+    </w:p>
+    <w:p>
+      <w:pPr>
+        <w:rPr>
+          <w:lang w:val="en-GB"/>
+        </w:rPr>
+      </w:pPr>
+    </w:p>
+    <w:p>
+      <w:pPr>
+        <w:rPr>
+          <w:lang w:val="en-GB"/>
+        </w:rPr>
+      </w:pPr>
+    </w:p>
+    <w:p>
+      <w:pPr>
+        <w:rPr>
+          <w:lang w:val="en-GB"/>
+        </w:rPr>
+      </w:pPr>
+    </w:p>
+    <w:p>
+      <w:pPr>
+        <w:rPr>
+          <w:lang w:val="en-GB"/>
+        </w:rPr>
+      </w:pPr>
+      <w:r>
+        <w:rPr>
+          <w:lang w:val="en-GB"/>
+        </w:rPr>
         <w:t>1.Project Description.</w:t>
       </w:r>
     </w:p>
@@ -945,6 +968,7 @@
         <w:rPr>
           <w:lang w:val="en-GB"/>
         </w:rPr>
+        <w:lastRenderedPageBreak/>
         <w:t>Provide good user experience by creating user-centred UIs</w:t>
       </w:r>
       <w:r>
@@ -1006,7 +1030,6 @@
         <w:rPr>
           <w:lang w:val="en-GB"/>
         </w:rPr>
-        <w:lastRenderedPageBreak/>
         <w:t xml:space="preserve"> </w:t>
       </w:r>
     </w:p>
@@ -1153,6 +1176,7 @@
         <w:rPr>
           <w:noProof/>
         </w:rPr>
+        <w:lastRenderedPageBreak/>
         <mc:AlternateContent>
           <mc:Choice Requires="wps">
             <w:drawing>
@@ -1378,14 +1402,7 @@
         <w:rPr>
           <w:lang w:val="en-GB"/>
         </w:rPr>
-        <w:t xml:space="preserve">system that would be </w:t>
-      </w:r>
-      <w:r>
-        <w:rPr>
-          <w:lang w:val="en-GB"/>
-        </w:rPr>
-        <w:lastRenderedPageBreak/>
-        <w:t>used</w:t>
+        <w:t>system that would be used</w:t>
       </w:r>
       <w:r>
         <w:rPr>
@@ -1580,6 +1597,7 @@
         <w:rPr>
           <w:lang w:val="en-GB"/>
         </w:rPr>
+        <w:lastRenderedPageBreak/>
         <w:t>deposited</w:t>
       </w:r>
       <w:r>
@@ -1661,7 +1679,6 @@
           <w:noProof/>
           <w:lang w:val="en-GB"/>
         </w:rPr>
-        <w:lastRenderedPageBreak/>
         <w:drawing>
           <wp:inline distT="0" distB="0" distL="0" distR="0" wp14:anchorId="7DDE7590" wp14:editId="449AF494">
             <wp:extent cx="5731510" cy="3590925"/>

</xml_diff>

<commit_message>
Dev:DB and API routes done
</commit_message>
<xml_diff>
--- a/Documentation.docx
+++ b/Documentation.docx
@@ -4,31 +4,74 @@
   <w:body>
     <w:p>
       <w:pPr>
+        <w:contextualSpacing/>
         <w:jc w:val="center"/>
         <w:rPr>
-          <w:lang w:val="en-GB"/>
-        </w:rPr>
-      </w:pPr>
-      <w:r>
-        <w:rPr>
-          <w:lang w:val="en-GB"/>
-        </w:rPr>
-        <w:t>MaziwaTrack:</w:t>
-      </w:r>
-      <w:r>
-        <w:rPr>
+          <w:rFonts w:asciiTheme="majorBidi" w:hAnsiTheme="majorBidi" w:cstheme="majorBidi"/>
+          <w:color w:val="000000" w:themeColor="text1"/>
+          <w:lang w:val="en-GB"/>
+        </w:rPr>
+      </w:pPr>
+    </w:p>
+    <w:p>
+      <w:pPr>
+        <w:contextualSpacing/>
+        <w:jc w:val="center"/>
+        <w:rPr>
+          <w:rFonts w:asciiTheme="majorBidi" w:hAnsiTheme="majorBidi" w:cstheme="majorBidi"/>
+          <w:color w:val="000000" w:themeColor="text1"/>
+          <w:lang w:val="en-GB"/>
+        </w:rPr>
+      </w:pPr>
+    </w:p>
+    <w:p>
+      <w:pPr>
+        <w:contextualSpacing/>
+        <w:jc w:val="center"/>
+        <w:rPr>
+          <w:rFonts w:asciiTheme="majorBidi" w:hAnsiTheme="majorBidi" w:cstheme="majorBidi"/>
+          <w:color w:val="000000" w:themeColor="text1"/>
+          <w:lang w:val="en-GB"/>
+        </w:rPr>
+      </w:pPr>
+      <w:proofErr w:type="spellStart"/>
+      <w:r>
+        <w:rPr>
+          <w:rFonts w:asciiTheme="majorBidi" w:hAnsiTheme="majorBidi" w:cstheme="majorBidi"/>
+          <w:color w:val="000000" w:themeColor="text1"/>
+          <w:lang w:val="en-GB"/>
+        </w:rPr>
+        <w:t>MaziwaTrack</w:t>
+      </w:r>
+      <w:proofErr w:type="spellEnd"/>
+      <w:r>
+        <w:rPr>
+          <w:rFonts w:asciiTheme="majorBidi" w:hAnsiTheme="majorBidi" w:cstheme="majorBidi"/>
+          <w:color w:val="000000" w:themeColor="text1"/>
+          <w:lang w:val="en-GB"/>
+        </w:rPr>
+        <w:t>:</w:t>
+      </w:r>
+      <w:r>
+        <w:rPr>
+          <w:rFonts w:asciiTheme="majorBidi" w:hAnsiTheme="majorBidi" w:cstheme="majorBidi"/>
+          <w:color w:val="000000" w:themeColor="text1"/>
           <w:lang w:val="en-GB"/>
         </w:rPr>
         <w:t xml:space="preserve"> </w:t>
       </w:r>
       <w:r>
         <w:rPr>
+          <w:rFonts w:asciiTheme="majorBidi" w:hAnsiTheme="majorBidi" w:cstheme="majorBidi"/>
+          <w:color w:val="000000" w:themeColor="text1"/>
           <w:lang w:val="en-GB"/>
         </w:rPr>
         <w:t>Redefining Kenya’s milk supply system</w:t>
       </w:r>
       <w:r>
         <w:rPr>
+          <w:rFonts w:asciiTheme="majorBidi" w:hAnsiTheme="majorBidi" w:cstheme="majorBidi"/>
+          <w:color w:val="000000" w:themeColor="text1"/>
           <w:lang w:val="en-GB"/>
         </w:rPr>
         <w:br/>
@@ -36,37 +79,62 @@
     </w:p>
     <w:p>
       <w:pPr>
+        <w:contextualSpacing/>
         <w:jc w:val="center"/>
         <w:rPr>
-          <w:lang w:val="en-GB"/>
-        </w:rPr>
-      </w:pPr>
-    </w:p>
-    <w:p>
-      <w:pPr>
+          <w:rFonts w:asciiTheme="majorBidi" w:hAnsiTheme="majorBidi" w:cstheme="majorBidi"/>
+          <w:color w:val="000000" w:themeColor="text1"/>
+          <w:lang w:val="en-GB"/>
+        </w:rPr>
+      </w:pPr>
+    </w:p>
+    <w:p>
+      <w:pPr>
+        <w:contextualSpacing/>
         <w:jc w:val="center"/>
         <w:rPr>
-          <w:lang w:val="en-GB"/>
-        </w:rPr>
-      </w:pPr>
-    </w:p>
-    <w:p>
-      <w:pPr>
+          <w:rFonts w:asciiTheme="majorBidi" w:hAnsiTheme="majorBidi" w:cstheme="majorBidi"/>
+          <w:color w:val="000000" w:themeColor="text1"/>
+          <w:lang w:val="en-GB"/>
+        </w:rPr>
+      </w:pPr>
+    </w:p>
+    <w:p>
+      <w:pPr>
+        <w:contextualSpacing/>
         <w:jc w:val="center"/>
         <w:rPr>
-          <w:lang w:val="en-GB"/>
-        </w:rPr>
-      </w:pPr>
-    </w:p>
-    <w:p>
-      <w:pPr>
+          <w:rFonts w:asciiTheme="majorBidi" w:hAnsiTheme="majorBidi" w:cstheme="majorBidi"/>
+          <w:color w:val="000000" w:themeColor="text1"/>
+          <w:lang w:val="en-GB"/>
+        </w:rPr>
+      </w:pPr>
+    </w:p>
+    <w:p>
+      <w:pPr>
+        <w:contextualSpacing/>
         <w:jc w:val="center"/>
         <w:rPr>
-          <w:lang w:val="en-GB"/>
-        </w:rPr>
-      </w:pPr>
-      <w:r>
-        <w:rPr>
+          <w:rFonts w:asciiTheme="majorBidi" w:hAnsiTheme="majorBidi" w:cstheme="majorBidi"/>
+          <w:color w:val="000000" w:themeColor="text1"/>
+          <w:lang w:val="en-GB"/>
+        </w:rPr>
+      </w:pPr>
+    </w:p>
+    <w:p>
+      <w:pPr>
+        <w:contextualSpacing/>
+        <w:jc w:val="center"/>
+        <w:rPr>
+          <w:rFonts w:asciiTheme="majorBidi" w:hAnsiTheme="majorBidi" w:cstheme="majorBidi"/>
+          <w:color w:val="000000" w:themeColor="text1"/>
+          <w:lang w:val="en-GB"/>
+        </w:rPr>
+      </w:pPr>
+      <w:r>
+        <w:rPr>
+          <w:rFonts w:asciiTheme="majorBidi" w:hAnsiTheme="majorBidi" w:cstheme="majorBidi"/>
+          <w:color w:val="000000" w:themeColor="text1"/>
           <w:lang w:val="en-GB"/>
         </w:rPr>
         <w:t>Group Members and Tasks</w:t>
@@ -81,17 +149,23 @@
         </w:numPr>
         <w:jc w:val="center"/>
         <w:rPr>
-          <w:lang w:val="en-GB"/>
-        </w:rPr>
-      </w:pPr>
-      <w:r>
-        <w:rPr>
+          <w:rFonts w:asciiTheme="majorBidi" w:hAnsiTheme="majorBidi" w:cstheme="majorBidi"/>
+          <w:color w:val="000000" w:themeColor="text1"/>
+          <w:lang w:val="en-GB"/>
+        </w:rPr>
+      </w:pPr>
+      <w:r>
+        <w:rPr>
+          <w:rFonts w:asciiTheme="majorBidi" w:hAnsiTheme="majorBidi" w:cstheme="majorBidi"/>
+          <w:color w:val="000000" w:themeColor="text1"/>
           <w:lang w:val="en-GB"/>
         </w:rPr>
         <w:t xml:space="preserve">180883, </w:t>
       </w:r>
       <w:r>
         <w:rPr>
+          <w:rFonts w:asciiTheme="majorBidi" w:hAnsiTheme="majorBidi" w:cstheme="majorBidi"/>
+          <w:color w:val="000000" w:themeColor="text1"/>
           <w:lang w:val="en-GB"/>
         </w:rPr>
         <w:t xml:space="preserve">Korir </w:t>
@@ -99,18 +173,24 @@
       <w:proofErr w:type="spellStart"/>
       <w:r>
         <w:rPr>
+          <w:rFonts w:asciiTheme="majorBidi" w:hAnsiTheme="majorBidi" w:cstheme="majorBidi"/>
+          <w:color w:val="000000" w:themeColor="text1"/>
           <w:lang w:val="en-GB"/>
         </w:rPr>
         <w:t>Tony</w:t>
       </w:r>
       <w:r>
         <w:rPr>
+          <w:rFonts w:asciiTheme="majorBidi" w:hAnsiTheme="majorBidi" w:cstheme="majorBidi"/>
+          <w:color w:val="000000" w:themeColor="text1"/>
           <w:lang w:val="en-GB"/>
         </w:rPr>
         <w:t>b</w:t>
       </w:r>
       <w:r>
         <w:rPr>
+          <w:rFonts w:asciiTheme="majorBidi" w:hAnsiTheme="majorBidi" w:cstheme="majorBidi"/>
+          <w:color w:val="000000" w:themeColor="text1"/>
           <w:lang w:val="en-GB"/>
         </w:rPr>
         <w:t>rian</w:t>
@@ -118,21 +198,11 @@
       <w:proofErr w:type="spellEnd"/>
       <w:r>
         <w:rPr>
-          <w:lang w:val="en-GB"/>
-        </w:rPr>
-        <w:t>-</w:t>
-      </w:r>
-      <w:r>
-        <w:rPr>
-          <w:lang w:val="en-GB"/>
-        </w:rPr>
-        <w:t xml:space="preserve"> </w:t>
-      </w:r>
-      <w:r>
-        <w:rPr>
-          <w:lang w:val="en-GB"/>
-        </w:rPr>
-        <w:t>Backend Developer</w:t>
+          <w:rFonts w:asciiTheme="majorBidi" w:hAnsiTheme="majorBidi" w:cstheme="majorBidi"/>
+          <w:color w:val="000000" w:themeColor="text1"/>
+          <w:lang w:val="en-GB"/>
+        </w:rPr>
+        <w:t>- Backend Developer</w:t>
       </w:r>
     </w:p>
     <w:p>
@@ -144,17 +214,23 @@
         </w:numPr>
         <w:jc w:val="center"/>
         <w:rPr>
-          <w:lang w:val="en-GB"/>
-        </w:rPr>
-      </w:pPr>
-      <w:r>
-        <w:rPr>
+          <w:rFonts w:asciiTheme="majorBidi" w:hAnsiTheme="majorBidi" w:cstheme="majorBidi"/>
+          <w:color w:val="000000" w:themeColor="text1"/>
+          <w:lang w:val="en-GB"/>
+        </w:rPr>
+      </w:pPr>
+      <w:r>
+        <w:rPr>
+          <w:rFonts w:asciiTheme="majorBidi" w:hAnsiTheme="majorBidi" w:cstheme="majorBidi"/>
+          <w:color w:val="000000" w:themeColor="text1"/>
           <w:lang w:val="en-GB"/>
         </w:rPr>
         <w:t xml:space="preserve">220011, </w:t>
       </w:r>
       <w:r>
         <w:rPr>
+          <w:rFonts w:asciiTheme="majorBidi" w:hAnsiTheme="majorBidi" w:cstheme="majorBidi"/>
+          <w:color w:val="000000" w:themeColor="text1"/>
           <w:lang w:val="en-GB"/>
         </w:rPr>
         <w:t>Morara Angelo- Frontend Developer</w:t>
@@ -169,254 +245,143 @@
         </w:numPr>
         <w:jc w:val="center"/>
         <w:rPr>
-          <w:lang w:val="en-GB"/>
-        </w:rPr>
-      </w:pPr>
-      <w:r>
-        <w:rPr>
+          <w:rFonts w:asciiTheme="majorBidi" w:hAnsiTheme="majorBidi" w:cstheme="majorBidi"/>
+          <w:color w:val="000000" w:themeColor="text1"/>
+          <w:lang w:val="en-GB"/>
+        </w:rPr>
+      </w:pPr>
+      <w:r>
+        <w:rPr>
+          <w:rFonts w:asciiTheme="majorBidi" w:hAnsiTheme="majorBidi" w:cstheme="majorBidi"/>
+          <w:color w:val="000000" w:themeColor="text1"/>
           <w:lang w:val="en-GB"/>
         </w:rPr>
         <w:t xml:space="preserve">212323, </w:t>
       </w:r>
       <w:r>
         <w:rPr>
+          <w:rFonts w:asciiTheme="majorBidi" w:hAnsiTheme="majorBidi" w:cstheme="majorBidi"/>
+          <w:color w:val="000000" w:themeColor="text1"/>
           <w:lang w:val="en-GB"/>
         </w:rPr>
         <w:t xml:space="preserve">Ng’wono Jeremy- </w:t>
       </w:r>
       <w:r>
         <w:rPr>
-          <w:lang w:val="en-GB"/>
-        </w:rPr>
-        <w:t>Testing, Integration and Documentation lead</w:t>
-      </w:r>
-    </w:p>
-    <w:p>
-      <w:pPr>
-        <w:jc w:val="center"/>
-        <w:rPr>
-          <w:lang w:val="en-GB"/>
-        </w:rPr>
-      </w:pPr>
-    </w:p>
-    <w:p>
-      <w:pPr>
-        <w:rPr>
-          <w:lang w:val="en-GB"/>
-        </w:rPr>
-      </w:pPr>
-    </w:p>
-    <w:p>
-      <w:pPr>
-        <w:rPr>
-          <w:lang w:val="en-GB"/>
-        </w:rPr>
-      </w:pPr>
-    </w:p>
-    <w:p>
-      <w:pPr>
-        <w:rPr>
-          <w:lang w:val="en-GB"/>
-        </w:rPr>
-      </w:pPr>
-    </w:p>
-    <w:p>
-      <w:pPr>
-        <w:rPr>
-          <w:lang w:val="en-GB"/>
-        </w:rPr>
-      </w:pPr>
-    </w:p>
-    <w:p>
-      <w:pPr>
-        <w:rPr>
-          <w:lang w:val="en-GB"/>
-        </w:rPr>
-      </w:pPr>
-    </w:p>
-    <w:p>
-      <w:pPr>
-        <w:rPr>
-          <w:lang w:val="en-GB"/>
-        </w:rPr>
-      </w:pPr>
-    </w:p>
-    <w:p>
-      <w:pPr>
-        <w:rPr>
-          <w:lang w:val="en-GB"/>
-        </w:rPr>
-      </w:pPr>
-    </w:p>
-    <w:p>
-      <w:pPr>
-        <w:rPr>
-          <w:lang w:val="en-GB"/>
-        </w:rPr>
-      </w:pPr>
-    </w:p>
-    <w:p>
-      <w:pPr>
-        <w:rPr>
-          <w:lang w:val="en-GB"/>
-        </w:rPr>
-      </w:pPr>
-    </w:p>
-    <w:p>
-      <w:pPr>
-        <w:rPr>
-          <w:lang w:val="en-GB"/>
-        </w:rPr>
-      </w:pPr>
-    </w:p>
-    <w:p>
-      <w:pPr>
-        <w:rPr>
-          <w:lang w:val="en-GB"/>
-        </w:rPr>
-      </w:pPr>
-    </w:p>
-    <w:p>
-      <w:pPr>
-        <w:rPr>
-          <w:lang w:val="en-GB"/>
-        </w:rPr>
-      </w:pPr>
-    </w:p>
-    <w:p>
-      <w:pPr>
-        <w:rPr>
-          <w:lang w:val="en-GB"/>
-        </w:rPr>
-      </w:pPr>
-    </w:p>
-    <w:p>
-      <w:pPr>
-        <w:rPr>
-          <w:lang w:val="en-GB"/>
-        </w:rPr>
-      </w:pPr>
-    </w:p>
-    <w:p>
-      <w:pPr>
-        <w:rPr>
-          <w:lang w:val="en-GB"/>
-        </w:rPr>
-      </w:pPr>
-    </w:p>
-    <w:p>
-      <w:pPr>
-        <w:rPr>
-          <w:lang w:val="en-GB"/>
-        </w:rPr>
-      </w:pPr>
-    </w:p>
-    <w:p>
-      <w:pPr>
-        <w:rPr>
-          <w:lang w:val="en-GB"/>
-        </w:rPr>
-      </w:pPr>
-    </w:p>
-    <w:p>
-      <w:pPr>
-        <w:rPr>
-          <w:lang w:val="en-GB"/>
-        </w:rPr>
-      </w:pPr>
-    </w:p>
-    <w:p>
-      <w:pPr>
-        <w:rPr>
-          <w:lang w:val="en-GB"/>
-        </w:rPr>
-      </w:pPr>
-    </w:p>
-    <w:p>
-      <w:pPr>
-        <w:rPr>
-          <w:lang w:val="en-GB"/>
-        </w:rPr>
-      </w:pPr>
-    </w:p>
-    <w:p>
-      <w:pPr>
-        <w:rPr>
-          <w:lang w:val="en-GB"/>
-        </w:rPr>
-      </w:pPr>
-    </w:p>
-    <w:p>
-      <w:pPr>
-        <w:rPr>
-          <w:lang w:val="en-GB"/>
-        </w:rPr>
-      </w:pPr>
-    </w:p>
-    <w:p>
-      <w:pPr>
-        <w:rPr>
-          <w:lang w:val="en-GB"/>
-        </w:rPr>
-      </w:pPr>
-    </w:p>
-    <w:p>
-      <w:pPr>
-        <w:rPr>
-          <w:lang w:val="en-GB"/>
-        </w:rPr>
-      </w:pPr>
-      <w:r>
-        <w:rPr>
-          <w:lang w:val="en-GB"/>
-        </w:rPr>
+          <w:rFonts w:asciiTheme="majorBidi" w:hAnsiTheme="majorBidi" w:cstheme="majorBidi"/>
+          <w:color w:val="000000" w:themeColor="text1"/>
+          <w:lang w:val="en-GB"/>
+        </w:rPr>
+        <w:t xml:space="preserve">QA &amp; </w:t>
+      </w:r>
+      <w:r>
+        <w:rPr>
+          <w:rFonts w:asciiTheme="majorBidi" w:hAnsiTheme="majorBidi" w:cstheme="majorBidi"/>
+          <w:color w:val="000000" w:themeColor="text1"/>
+          <w:lang w:val="en-GB"/>
+        </w:rPr>
+        <w:t>Documentation lead</w:t>
+      </w:r>
+    </w:p>
+    <w:p>
+      <w:pPr>
+        <w:contextualSpacing/>
+        <w:rPr>
+          <w:rFonts w:asciiTheme="majorBidi" w:hAnsiTheme="majorBidi" w:cstheme="majorBidi"/>
+          <w:color w:val="000000" w:themeColor="text1"/>
+          <w:lang w:val="en-GB"/>
+        </w:rPr>
+      </w:pPr>
+      <w:r>
+        <w:rPr>
+          <w:rFonts w:asciiTheme="majorBidi" w:hAnsiTheme="majorBidi" w:cstheme="majorBidi"/>
+          <w:color w:val="000000" w:themeColor="text1"/>
+          <w:lang w:val="en-GB"/>
+        </w:rPr>
+        <w:br w:type="page"/>
+      </w:r>
+    </w:p>
+    <w:p>
+      <w:pPr>
+        <w:pStyle w:val="Heading1"/>
+        <w:contextualSpacing/>
+        <w:rPr>
+          <w:rFonts w:asciiTheme="majorBidi" w:hAnsiTheme="majorBidi"/>
+          <w:color w:val="000000" w:themeColor="text1"/>
+          <w:lang w:val="en-GB"/>
+        </w:rPr>
+      </w:pPr>
+      <w:r>
+        <w:rPr>
+          <w:rFonts w:asciiTheme="majorBidi" w:hAnsiTheme="majorBidi"/>
+          <w:color w:val="000000" w:themeColor="text1"/>
+          <w:lang w:val="en-GB"/>
+        </w:rPr>
+        <w:lastRenderedPageBreak/>
         <w:t>1.Project Description.</w:t>
       </w:r>
     </w:p>
     <w:p>
       <w:pPr>
-        <w:rPr>
-          <w:lang w:val="en-GB"/>
-        </w:rPr>
-      </w:pPr>
-      <w:r>
-        <w:rPr>
+        <w:contextualSpacing/>
+        <w:rPr>
+          <w:rFonts w:asciiTheme="majorBidi" w:hAnsiTheme="majorBidi" w:cstheme="majorBidi"/>
+          <w:color w:val="000000" w:themeColor="text1"/>
+          <w:lang w:val="en-GB"/>
+        </w:rPr>
+      </w:pPr>
+      <w:r>
+        <w:rPr>
+          <w:rFonts w:asciiTheme="majorBidi" w:hAnsiTheme="majorBidi" w:cstheme="majorBidi"/>
+          <w:color w:val="000000" w:themeColor="text1"/>
           <w:lang w:val="en-GB"/>
         </w:rPr>
         <w:t xml:space="preserve">MaziwaTrack is </w:t>
       </w:r>
       <w:r>
         <w:rPr>
+          <w:rFonts w:asciiTheme="majorBidi" w:hAnsiTheme="majorBidi" w:cstheme="majorBidi"/>
+          <w:color w:val="000000" w:themeColor="text1"/>
           <w:lang w:val="en-GB"/>
         </w:rPr>
         <w:t>web-based</w:t>
       </w:r>
       <w:r>
         <w:rPr>
+          <w:rFonts w:asciiTheme="majorBidi" w:hAnsiTheme="majorBidi" w:cstheme="majorBidi"/>
+          <w:color w:val="000000" w:themeColor="text1"/>
           <w:lang w:val="en-GB"/>
         </w:rPr>
         <w:t xml:space="preserve"> information system for dairy cooperative in Kenya.</w:t>
       </w:r>
       <w:r>
         <w:rPr>
+          <w:rFonts w:asciiTheme="majorBidi" w:hAnsiTheme="majorBidi" w:cstheme="majorBidi"/>
+          <w:color w:val="000000" w:themeColor="text1"/>
           <w:lang w:val="en-GB"/>
         </w:rPr>
         <w:t xml:space="preserve"> </w:t>
       </w:r>
       <w:r>
         <w:rPr>
+          <w:rFonts w:asciiTheme="majorBidi" w:hAnsiTheme="majorBidi" w:cstheme="majorBidi"/>
+          <w:color w:val="000000" w:themeColor="text1"/>
           <w:lang w:val="en-GB"/>
         </w:rPr>
         <w:t xml:space="preserve">It allows a farmer to record the deliveries made, a certified cooperative grader verifies the quality and quantity of the milk, and the admin </w:t>
       </w:r>
       <w:r>
         <w:rPr>
+          <w:rFonts w:asciiTheme="majorBidi" w:hAnsiTheme="majorBidi" w:cstheme="majorBidi"/>
+          <w:color w:val="000000" w:themeColor="text1"/>
           <w:lang w:val="en-GB"/>
         </w:rPr>
         <w:t>can</w:t>
       </w:r>
       <w:r>
         <w:rPr>
+          <w:rFonts w:asciiTheme="majorBidi" w:hAnsiTheme="majorBidi" w:cstheme="majorBidi"/>
+          <w:color w:val="000000" w:themeColor="text1"/>
           <w:lang w:val="en-GB"/>
         </w:rPr>
         <w:t xml:space="preserve"> approve the payment in less than 24 hours.</w:t>
@@ -424,18 +389,25 @@
     </w:p>
     <w:p>
       <w:pPr>
-        <w:rPr>
-          <w:lang w:val="en-GB"/>
-        </w:rPr>
-      </w:pPr>
-      <w:r>
-        <w:rPr>
+        <w:contextualSpacing/>
+        <w:rPr>
+          <w:rFonts w:asciiTheme="majorBidi" w:hAnsiTheme="majorBidi" w:cstheme="majorBidi"/>
+          <w:color w:val="000000" w:themeColor="text1"/>
+          <w:lang w:val="en-GB"/>
+        </w:rPr>
+      </w:pPr>
+      <w:r>
+        <w:rPr>
+          <w:rFonts w:asciiTheme="majorBidi" w:hAnsiTheme="majorBidi" w:cstheme="majorBidi"/>
+          <w:color w:val="000000" w:themeColor="text1"/>
           <w:lang w:val="en-GB"/>
         </w:rPr>
         <w:t xml:space="preserve">MaziwaTrack </w:t>
       </w:r>
       <w:r>
         <w:rPr>
+          <w:rFonts w:asciiTheme="majorBidi" w:hAnsiTheme="majorBidi" w:cstheme="majorBidi"/>
+          <w:color w:val="000000" w:themeColor="text1"/>
           <w:lang w:val="en-GB"/>
         </w:rPr>
         <w:t>seeks to solve the following problems:</w:t>
@@ -449,35 +421,47 @@
           <w:numId w:val="1"/>
         </w:numPr>
         <w:rPr>
-          <w:lang w:val="en-GB"/>
-        </w:rPr>
-      </w:pPr>
-      <w:r>
-        <w:rPr>
+          <w:rFonts w:asciiTheme="majorBidi" w:hAnsiTheme="majorBidi" w:cstheme="majorBidi"/>
+          <w:color w:val="000000" w:themeColor="text1"/>
+          <w:lang w:val="en-GB"/>
+        </w:rPr>
+      </w:pPr>
+      <w:r>
+        <w:rPr>
+          <w:rFonts w:asciiTheme="majorBidi" w:hAnsiTheme="majorBidi" w:cstheme="majorBidi"/>
+          <w:color w:val="000000" w:themeColor="text1"/>
           <w:lang w:val="en-GB"/>
         </w:rPr>
         <w:t xml:space="preserve">Commercial diary farmers in Kenya, often encounter late payments or even unpaid </w:t>
       </w:r>
       <w:r>
         <w:rPr>
+          <w:rFonts w:asciiTheme="majorBidi" w:hAnsiTheme="majorBidi" w:cstheme="majorBidi"/>
+          <w:color w:val="000000" w:themeColor="text1"/>
           <w:lang w:val="en-GB"/>
         </w:rPr>
         <w:t>dues,</w:t>
       </w:r>
       <w:r>
         <w:rPr>
+          <w:rFonts w:asciiTheme="majorBidi" w:hAnsiTheme="majorBidi" w:cstheme="majorBidi"/>
+          <w:color w:val="000000" w:themeColor="text1"/>
           <w:lang w:val="en-GB"/>
         </w:rPr>
         <w:t xml:space="preserve"> because of improper tracking of </w:t>
       </w:r>
       <w:r>
         <w:rPr>
+          <w:rFonts w:asciiTheme="majorBidi" w:hAnsiTheme="majorBidi" w:cstheme="majorBidi"/>
+          <w:color w:val="000000" w:themeColor="text1"/>
           <w:lang w:val="en-GB"/>
         </w:rPr>
         <w:t>their</w:t>
       </w:r>
       <w:r>
         <w:rPr>
+          <w:rFonts w:asciiTheme="majorBidi" w:hAnsiTheme="majorBidi" w:cstheme="majorBidi"/>
+          <w:color w:val="000000" w:themeColor="text1"/>
           <w:lang w:val="en-GB"/>
         </w:rPr>
         <w:t xml:space="preserve"> personal records.</w:t>
@@ -491,77 +475,103 @@
           <w:numId w:val="1"/>
         </w:numPr>
         <w:rPr>
-          <w:lang w:val="en-GB"/>
-        </w:rPr>
-      </w:pPr>
-      <w:r>
-        <w:rPr>
+          <w:rFonts w:asciiTheme="majorBidi" w:hAnsiTheme="majorBidi" w:cstheme="majorBidi"/>
+          <w:color w:val="000000" w:themeColor="text1"/>
+          <w:lang w:val="en-GB"/>
+        </w:rPr>
+      </w:pPr>
+      <w:r>
+        <w:rPr>
+          <w:rFonts w:asciiTheme="majorBidi" w:hAnsiTheme="majorBidi" w:cstheme="majorBidi"/>
+          <w:color w:val="000000" w:themeColor="text1"/>
           <w:lang w:val="en-GB"/>
         </w:rPr>
         <w:t xml:space="preserve">Cooperatives in Kenya </w:t>
       </w:r>
       <w:r>
         <w:rPr>
+          <w:rFonts w:asciiTheme="majorBidi" w:hAnsiTheme="majorBidi" w:cstheme="majorBidi"/>
+          <w:color w:val="000000" w:themeColor="text1"/>
           <w:lang w:val="en-GB"/>
         </w:rPr>
         <w:t xml:space="preserve">mostly on paper records, therefore they are unable to predict the trends based on the milk consumed and milk produced, </w:t>
       </w:r>
       <w:r>
         <w:rPr>
+          <w:rFonts w:asciiTheme="majorBidi" w:hAnsiTheme="majorBidi" w:cstheme="majorBidi"/>
+          <w:color w:val="000000" w:themeColor="text1"/>
           <w:lang w:val="en-GB"/>
         </w:rPr>
         <w:t>leading to shortages or wastage.</w:t>
       </w:r>
       <w:r>
         <w:rPr>
+          <w:rFonts w:asciiTheme="majorBidi" w:hAnsiTheme="majorBidi" w:cstheme="majorBidi"/>
+          <w:color w:val="000000" w:themeColor="text1"/>
           <w:lang w:val="en-GB"/>
         </w:rPr>
         <w:t xml:space="preserve"> </w:t>
       </w:r>
       <w:r>
         <w:rPr>
+          <w:rFonts w:asciiTheme="majorBidi" w:hAnsiTheme="majorBidi" w:cstheme="majorBidi"/>
+          <w:color w:val="000000" w:themeColor="text1"/>
           <w:lang w:val="en-GB"/>
         </w:rPr>
         <w:t xml:space="preserve">Case in </w:t>
       </w:r>
       <w:r>
         <w:rPr>
+          <w:rFonts w:asciiTheme="majorBidi" w:hAnsiTheme="majorBidi" w:cstheme="majorBidi"/>
+          <w:color w:val="000000" w:themeColor="text1"/>
           <w:lang w:val="en-GB"/>
         </w:rPr>
         <w:t>point,</w:t>
       </w:r>
       <w:r>
         <w:rPr>
+          <w:rFonts w:asciiTheme="majorBidi" w:hAnsiTheme="majorBidi" w:cstheme="majorBidi"/>
+          <w:color w:val="000000" w:themeColor="text1"/>
           <w:lang w:val="en-GB"/>
         </w:rPr>
         <w:t xml:space="preserve"> in 2023 Kenya lost about</w:t>
       </w:r>
       <w:r>
         <w:rPr>
+          <w:rFonts w:asciiTheme="majorBidi" w:hAnsiTheme="majorBidi" w:cstheme="majorBidi"/>
+          <w:color w:val="000000" w:themeColor="text1"/>
           <w:lang w:val="en-GB"/>
         </w:rPr>
         <w:t xml:space="preserve"> 290 million litres of milk worth 14.7 billion shillings.</w:t>
       </w:r>
       <w:r>
         <w:rPr>
+          <w:rFonts w:asciiTheme="majorBidi" w:hAnsiTheme="majorBidi" w:cstheme="majorBidi"/>
+          <w:color w:val="000000" w:themeColor="text1"/>
           <w:lang w:val="en-GB"/>
         </w:rPr>
         <w:t xml:space="preserve"> </w:t>
       </w:r>
       <w:r>
         <w:rPr>
+          <w:rFonts w:asciiTheme="majorBidi" w:hAnsiTheme="majorBidi" w:cstheme="majorBidi"/>
+          <w:color w:val="000000" w:themeColor="text1"/>
           <w:lang w:val="en-GB"/>
         </w:rPr>
         <w:t>(</w:t>
       </w:r>
       <w:r>
         <w:rPr>
+          <w:rFonts w:asciiTheme="majorBidi" w:hAnsiTheme="majorBidi" w:cstheme="majorBidi"/>
+          <w:color w:val="000000" w:themeColor="text1"/>
           <w:lang w:val="en-GB"/>
         </w:rPr>
         <w:t>Omondi,2024)</w:t>
       </w:r>
       <w:r>
         <w:rPr>
+          <w:rFonts w:asciiTheme="majorBidi" w:hAnsiTheme="majorBidi" w:cstheme="majorBidi"/>
+          <w:color w:val="000000" w:themeColor="text1"/>
           <w:lang w:val="en-GB"/>
         </w:rPr>
         <w:t xml:space="preserve"> </w:t>
@@ -575,41 +585,55 @@
           <w:numId w:val="1"/>
         </w:numPr>
         <w:rPr>
-          <w:lang w:val="en-GB"/>
-        </w:rPr>
-      </w:pPr>
-      <w:r>
-        <w:rPr>
+          <w:rFonts w:asciiTheme="majorBidi" w:hAnsiTheme="majorBidi" w:cstheme="majorBidi"/>
+          <w:color w:val="000000" w:themeColor="text1"/>
+          <w:lang w:val="en-GB"/>
+        </w:rPr>
+      </w:pPr>
+      <w:r>
+        <w:rPr>
+          <w:rFonts w:asciiTheme="majorBidi" w:hAnsiTheme="majorBidi" w:cstheme="majorBidi"/>
+          <w:color w:val="000000" w:themeColor="text1"/>
           <w:lang w:val="en-GB"/>
         </w:rPr>
         <w:t>Farmer often lack formal proof</w:t>
       </w:r>
       <w:r>
         <w:rPr>
+          <w:rFonts w:asciiTheme="majorBidi" w:hAnsiTheme="majorBidi" w:cstheme="majorBidi"/>
+          <w:color w:val="000000" w:themeColor="text1"/>
           <w:lang w:val="en-GB"/>
         </w:rPr>
         <w:t xml:space="preserve"> and documentation</w:t>
       </w:r>
       <w:r>
         <w:rPr>
+          <w:rFonts w:asciiTheme="majorBidi" w:hAnsiTheme="majorBidi" w:cstheme="majorBidi"/>
+          <w:color w:val="000000" w:themeColor="text1"/>
           <w:lang w:val="en-GB"/>
         </w:rPr>
         <w:t xml:space="preserve"> of their source of income, hence </w:t>
       </w:r>
       <w:r>
         <w:rPr>
+          <w:rFonts w:asciiTheme="majorBidi" w:hAnsiTheme="majorBidi" w:cstheme="majorBidi"/>
+          <w:color w:val="000000" w:themeColor="text1"/>
           <w:lang w:val="en-GB"/>
         </w:rPr>
         <w:t>lack collateral.</w:t>
       </w:r>
       <w:r>
         <w:rPr>
+          <w:rFonts w:asciiTheme="majorBidi" w:hAnsiTheme="majorBidi" w:cstheme="majorBidi"/>
+          <w:color w:val="000000" w:themeColor="text1"/>
           <w:lang w:val="en-GB"/>
         </w:rPr>
         <w:t xml:space="preserve"> </w:t>
       </w:r>
       <w:r>
         <w:rPr>
+          <w:rFonts w:asciiTheme="majorBidi" w:hAnsiTheme="majorBidi" w:cstheme="majorBidi"/>
+          <w:color w:val="000000" w:themeColor="text1"/>
           <w:lang w:val="en-GB"/>
         </w:rPr>
         <w:br/>
@@ -617,18 +641,26 @@
     </w:p>
     <w:p>
       <w:pPr>
-        <w:rPr>
-          <w:lang w:val="en-GB"/>
-        </w:rPr>
-      </w:pPr>
-      <w:r>
-        <w:rPr>
+        <w:pStyle w:val="Heading2"/>
+        <w:contextualSpacing/>
+        <w:rPr>
+          <w:rFonts w:asciiTheme="majorBidi" w:hAnsiTheme="majorBidi"/>
+          <w:color w:val="000000" w:themeColor="text1"/>
+          <w:lang w:val="en-GB"/>
+        </w:rPr>
+      </w:pPr>
+      <w:r>
+        <w:rPr>
+          <w:rFonts w:asciiTheme="majorBidi" w:hAnsiTheme="majorBidi"/>
+          <w:color w:val="000000" w:themeColor="text1"/>
           <w:lang w:val="en-GB"/>
         </w:rPr>
         <w:t>1.</w:t>
       </w:r>
       <w:r>
         <w:rPr>
+          <w:rFonts w:asciiTheme="majorBidi" w:hAnsiTheme="majorBidi"/>
+          <w:color w:val="000000" w:themeColor="text1"/>
           <w:lang w:val="en-GB"/>
         </w:rPr>
         <w:t xml:space="preserve">2. Requirements </w:t>
@@ -636,18 +668,26 @@
     </w:p>
     <w:p>
       <w:pPr>
-        <w:rPr>
-          <w:lang w:val="en-GB"/>
-        </w:rPr>
-      </w:pPr>
-      <w:r>
-        <w:rPr>
+        <w:pStyle w:val="Heading3"/>
+        <w:contextualSpacing/>
+        <w:rPr>
+          <w:rFonts w:asciiTheme="majorBidi" w:hAnsiTheme="majorBidi"/>
+          <w:color w:val="000000" w:themeColor="text1"/>
+          <w:lang w:val="en-GB"/>
+        </w:rPr>
+      </w:pPr>
+      <w:r>
+        <w:rPr>
+          <w:rFonts w:asciiTheme="majorBidi" w:hAnsiTheme="majorBidi"/>
+          <w:color w:val="000000" w:themeColor="text1"/>
           <w:lang w:val="en-GB"/>
         </w:rPr>
         <w:t>1.</w:t>
       </w:r>
       <w:r>
         <w:rPr>
+          <w:rFonts w:asciiTheme="majorBidi" w:hAnsiTheme="majorBidi"/>
+          <w:color w:val="000000" w:themeColor="text1"/>
           <w:lang w:val="en-GB"/>
         </w:rPr>
         <w:t>2.1 Functional Requirements</w:t>
@@ -655,18 +695,25 @@
     </w:p>
     <w:p>
       <w:pPr>
-        <w:rPr>
-          <w:lang w:val="en-GB"/>
-        </w:rPr>
-      </w:pPr>
-      <w:r>
-        <w:rPr>
+        <w:contextualSpacing/>
+        <w:rPr>
+          <w:rFonts w:asciiTheme="majorBidi" w:hAnsiTheme="majorBidi" w:cstheme="majorBidi"/>
+          <w:color w:val="000000" w:themeColor="text1"/>
+          <w:lang w:val="en-GB"/>
+        </w:rPr>
+      </w:pPr>
+      <w:r>
+        <w:rPr>
+          <w:rFonts w:asciiTheme="majorBidi" w:hAnsiTheme="majorBidi" w:cstheme="majorBidi"/>
+          <w:color w:val="000000" w:themeColor="text1"/>
           <w:lang w:val="en-GB"/>
         </w:rPr>
         <w:t>The following are the</w:t>
       </w:r>
       <w:r>
         <w:rPr>
+          <w:rFonts w:asciiTheme="majorBidi" w:hAnsiTheme="majorBidi" w:cstheme="majorBidi"/>
+          <w:color w:val="000000" w:themeColor="text1"/>
           <w:lang w:val="en-GB"/>
         </w:rPr>
         <w:t xml:space="preserve"> functional requirements of the system:</w:t>
@@ -680,14 +727,22 @@
           <w:numId w:val="2"/>
         </w:numPr>
         <w:rPr>
-          <w:lang w:val="en-GB"/>
-        </w:rPr>
-      </w:pPr>
-      <w:r>
+          <w:rFonts w:asciiTheme="majorBidi" w:hAnsiTheme="majorBidi" w:cstheme="majorBidi"/>
+          <w:color w:val="000000" w:themeColor="text1"/>
+          <w:lang w:val="en-GB"/>
+        </w:rPr>
+      </w:pPr>
+      <w:r>
+        <w:rPr>
+          <w:rFonts w:asciiTheme="majorBidi" w:hAnsiTheme="majorBidi" w:cstheme="majorBidi"/>
+          <w:color w:val="000000" w:themeColor="text1"/>
+        </w:rPr>
         <w:t>The system shall allow farmers to register. All users (farmers, graders and administrators) can log in and log out with their credentials, and each sees only the functions for their role</w:t>
       </w:r>
       <w:r>
         <w:rPr>
+          <w:rFonts w:asciiTheme="majorBidi" w:hAnsiTheme="majorBidi" w:cstheme="majorBidi"/>
+          <w:color w:val="000000" w:themeColor="text1"/>
           <w:lang w:val="en-GB"/>
         </w:rPr>
         <w:t>.</w:t>
@@ -701,41 +756,55 @@
           <w:numId w:val="2"/>
         </w:numPr>
         <w:rPr>
-          <w:lang w:val="en-GB"/>
-        </w:rPr>
-      </w:pPr>
-      <w:r>
-        <w:rPr>
+          <w:rFonts w:asciiTheme="majorBidi" w:hAnsiTheme="majorBidi" w:cstheme="majorBidi"/>
+          <w:color w:val="000000" w:themeColor="text1"/>
+          <w:lang w:val="en-GB"/>
+        </w:rPr>
+      </w:pPr>
+      <w:r>
+        <w:rPr>
+          <w:rFonts w:asciiTheme="majorBidi" w:hAnsiTheme="majorBidi" w:cstheme="majorBidi"/>
+          <w:color w:val="000000" w:themeColor="text1"/>
           <w:lang w:val="en-GB"/>
         </w:rPr>
         <w:t xml:space="preserve">The farmer can record the amount of milk he has deposited, and a unique batch number is </w:t>
       </w:r>
       <w:r>
         <w:rPr>
+          <w:rFonts w:asciiTheme="majorBidi" w:hAnsiTheme="majorBidi" w:cstheme="majorBidi"/>
+          <w:color w:val="000000" w:themeColor="text1"/>
           <w:lang w:val="en-GB"/>
         </w:rPr>
         <w:t>shown on the screen</w:t>
       </w:r>
       <w:r>
         <w:rPr>
+          <w:rFonts w:asciiTheme="majorBidi" w:hAnsiTheme="majorBidi" w:cstheme="majorBidi"/>
+          <w:color w:val="000000" w:themeColor="text1"/>
           <w:lang w:val="en-GB"/>
         </w:rPr>
         <w:t>.</w:t>
       </w:r>
       <w:r>
         <w:rPr>
+          <w:rFonts w:asciiTheme="majorBidi" w:hAnsiTheme="majorBidi" w:cstheme="majorBidi"/>
+          <w:color w:val="000000" w:themeColor="text1"/>
           <w:lang w:val="en-GB"/>
         </w:rPr>
         <w:t xml:space="preserve"> </w:t>
       </w:r>
       <w:r>
         <w:rPr>
+          <w:rFonts w:asciiTheme="majorBidi" w:hAnsiTheme="majorBidi" w:cstheme="majorBidi"/>
+          <w:color w:val="000000" w:themeColor="text1"/>
           <w:lang w:val="en-GB"/>
         </w:rPr>
         <w:t>The batch number can be used for reference purposes</w:t>
       </w:r>
       <w:r>
         <w:rPr>
+          <w:rFonts w:asciiTheme="majorBidi" w:hAnsiTheme="majorBidi" w:cstheme="majorBidi"/>
+          <w:color w:val="000000" w:themeColor="text1"/>
           <w:lang w:val="en-GB"/>
         </w:rPr>
         <w:t xml:space="preserve"> by the grader.</w:t>
@@ -749,23 +818,31 @@
           <w:numId w:val="2"/>
         </w:numPr>
         <w:rPr>
-          <w:lang w:val="en-GB"/>
-        </w:rPr>
-      </w:pPr>
-      <w:r>
-        <w:rPr>
+          <w:rFonts w:asciiTheme="majorBidi" w:hAnsiTheme="majorBidi" w:cstheme="majorBidi"/>
+          <w:color w:val="000000" w:themeColor="text1"/>
+          <w:lang w:val="en-GB"/>
+        </w:rPr>
+      </w:pPr>
+      <w:r>
+        <w:rPr>
+          <w:rFonts w:asciiTheme="majorBidi" w:hAnsiTheme="majorBidi" w:cstheme="majorBidi"/>
+          <w:color w:val="000000" w:themeColor="text1"/>
           <w:lang w:val="en-GB"/>
         </w:rPr>
         <w:t xml:space="preserve">The grader </w:t>
       </w:r>
       <w:r>
         <w:rPr>
+          <w:rFonts w:asciiTheme="majorBidi" w:hAnsiTheme="majorBidi" w:cstheme="majorBidi"/>
+          <w:color w:val="000000" w:themeColor="text1"/>
           <w:lang w:val="en-GB"/>
         </w:rPr>
         <w:t>can verify the quantity deposited versus what is received</w:t>
       </w:r>
       <w:r>
         <w:rPr>
+          <w:rFonts w:asciiTheme="majorBidi" w:hAnsiTheme="majorBidi" w:cstheme="majorBidi"/>
+          <w:color w:val="000000" w:themeColor="text1"/>
           <w:lang w:val="en-GB"/>
         </w:rPr>
         <w:t xml:space="preserve"> and also confirm the quality of the milk.</w:t>
@@ -779,47 +856,63 @@
           <w:numId w:val="2"/>
         </w:numPr>
         <w:rPr>
-          <w:lang w:val="en-GB"/>
-        </w:rPr>
-      </w:pPr>
-      <w:r>
-        <w:rPr>
+          <w:rFonts w:asciiTheme="majorBidi" w:hAnsiTheme="majorBidi" w:cstheme="majorBidi"/>
+          <w:color w:val="000000" w:themeColor="text1"/>
+          <w:lang w:val="en-GB"/>
+        </w:rPr>
+      </w:pPr>
+      <w:r>
+        <w:rPr>
+          <w:rFonts w:asciiTheme="majorBidi" w:hAnsiTheme="majorBidi" w:cstheme="majorBidi"/>
+          <w:color w:val="000000" w:themeColor="text1"/>
           <w:lang w:val="en-GB"/>
         </w:rPr>
         <w:t>The admin</w:t>
       </w:r>
       <w:r>
         <w:rPr>
+          <w:rFonts w:asciiTheme="majorBidi" w:hAnsiTheme="majorBidi" w:cstheme="majorBidi"/>
+          <w:color w:val="000000" w:themeColor="text1"/>
           <w:lang w:val="en-GB"/>
         </w:rPr>
         <w:t xml:space="preserve"> can</w:t>
       </w:r>
       <w:r>
         <w:rPr>
+          <w:rFonts w:asciiTheme="majorBidi" w:hAnsiTheme="majorBidi" w:cstheme="majorBidi"/>
+          <w:color w:val="000000" w:themeColor="text1"/>
           <w:lang w:val="en-GB"/>
         </w:rPr>
         <w:t xml:space="preserve"> </w:t>
       </w:r>
       <w:r>
         <w:rPr>
+          <w:rFonts w:asciiTheme="majorBidi" w:hAnsiTheme="majorBidi" w:cstheme="majorBidi"/>
+          <w:color w:val="000000" w:themeColor="text1"/>
           <w:lang w:val="en-GB"/>
         </w:rPr>
         <w:t>view and</w:t>
       </w:r>
       <w:r>
         <w:rPr>
+          <w:rFonts w:asciiTheme="majorBidi" w:hAnsiTheme="majorBidi" w:cstheme="majorBidi"/>
+          <w:color w:val="000000" w:themeColor="text1"/>
           <w:lang w:val="en-GB"/>
         </w:rPr>
         <w:t xml:space="preserve"> approve</w:t>
       </w:r>
       <w:r>
         <w:rPr>
+          <w:rFonts w:asciiTheme="majorBidi" w:hAnsiTheme="majorBidi" w:cstheme="majorBidi"/>
+          <w:color w:val="000000" w:themeColor="text1"/>
           <w:lang w:val="en-GB"/>
         </w:rPr>
         <w:t xml:space="preserve"> of the batch information. After which the payment to the farmers is approved by the admin</w:t>
       </w:r>
       <w:r>
         <w:rPr>
+          <w:rFonts w:asciiTheme="majorBidi" w:hAnsiTheme="majorBidi" w:cstheme="majorBidi"/>
+          <w:color w:val="000000" w:themeColor="text1"/>
           <w:lang w:val="en-GB"/>
         </w:rPr>
         <w:t xml:space="preserve"> and the farmer is notified via email.</w:t>
@@ -833,41 +926,55 @@
           <w:numId w:val="2"/>
         </w:numPr>
         <w:rPr>
-          <w:lang w:val="en-GB"/>
-        </w:rPr>
-      </w:pPr>
-      <w:r>
-        <w:rPr>
+          <w:rFonts w:asciiTheme="majorBidi" w:hAnsiTheme="majorBidi" w:cstheme="majorBidi"/>
+          <w:color w:val="000000" w:themeColor="text1"/>
+          <w:lang w:val="en-GB"/>
+        </w:rPr>
+      </w:pPr>
+      <w:r>
+        <w:rPr>
+          <w:rFonts w:asciiTheme="majorBidi" w:hAnsiTheme="majorBidi" w:cstheme="majorBidi"/>
+          <w:color w:val="000000" w:themeColor="text1"/>
           <w:lang w:val="en-GB"/>
         </w:rPr>
         <w:t>The administrator</w:t>
       </w:r>
       <w:r>
         <w:rPr>
+          <w:rFonts w:asciiTheme="majorBidi" w:hAnsiTheme="majorBidi" w:cstheme="majorBidi"/>
+          <w:color w:val="000000" w:themeColor="text1"/>
           <w:lang w:val="en-GB"/>
         </w:rPr>
         <w:t xml:space="preserve"> can</w:t>
       </w:r>
       <w:r>
         <w:rPr>
+          <w:rFonts w:asciiTheme="majorBidi" w:hAnsiTheme="majorBidi" w:cstheme="majorBidi"/>
+          <w:color w:val="000000" w:themeColor="text1"/>
           <w:lang w:val="en-GB"/>
         </w:rPr>
         <w:t xml:space="preserve"> generate P</w:t>
       </w:r>
       <w:r>
         <w:rPr>
+          <w:rFonts w:asciiTheme="majorBidi" w:hAnsiTheme="majorBidi" w:cstheme="majorBidi"/>
+          <w:color w:val="000000" w:themeColor="text1"/>
           <w:lang w:val="en-GB"/>
         </w:rPr>
         <w:t>DF reports containing the company logo and date,</w:t>
       </w:r>
       <w:r>
         <w:rPr>
+          <w:rFonts w:asciiTheme="majorBidi" w:hAnsiTheme="majorBidi" w:cstheme="majorBidi"/>
+          <w:color w:val="000000" w:themeColor="text1"/>
           <w:lang w:val="en-GB"/>
         </w:rPr>
         <w:t xml:space="preserve"> </w:t>
       </w:r>
       <w:r>
         <w:rPr>
+          <w:rFonts w:asciiTheme="majorBidi" w:hAnsiTheme="majorBidi" w:cstheme="majorBidi"/>
+          <w:color w:val="000000" w:themeColor="text1"/>
           <w:lang w:val="en-GB"/>
         </w:rPr>
         <w:t>print receipts and view an audit log of every action taken in the system</w:t>
@@ -875,18 +982,26 @@
     </w:p>
     <w:p>
       <w:pPr>
-        <w:rPr>
-          <w:lang w:val="en-GB"/>
-        </w:rPr>
-      </w:pPr>
-      <w:r>
-        <w:rPr>
+        <w:pStyle w:val="Heading3"/>
+        <w:contextualSpacing/>
+        <w:rPr>
+          <w:rFonts w:asciiTheme="majorBidi" w:hAnsiTheme="majorBidi"/>
+          <w:color w:val="000000" w:themeColor="text1"/>
+          <w:lang w:val="en-GB"/>
+        </w:rPr>
+      </w:pPr>
+      <w:r>
+        <w:rPr>
+          <w:rFonts w:asciiTheme="majorBidi" w:hAnsiTheme="majorBidi"/>
+          <w:color w:val="000000" w:themeColor="text1"/>
           <w:lang w:val="en-GB"/>
         </w:rPr>
         <w:t>1.</w:t>
       </w:r>
       <w:r>
         <w:rPr>
+          <w:rFonts w:asciiTheme="majorBidi" w:hAnsiTheme="majorBidi"/>
+          <w:color w:val="000000" w:themeColor="text1"/>
           <w:lang w:val="en-GB"/>
         </w:rPr>
         <w:t>2.2 Non-functional Requirements</w:t>
@@ -894,12 +1009,17 @@
     </w:p>
     <w:p>
       <w:pPr>
-        <w:rPr>
-          <w:lang w:val="en-GB"/>
-        </w:rPr>
-      </w:pPr>
-      <w:r>
-        <w:rPr>
+        <w:contextualSpacing/>
+        <w:rPr>
+          <w:rFonts w:asciiTheme="majorBidi" w:hAnsiTheme="majorBidi" w:cstheme="majorBidi"/>
+          <w:color w:val="000000" w:themeColor="text1"/>
+          <w:lang w:val="en-GB"/>
+        </w:rPr>
+      </w:pPr>
+      <w:r>
+        <w:rPr>
+          <w:rFonts w:asciiTheme="majorBidi" w:hAnsiTheme="majorBidi" w:cstheme="majorBidi"/>
+          <w:color w:val="000000" w:themeColor="text1"/>
           <w:lang w:val="en-GB"/>
         </w:rPr>
         <w:t>The following is MaziwaTrack’s non-functional requirements of the system:</w:t>
@@ -913,41 +1033,55 @@
           <w:numId w:val="3"/>
         </w:numPr>
         <w:rPr>
-          <w:lang w:val="en-GB"/>
-        </w:rPr>
-      </w:pPr>
-      <w:r>
-        <w:rPr>
+          <w:rFonts w:asciiTheme="majorBidi" w:hAnsiTheme="majorBidi" w:cstheme="majorBidi"/>
+          <w:color w:val="000000" w:themeColor="text1"/>
+          <w:lang w:val="en-GB"/>
+        </w:rPr>
+      </w:pPr>
+      <w:r>
+        <w:rPr>
+          <w:rFonts w:asciiTheme="majorBidi" w:hAnsiTheme="majorBidi" w:cstheme="majorBidi"/>
+          <w:color w:val="000000" w:themeColor="text1"/>
           <w:lang w:val="en-GB"/>
         </w:rPr>
         <w:t xml:space="preserve">Implement a </w:t>
       </w:r>
       <w:r>
         <w:rPr>
+          <w:rFonts w:asciiTheme="majorBidi" w:hAnsiTheme="majorBidi" w:cstheme="majorBidi"/>
+          <w:color w:val="000000" w:themeColor="text1"/>
           <w:lang w:val="en-GB"/>
         </w:rPr>
         <w:t>security features</w:t>
       </w:r>
       <w:r>
         <w:rPr>
+          <w:rFonts w:asciiTheme="majorBidi" w:hAnsiTheme="majorBidi" w:cstheme="majorBidi"/>
+          <w:color w:val="000000" w:themeColor="text1"/>
           <w:lang w:val="en-GB"/>
         </w:rPr>
         <w:t xml:space="preserve"> such as 2FA(via email) and bcryp</w:t>
       </w:r>
       <w:r>
         <w:rPr>
+          <w:rFonts w:asciiTheme="majorBidi" w:hAnsiTheme="majorBidi" w:cstheme="majorBidi"/>
+          <w:color w:val="000000" w:themeColor="text1"/>
           <w:lang w:val="en-GB"/>
         </w:rPr>
         <w:t>t</w:t>
       </w:r>
       <w:r>
         <w:rPr>
+          <w:rFonts w:asciiTheme="majorBidi" w:hAnsiTheme="majorBidi" w:cstheme="majorBidi"/>
+          <w:color w:val="000000" w:themeColor="text1"/>
           <w:lang w:val="en-GB"/>
         </w:rPr>
         <w:t xml:space="preserve"> hashes while storing </w:t>
       </w:r>
       <w:r>
         <w:rPr>
+          <w:rFonts w:asciiTheme="majorBidi" w:hAnsiTheme="majorBidi" w:cstheme="majorBidi"/>
+          <w:color w:val="000000" w:themeColor="text1"/>
           <w:lang w:val="en-GB"/>
         </w:rPr>
         <w:t>user passwords.</w:t>
@@ -961,30 +1095,39 @@
           <w:numId w:val="3"/>
         </w:numPr>
         <w:rPr>
-          <w:lang w:val="en-GB"/>
-        </w:rPr>
-      </w:pPr>
-      <w:r>
-        <w:rPr>
-          <w:lang w:val="en-GB"/>
-        </w:rPr>
-        <w:lastRenderedPageBreak/>
+          <w:rFonts w:asciiTheme="majorBidi" w:hAnsiTheme="majorBidi" w:cstheme="majorBidi"/>
+          <w:color w:val="000000" w:themeColor="text1"/>
+          <w:lang w:val="en-GB"/>
+        </w:rPr>
+      </w:pPr>
+      <w:r>
+        <w:rPr>
+          <w:rFonts w:asciiTheme="majorBidi" w:hAnsiTheme="majorBidi" w:cstheme="majorBidi"/>
+          <w:color w:val="000000" w:themeColor="text1"/>
+          <w:lang w:val="en-GB"/>
+        </w:rPr>
         <w:t>Provide good user experience by creating user-centred UIs</w:t>
       </w:r>
       <w:r>
         <w:rPr>
+          <w:rFonts w:asciiTheme="majorBidi" w:hAnsiTheme="majorBidi" w:cstheme="majorBidi"/>
+          <w:color w:val="000000" w:themeColor="text1"/>
           <w:lang w:val="en-GB"/>
         </w:rPr>
         <w:t>, where each system actor has their own separate screens.</w:t>
       </w:r>
       <w:r>
         <w:rPr>
+          <w:rFonts w:asciiTheme="majorBidi" w:hAnsiTheme="majorBidi" w:cstheme="majorBidi"/>
+          <w:color w:val="000000" w:themeColor="text1"/>
           <w:lang w:val="en-GB"/>
         </w:rPr>
         <w:t xml:space="preserve"> </w:t>
       </w:r>
       <w:r>
         <w:rPr>
+          <w:rFonts w:asciiTheme="majorBidi" w:hAnsiTheme="majorBidi" w:cstheme="majorBidi"/>
+          <w:color w:val="000000" w:themeColor="text1"/>
           <w:lang w:val="en-GB"/>
         </w:rPr>
         <w:t>The screens well sectioned for easier navigation and avoiding redundancy.</w:t>
@@ -998,23 +1141,31 @@
           <w:numId w:val="3"/>
         </w:numPr>
         <w:rPr>
-          <w:lang w:val="en-GB"/>
-        </w:rPr>
-      </w:pPr>
-      <w:r>
-        <w:rPr>
+          <w:rFonts w:asciiTheme="majorBidi" w:hAnsiTheme="majorBidi" w:cstheme="majorBidi"/>
+          <w:color w:val="000000" w:themeColor="text1"/>
+          <w:lang w:val="en-GB"/>
+        </w:rPr>
+      </w:pPr>
+      <w:r>
+        <w:rPr>
+          <w:rFonts w:asciiTheme="majorBidi" w:hAnsiTheme="majorBidi" w:cstheme="majorBidi"/>
+          <w:color w:val="000000" w:themeColor="text1"/>
           <w:lang w:val="en-GB"/>
         </w:rPr>
         <w:t xml:space="preserve">Localisation of the </w:t>
       </w:r>
       <w:r>
         <w:rPr>
+          <w:rFonts w:asciiTheme="majorBidi" w:hAnsiTheme="majorBidi" w:cstheme="majorBidi"/>
+          <w:color w:val="000000" w:themeColor="text1"/>
           <w:lang w:val="en-GB"/>
         </w:rPr>
         <w:t>system, the</w:t>
       </w:r>
       <w:r>
         <w:rPr>
+          <w:rFonts w:asciiTheme="majorBidi" w:hAnsiTheme="majorBidi" w:cstheme="majorBidi"/>
+          <w:color w:val="000000" w:themeColor="text1"/>
           <w:lang w:val="en-GB"/>
         </w:rPr>
         <w:t xml:space="preserve"> system uses Kenya Shillings for its record keeping and a user can toggle between English and Swahili.</w:t>
@@ -1022,31 +1173,45 @@
     </w:p>
     <w:p>
       <w:pPr>
-        <w:rPr>
-          <w:lang w:val="en-GB"/>
-        </w:rPr>
-      </w:pPr>
-      <w:r>
-        <w:rPr>
-          <w:lang w:val="en-GB"/>
-        </w:rPr>
+        <w:contextualSpacing/>
+        <w:rPr>
+          <w:rFonts w:asciiTheme="majorBidi" w:hAnsiTheme="majorBidi" w:cstheme="majorBidi"/>
+          <w:color w:val="000000" w:themeColor="text1"/>
+          <w:lang w:val="en-GB"/>
+        </w:rPr>
+      </w:pPr>
+      <w:r>
+        <w:rPr>
+          <w:rFonts w:asciiTheme="majorBidi" w:hAnsiTheme="majorBidi" w:cstheme="majorBidi"/>
+          <w:color w:val="000000" w:themeColor="text1"/>
+          <w:lang w:val="en-GB"/>
+        </w:rPr>
+        <w:lastRenderedPageBreak/>
         <w:t xml:space="preserve"> </w:t>
       </w:r>
     </w:p>
     <w:p>
       <w:pPr>
-        <w:rPr>
-          <w:lang w:val="en-GB"/>
-        </w:rPr>
-      </w:pPr>
-      <w:r>
-        <w:rPr>
+        <w:pStyle w:val="Heading1"/>
+        <w:contextualSpacing/>
+        <w:rPr>
+          <w:rFonts w:asciiTheme="majorBidi" w:hAnsiTheme="majorBidi"/>
+          <w:color w:val="000000" w:themeColor="text1"/>
+          <w:lang w:val="en-GB"/>
+        </w:rPr>
+      </w:pPr>
+      <w:r>
+        <w:rPr>
+          <w:rFonts w:asciiTheme="majorBidi" w:hAnsiTheme="majorBidi"/>
+          <w:color w:val="000000" w:themeColor="text1"/>
           <w:lang w:val="en-GB"/>
         </w:rPr>
         <w:t xml:space="preserve">2. </w:t>
       </w:r>
       <w:r>
         <w:rPr>
+          <w:rFonts w:asciiTheme="majorBidi" w:hAnsiTheme="majorBidi"/>
+          <w:color w:val="000000" w:themeColor="text1"/>
           <w:lang w:val="en-GB"/>
         </w:rPr>
         <w:t>SYSTEM ANALYSIS AND DESIGN</w:t>
@@ -1054,18 +1219,26 @@
     </w:p>
     <w:p>
       <w:pPr>
-        <w:rPr>
-          <w:lang w:val="en-GB"/>
-        </w:rPr>
-      </w:pPr>
-      <w:r>
-        <w:rPr>
+        <w:pStyle w:val="Heading2"/>
+        <w:contextualSpacing/>
+        <w:rPr>
+          <w:rFonts w:asciiTheme="majorBidi" w:hAnsiTheme="majorBidi"/>
+          <w:color w:val="000000" w:themeColor="text1"/>
+          <w:lang w:val="en-GB"/>
+        </w:rPr>
+      </w:pPr>
+      <w:r>
+        <w:rPr>
+          <w:rFonts w:asciiTheme="majorBidi" w:hAnsiTheme="majorBidi"/>
+          <w:color w:val="000000" w:themeColor="text1"/>
           <w:lang w:val="en-GB"/>
         </w:rPr>
         <w:t>2.1 Flowchart</w:t>
       </w:r>
       <w:r>
         <w:rPr>
+          <w:rFonts w:asciiTheme="majorBidi" w:hAnsiTheme="majorBidi"/>
+          <w:color w:val="000000" w:themeColor="text1"/>
           <w:lang w:val="en-GB"/>
         </w:rPr>
         <w:t xml:space="preserve"> </w:t>
@@ -1073,13 +1246,18 @@
     </w:p>
     <w:p>
       <w:pPr>
-        <w:rPr>
-          <w:lang w:val="en-GB"/>
-        </w:rPr>
-      </w:pPr>
-      <w:r>
-        <w:rPr>
+        <w:contextualSpacing/>
+        <w:rPr>
+          <w:rFonts w:asciiTheme="majorBidi" w:hAnsiTheme="majorBidi" w:cstheme="majorBidi"/>
+          <w:color w:val="000000" w:themeColor="text1"/>
+          <w:lang w:val="en-GB"/>
+        </w:rPr>
+      </w:pPr>
+      <w:r>
+        <w:rPr>
+          <w:rFonts w:asciiTheme="majorBidi" w:hAnsiTheme="majorBidi" w:cstheme="majorBidi"/>
           <w:noProof/>
+          <w:color w:val="000000" w:themeColor="text1"/>
           <w:lang w:val="en-GB"/>
         </w:rPr>
         <w:drawing>
@@ -1106,7 +1284,7 @@
                     <pic:cNvPicPr/>
                   </pic:nvPicPr>
                   <pic:blipFill>
-                    <a:blip r:embed="rId6" cstate="print">
+                    <a:blip r:embed="rId8" cstate="print">
                       <a:extLst>
                         <a:ext uri="{28A0092B-C50C-407E-A947-70E740481C1C}">
                           <a14:useLocalDpi xmlns:a14="http://schemas.microsoft.com/office/drawing/2010/main" val="0"/>
@@ -1140,6 +1318,8 @@
       </w:r>
       <w:r>
         <w:rPr>
+          <w:rFonts w:asciiTheme="majorBidi" w:hAnsiTheme="majorBidi" w:cstheme="majorBidi"/>
+          <w:color w:val="000000" w:themeColor="text1"/>
           <w:lang w:val="en-GB"/>
         </w:rPr>
         <w:t xml:space="preserve">The figure below shows a simplified system flowchart for the </w:t>
@@ -1147,6 +1327,8 @@
       <w:proofErr w:type="spellStart"/>
       <w:r>
         <w:rPr>
+          <w:rFonts w:asciiTheme="majorBidi" w:hAnsiTheme="majorBidi" w:cstheme="majorBidi"/>
+          <w:color w:val="000000" w:themeColor="text1"/>
           <w:lang w:val="en-GB"/>
         </w:rPr>
         <w:t>MaziwaTrack</w:t>
@@ -1154,6 +1336,8 @@
       <w:proofErr w:type="spellEnd"/>
       <w:r>
         <w:rPr>
+          <w:rFonts w:asciiTheme="majorBidi" w:hAnsiTheme="majorBidi" w:cstheme="majorBidi"/>
+          <w:color w:val="000000" w:themeColor="text1"/>
           <w:lang w:val="en-GB"/>
         </w:rPr>
         <w:t xml:space="preserve"> information system.</w:t>
@@ -1161,20 +1345,29 @@
     </w:p>
     <w:p>
       <w:pPr>
-        <w:rPr>
-          <w:lang w:val="en-GB"/>
-        </w:rPr>
-      </w:pPr>
-    </w:p>
-    <w:p>
-      <w:pPr>
-        <w:rPr>
-          <w:lang w:val="en-GB"/>
-        </w:rPr>
-      </w:pPr>
-      <w:r>
-        <w:rPr>
+        <w:contextualSpacing/>
+        <w:rPr>
+          <w:rFonts w:asciiTheme="majorBidi" w:hAnsiTheme="majorBidi" w:cstheme="majorBidi"/>
+          <w:color w:val="000000" w:themeColor="text1"/>
+          <w:lang w:val="en-GB"/>
+        </w:rPr>
+      </w:pPr>
+    </w:p>
+    <w:p>
+      <w:pPr>
+        <w:pStyle w:val="Heading2"/>
+        <w:contextualSpacing/>
+        <w:rPr>
+          <w:rFonts w:asciiTheme="majorBidi" w:hAnsiTheme="majorBidi"/>
+          <w:color w:val="000000" w:themeColor="text1"/>
+          <w:lang w:val="en-GB"/>
+        </w:rPr>
+      </w:pPr>
+      <w:r>
+        <w:rPr>
+          <w:rFonts w:asciiTheme="majorBidi" w:hAnsiTheme="majorBidi"/>
           <w:noProof/>
+          <w:color w:val="000000" w:themeColor="text1"/>
         </w:rPr>
         <w:lastRenderedPageBreak/>
         <mc:AlternateContent>
@@ -1309,6 +1502,8 @@
       </w:r>
       <w:r>
         <w:rPr>
+          <w:rFonts w:asciiTheme="majorBidi" w:hAnsiTheme="majorBidi"/>
+          <w:color w:val="000000" w:themeColor="text1"/>
           <w:lang w:val="en-GB"/>
         </w:rPr>
         <w:t>2.2 Use Case Diagram</w:t>
@@ -1316,132 +1511,177 @@
     </w:p>
     <w:p>
       <w:pPr>
-        <w:rPr>
-          <w:lang w:val="en-GB"/>
-        </w:rPr>
-      </w:pPr>
-      <w:r>
-        <w:rPr>
+        <w:contextualSpacing/>
+        <w:rPr>
+          <w:rFonts w:asciiTheme="majorBidi" w:hAnsiTheme="majorBidi" w:cstheme="majorBidi"/>
+          <w:color w:val="000000" w:themeColor="text1"/>
+          <w:lang w:val="en-GB"/>
+        </w:rPr>
+      </w:pPr>
+      <w:r>
+        <w:rPr>
+          <w:rFonts w:asciiTheme="majorBidi" w:hAnsiTheme="majorBidi" w:cstheme="majorBidi"/>
+          <w:color w:val="000000" w:themeColor="text1"/>
           <w:lang w:val="en-GB"/>
         </w:rPr>
         <w:t>The use diagram below shows the</w:t>
       </w:r>
       <w:r>
         <w:rPr>
+          <w:rFonts w:asciiTheme="majorBidi" w:hAnsiTheme="majorBidi" w:cstheme="majorBidi"/>
+          <w:color w:val="000000" w:themeColor="text1"/>
           <w:lang w:val="en-GB"/>
         </w:rPr>
         <w:t xml:space="preserve"> functional requirements</w:t>
       </w:r>
       <w:r>
         <w:rPr>
+          <w:rFonts w:asciiTheme="majorBidi" w:hAnsiTheme="majorBidi" w:cstheme="majorBidi"/>
+          <w:color w:val="000000" w:themeColor="text1"/>
           <w:lang w:val="en-GB"/>
         </w:rPr>
         <w:t xml:space="preserve"> of the</w:t>
       </w:r>
       <w:r>
         <w:rPr>
+          <w:rFonts w:asciiTheme="majorBidi" w:hAnsiTheme="majorBidi" w:cstheme="majorBidi"/>
+          <w:color w:val="000000" w:themeColor="text1"/>
           <w:lang w:val="en-GB"/>
         </w:rPr>
         <w:t xml:space="preserve"> system. The actors</w:t>
       </w:r>
       <w:r>
         <w:rPr>
+          <w:rFonts w:asciiTheme="majorBidi" w:hAnsiTheme="majorBidi" w:cstheme="majorBidi"/>
+          <w:color w:val="000000" w:themeColor="text1"/>
           <w:lang w:val="en-GB"/>
         </w:rPr>
         <w:t xml:space="preserve"> </w:t>
       </w:r>
       <w:r>
         <w:rPr>
+          <w:rFonts w:asciiTheme="majorBidi" w:hAnsiTheme="majorBidi" w:cstheme="majorBidi"/>
+          <w:color w:val="000000" w:themeColor="text1"/>
           <w:lang w:val="en-GB"/>
         </w:rPr>
         <w:t>include</w:t>
       </w:r>
       <w:r>
         <w:rPr>
+          <w:rFonts w:asciiTheme="majorBidi" w:hAnsiTheme="majorBidi" w:cstheme="majorBidi"/>
+          <w:color w:val="000000" w:themeColor="text1"/>
           <w:lang w:val="en-GB"/>
         </w:rPr>
         <w:t xml:space="preserve"> farmer,</w:t>
       </w:r>
       <w:r>
         <w:rPr>
+          <w:rFonts w:asciiTheme="majorBidi" w:hAnsiTheme="majorBidi" w:cstheme="majorBidi"/>
+          <w:color w:val="000000" w:themeColor="text1"/>
           <w:lang w:val="en-GB"/>
         </w:rPr>
         <w:t xml:space="preserve"> </w:t>
       </w:r>
       <w:r>
         <w:rPr>
+          <w:rFonts w:asciiTheme="majorBidi" w:hAnsiTheme="majorBidi" w:cstheme="majorBidi"/>
+          <w:color w:val="000000" w:themeColor="text1"/>
           <w:lang w:val="en-GB"/>
         </w:rPr>
         <w:t>grader</w:t>
       </w:r>
       <w:r>
         <w:rPr>
+          <w:rFonts w:asciiTheme="majorBidi" w:hAnsiTheme="majorBidi" w:cstheme="majorBidi"/>
+          <w:color w:val="000000" w:themeColor="text1"/>
           <w:lang w:val="en-GB"/>
         </w:rPr>
         <w:t xml:space="preserve"> and </w:t>
       </w:r>
       <w:r>
         <w:rPr>
+          <w:rFonts w:asciiTheme="majorBidi" w:hAnsiTheme="majorBidi" w:cstheme="majorBidi"/>
+          <w:color w:val="000000" w:themeColor="text1"/>
           <w:lang w:val="en-GB"/>
         </w:rPr>
         <w:t>admin. The</w:t>
       </w:r>
       <w:r>
         <w:rPr>
+          <w:rFonts w:asciiTheme="majorBidi" w:hAnsiTheme="majorBidi" w:cstheme="majorBidi"/>
+          <w:color w:val="000000" w:themeColor="text1"/>
           <w:lang w:val="en-GB"/>
         </w:rPr>
         <w:t xml:space="preserve"> email service in this case</w:t>
       </w:r>
       <w:r>
         <w:rPr>
+          <w:rFonts w:asciiTheme="majorBidi" w:hAnsiTheme="majorBidi" w:cstheme="majorBidi"/>
+          <w:color w:val="000000" w:themeColor="text1"/>
           <w:lang w:val="en-GB"/>
         </w:rPr>
         <w:t xml:space="preserve"> is an external </w:t>
       </w:r>
       <w:r>
         <w:rPr>
+          <w:rFonts w:asciiTheme="majorBidi" w:hAnsiTheme="majorBidi" w:cstheme="majorBidi"/>
+          <w:color w:val="000000" w:themeColor="text1"/>
           <w:lang w:val="en-GB"/>
         </w:rPr>
         <w:t>system that would be used</w:t>
       </w:r>
       <w:r>
         <w:rPr>
+          <w:rFonts w:asciiTheme="majorBidi" w:hAnsiTheme="majorBidi" w:cstheme="majorBidi"/>
+          <w:color w:val="000000" w:themeColor="text1"/>
           <w:lang w:val="en-GB"/>
         </w:rPr>
         <w:t xml:space="preserve"> to send receipts to the farmer once a payment is approved the admin. The farmer can register, log in and record a milk deposit, after which a batch number is displayed on the </w:t>
       </w:r>
       <w:r>
         <w:rPr>
+          <w:rFonts w:asciiTheme="majorBidi" w:hAnsiTheme="majorBidi" w:cstheme="majorBidi"/>
+          <w:color w:val="000000" w:themeColor="text1"/>
           <w:lang w:val="en-GB"/>
         </w:rPr>
         <w:t>screen</w:t>
       </w:r>
       <w:r>
         <w:rPr>
+          <w:rFonts w:asciiTheme="majorBidi" w:hAnsiTheme="majorBidi" w:cstheme="majorBidi"/>
+          <w:color w:val="000000" w:themeColor="text1"/>
           <w:lang w:val="en-GB"/>
         </w:rPr>
         <w:t>.</w:t>
       </w:r>
       <w:r>
         <w:rPr>
+          <w:rFonts w:asciiTheme="majorBidi" w:hAnsiTheme="majorBidi" w:cstheme="majorBidi"/>
+          <w:color w:val="000000" w:themeColor="text1"/>
           <w:lang w:val="en-GB"/>
         </w:rPr>
         <w:t xml:space="preserve"> </w:t>
       </w:r>
       <w:r>
         <w:rPr>
+          <w:rFonts w:asciiTheme="majorBidi" w:hAnsiTheme="majorBidi" w:cstheme="majorBidi"/>
+          <w:color w:val="000000" w:themeColor="text1"/>
           <w:lang w:val="en-GB"/>
         </w:rPr>
         <w:t>A</w:t>
       </w:r>
       <w:r>
         <w:rPr>
+          <w:rFonts w:asciiTheme="majorBidi" w:hAnsiTheme="majorBidi" w:cstheme="majorBidi"/>
+          <w:color w:val="000000" w:themeColor="text1"/>
           <w:lang w:val="en-GB"/>
         </w:rPr>
         <w:t xml:space="preserve"> grader verifies the quality and quantity of the milk</w:t>
       </w:r>
       <w:r>
         <w:rPr>
+          <w:rFonts w:asciiTheme="majorBidi" w:hAnsiTheme="majorBidi" w:cstheme="majorBidi"/>
+          <w:color w:val="000000" w:themeColor="text1"/>
           <w:lang w:val="en-GB"/>
         </w:rPr>
         <w:t>. The admin can view batch information, approve payments and generate pdf reports.</w:t>
@@ -1450,10 +1690,17 @@
     <w:p>
       <w:pPr>
         <w:keepNext/>
-      </w:pPr>
-      <w:r>
-        <w:rPr>
+        <w:contextualSpacing/>
+        <w:rPr>
+          <w:rFonts w:asciiTheme="majorBidi" w:hAnsiTheme="majorBidi" w:cstheme="majorBidi"/>
+          <w:color w:val="000000" w:themeColor="text1"/>
+        </w:rPr>
+      </w:pPr>
+      <w:r>
+        <w:rPr>
+          <w:rFonts w:asciiTheme="majorBidi" w:hAnsiTheme="majorBidi" w:cstheme="majorBidi"/>
           <w:noProof/>
+          <w:color w:val="000000" w:themeColor="text1"/>
           <w:lang w:val="en-GB"/>
         </w:rPr>
         <w:drawing>
@@ -1472,7 +1719,7 @@
                     <pic:cNvPicPr/>
                   </pic:nvPicPr>
                   <pic:blipFill>
-                    <a:blip r:embed="rId7" cstate="print">
+                    <a:blip r:embed="rId9" cstate="print">
                       <a:extLst>
                         <a:ext uri="{28A0092B-C50C-407E-A947-70E740481C1C}">
                           <a14:useLocalDpi xmlns:a14="http://schemas.microsoft.com/office/drawing/2010/main" val="0"/>
@@ -1502,23 +1749,61 @@
     <w:p>
       <w:pPr>
         <w:pStyle w:val="Caption"/>
-        <w:rPr>
-          <w:lang w:val="en-GB"/>
-        </w:rPr>
-      </w:pPr>
-      <w:r>
+        <w:contextualSpacing/>
+        <w:rPr>
+          <w:rFonts w:asciiTheme="majorBidi" w:hAnsiTheme="majorBidi" w:cstheme="majorBidi"/>
+          <w:color w:val="000000" w:themeColor="text1"/>
+          <w:lang w:val="en-GB"/>
+        </w:rPr>
+      </w:pPr>
+      <w:r>
+        <w:rPr>
+          <w:rFonts w:asciiTheme="majorBidi" w:hAnsiTheme="majorBidi" w:cstheme="majorBidi"/>
+          <w:color w:val="000000" w:themeColor="text1"/>
+        </w:rPr>
         <w:t xml:space="preserve">Figure </w:t>
       </w:r>
-      <w:fldSimple w:instr=" SEQ Figure \* ARABIC ">
-        <w:r>
-          <w:rPr>
-            <w:noProof/>
-          </w:rPr>
-          <w:t>2</w:t>
-        </w:r>
-      </w:fldSimple>
-      <w:r>
-        <w:rPr>
+      <w:r>
+        <w:rPr>
+          <w:rFonts w:asciiTheme="majorBidi" w:hAnsiTheme="majorBidi" w:cstheme="majorBidi"/>
+          <w:color w:val="000000" w:themeColor="text1"/>
+        </w:rPr>
+        <w:fldChar w:fldCharType="begin"/>
+      </w:r>
+      <w:r>
+        <w:rPr>
+          <w:rFonts w:asciiTheme="majorBidi" w:hAnsiTheme="majorBidi" w:cstheme="majorBidi"/>
+          <w:color w:val="000000" w:themeColor="text1"/>
+        </w:rPr>
+        <w:instrText xml:space="preserve"> SEQ Figure \* ARABIC </w:instrText>
+      </w:r>
+      <w:r>
+        <w:rPr>
+          <w:rFonts w:asciiTheme="majorBidi" w:hAnsiTheme="majorBidi" w:cstheme="majorBidi"/>
+          <w:color w:val="000000" w:themeColor="text1"/>
+        </w:rPr>
+        <w:fldChar w:fldCharType="separate"/>
+      </w:r>
+      <w:r>
+        <w:rPr>
+          <w:rFonts w:asciiTheme="majorBidi" w:hAnsiTheme="majorBidi" w:cstheme="majorBidi"/>
+          <w:noProof/>
+          <w:color w:val="000000" w:themeColor="text1"/>
+        </w:rPr>
+        <w:t>2</w:t>
+      </w:r>
+      <w:r>
+        <w:rPr>
+          <w:rFonts w:asciiTheme="majorBidi" w:hAnsiTheme="majorBidi" w:cstheme="majorBidi"/>
+          <w:noProof/>
+          <w:color w:val="000000" w:themeColor="text1"/>
+        </w:rPr>
+        <w:fldChar w:fldCharType="end"/>
+      </w:r>
+      <w:r>
+        <w:rPr>
+          <w:rFonts w:asciiTheme="majorBidi" w:hAnsiTheme="majorBidi" w:cstheme="majorBidi"/>
+          <w:color w:val="000000" w:themeColor="text1"/>
           <w:lang w:val="en-GB"/>
         </w:rPr>
         <w:t>:Use Case Diagram</w:t>
@@ -1526,19 +1811,28 @@
     </w:p>
     <w:p>
       <w:pPr>
-        <w:rPr>
-          <w:lang w:val="en-GB"/>
-        </w:rPr>
-      </w:pPr>
-    </w:p>
-    <w:p>
-      <w:pPr>
-        <w:rPr>
-          <w:lang w:val="en-GB"/>
-        </w:rPr>
-      </w:pPr>
-      <w:r>
-        <w:rPr>
+        <w:contextualSpacing/>
+        <w:rPr>
+          <w:rFonts w:asciiTheme="majorBidi" w:hAnsiTheme="majorBidi" w:cstheme="majorBidi"/>
+          <w:color w:val="000000" w:themeColor="text1"/>
+          <w:lang w:val="en-GB"/>
+        </w:rPr>
+      </w:pPr>
+    </w:p>
+    <w:p>
+      <w:pPr>
+        <w:pStyle w:val="Heading2"/>
+        <w:contextualSpacing/>
+        <w:rPr>
+          <w:rFonts w:asciiTheme="majorBidi" w:hAnsiTheme="majorBidi"/>
+          <w:color w:val="000000" w:themeColor="text1"/>
+          <w:lang w:val="en-GB"/>
+        </w:rPr>
+      </w:pPr>
+      <w:r>
+        <w:rPr>
+          <w:rFonts w:asciiTheme="majorBidi" w:hAnsiTheme="majorBidi"/>
+          <w:color w:val="000000" w:themeColor="text1"/>
           <w:lang w:val="en-GB"/>
         </w:rPr>
         <w:t>2.3 Class Diagram</w:t>
@@ -1546,48 +1840,65 @@
     </w:p>
     <w:p>
       <w:pPr>
-        <w:rPr>
-          <w:lang w:val="en-GB"/>
-        </w:rPr>
-      </w:pPr>
-      <w:r>
-        <w:rPr>
+        <w:contextualSpacing/>
+        <w:rPr>
+          <w:rFonts w:asciiTheme="majorBidi" w:hAnsiTheme="majorBidi" w:cstheme="majorBidi"/>
+          <w:color w:val="000000" w:themeColor="text1"/>
+          <w:lang w:val="en-GB"/>
+        </w:rPr>
+      </w:pPr>
+      <w:r>
+        <w:rPr>
+          <w:rFonts w:asciiTheme="majorBidi" w:hAnsiTheme="majorBidi" w:cstheme="majorBidi"/>
+          <w:color w:val="000000" w:themeColor="text1"/>
           <w:lang w:val="en-GB"/>
         </w:rPr>
         <w:t xml:space="preserve">The </w:t>
       </w:r>
       <w:r>
         <w:rPr>
+          <w:rFonts w:asciiTheme="majorBidi" w:hAnsiTheme="majorBidi" w:cstheme="majorBidi"/>
+          <w:color w:val="000000" w:themeColor="text1"/>
           <w:lang w:val="en-GB"/>
         </w:rPr>
         <w:t>class diagram shows a summary of the classes and how they relate.</w:t>
       </w:r>
       <w:r>
         <w:rPr>
+          <w:rFonts w:asciiTheme="majorBidi" w:hAnsiTheme="majorBidi" w:cstheme="majorBidi"/>
+          <w:color w:val="000000" w:themeColor="text1"/>
           <w:lang w:val="en-GB"/>
         </w:rPr>
         <w:t xml:space="preserve"> </w:t>
       </w:r>
       <w:r>
         <w:rPr>
+          <w:rFonts w:asciiTheme="majorBidi" w:hAnsiTheme="majorBidi" w:cstheme="majorBidi"/>
+          <w:color w:val="000000" w:themeColor="text1"/>
           <w:lang w:val="en-GB"/>
         </w:rPr>
         <w:t xml:space="preserve">The User class represents farmers, graders and </w:t>
       </w:r>
       <w:r>
         <w:rPr>
+          <w:rFonts w:asciiTheme="majorBidi" w:hAnsiTheme="majorBidi" w:cstheme="majorBidi"/>
+          <w:color w:val="000000" w:themeColor="text1"/>
           <w:lang w:val="en-GB"/>
         </w:rPr>
         <w:t>administrators.</w:t>
       </w:r>
       <w:r>
         <w:rPr>
+          <w:rFonts w:asciiTheme="majorBidi" w:hAnsiTheme="majorBidi" w:cstheme="majorBidi"/>
+          <w:color w:val="000000" w:themeColor="text1"/>
           <w:lang w:val="en-GB"/>
         </w:rPr>
         <w:t xml:space="preserve"> </w:t>
       </w:r>
       <w:r>
         <w:rPr>
+          <w:rFonts w:asciiTheme="majorBidi" w:hAnsiTheme="majorBidi" w:cstheme="majorBidi"/>
+          <w:color w:val="000000" w:themeColor="text1"/>
           <w:lang w:val="en-GB"/>
         </w:rPr>
         <w:t xml:space="preserve">The actions carried out depend on the role of the user, but all the users can log in and out. A user can record many batches of milk </w:t>
@@ -1595,6 +1906,8 @@
       <w:proofErr w:type="gramStart"/>
       <w:r>
         <w:rPr>
+          <w:rFonts w:asciiTheme="majorBidi" w:hAnsiTheme="majorBidi" w:cstheme="majorBidi"/>
+          <w:color w:val="000000" w:themeColor="text1"/>
           <w:lang w:val="en-GB"/>
         </w:rPr>
         <w:lastRenderedPageBreak/>
@@ -1602,6 +1915,8 @@
       </w:r>
       <w:r>
         <w:rPr>
+          <w:rFonts w:asciiTheme="majorBidi" w:hAnsiTheme="majorBidi" w:cstheme="majorBidi"/>
+          <w:color w:val="000000" w:themeColor="text1"/>
           <w:lang w:val="en-GB"/>
         </w:rPr>
         <w:t>,</w:t>
@@ -1609,48 +1924,64 @@
       <w:proofErr w:type="gramEnd"/>
       <w:r>
         <w:rPr>
+          <w:rFonts w:asciiTheme="majorBidi" w:hAnsiTheme="majorBidi" w:cstheme="majorBidi"/>
+          <w:color w:val="000000" w:themeColor="text1"/>
           <w:lang w:val="en-GB"/>
         </w:rPr>
         <w:t xml:space="preserve"> each batch is verified by the grader</w:t>
       </w:r>
       <w:r>
         <w:rPr>
+          <w:rFonts w:asciiTheme="majorBidi" w:hAnsiTheme="majorBidi" w:cstheme="majorBidi"/>
+          <w:color w:val="000000" w:themeColor="text1"/>
           <w:lang w:val="en-GB"/>
         </w:rPr>
         <w:t xml:space="preserve"> after which the payment can be approved by the admin.</w:t>
       </w:r>
       <w:r>
         <w:rPr>
+          <w:rFonts w:asciiTheme="majorBidi" w:hAnsiTheme="majorBidi" w:cstheme="majorBidi"/>
+          <w:color w:val="000000" w:themeColor="text1"/>
           <w:lang w:val="en-GB"/>
         </w:rPr>
         <w:t xml:space="preserve"> </w:t>
       </w:r>
       <w:r>
         <w:rPr>
+          <w:rFonts w:asciiTheme="majorBidi" w:hAnsiTheme="majorBidi" w:cstheme="majorBidi"/>
+          <w:color w:val="000000" w:themeColor="text1"/>
           <w:lang w:val="en-GB"/>
         </w:rPr>
         <w:t>One batch one payment.</w:t>
       </w:r>
       <w:r>
         <w:rPr>
+          <w:rFonts w:asciiTheme="majorBidi" w:hAnsiTheme="majorBidi" w:cstheme="majorBidi"/>
+          <w:color w:val="000000" w:themeColor="text1"/>
           <w:lang w:val="en-GB"/>
         </w:rPr>
         <w:t xml:space="preserve"> </w:t>
       </w:r>
       <w:r>
         <w:rPr>
+          <w:rFonts w:asciiTheme="majorBidi" w:hAnsiTheme="majorBidi" w:cstheme="majorBidi"/>
+          <w:color w:val="000000" w:themeColor="text1"/>
           <w:lang w:val="en-GB"/>
         </w:rPr>
         <w:t xml:space="preserve">After approval the payment is sent </w:t>
       </w:r>
       <w:r>
         <w:rPr>
+          <w:rFonts w:asciiTheme="majorBidi" w:hAnsiTheme="majorBidi" w:cstheme="majorBidi"/>
+          <w:color w:val="000000" w:themeColor="text1"/>
           <w:lang w:val="en-GB"/>
         </w:rPr>
         <w:t>t</w:t>
       </w:r>
       <w:r>
         <w:rPr>
+          <w:rFonts w:asciiTheme="majorBidi" w:hAnsiTheme="majorBidi" w:cstheme="majorBidi"/>
+          <w:color w:val="000000" w:themeColor="text1"/>
           <w:lang w:val="en-GB"/>
         </w:rPr>
         <w:t xml:space="preserve">o the user’s </w:t>
@@ -1658,6 +1989,8 @@
       <w:proofErr w:type="gramStart"/>
       <w:r>
         <w:rPr>
+          <w:rFonts w:asciiTheme="majorBidi" w:hAnsiTheme="majorBidi" w:cstheme="majorBidi"/>
+          <w:color w:val="000000" w:themeColor="text1"/>
           <w:lang w:val="en-GB"/>
         </w:rPr>
         <w:t>email</w:t>
@@ -1665,6 +1998,8 @@
       <w:proofErr w:type="gramEnd"/>
       <w:r>
         <w:rPr>
+          <w:rFonts w:asciiTheme="majorBidi" w:hAnsiTheme="majorBidi" w:cstheme="majorBidi"/>
+          <w:color w:val="000000" w:themeColor="text1"/>
           <w:lang w:val="en-GB"/>
         </w:rPr>
         <w:t xml:space="preserve"> and a receipt can be printed. Every action by a user is stored in the audit log.</w:t>
@@ -1673,10 +2008,17 @@
     <w:p>
       <w:pPr>
         <w:keepNext/>
-      </w:pPr>
-      <w:r>
-        <w:rPr>
+        <w:contextualSpacing/>
+        <w:rPr>
+          <w:rFonts w:asciiTheme="majorBidi" w:hAnsiTheme="majorBidi" w:cstheme="majorBidi"/>
+          <w:color w:val="000000" w:themeColor="text1"/>
+        </w:rPr>
+      </w:pPr>
+      <w:r>
+        <w:rPr>
+          <w:rFonts w:asciiTheme="majorBidi" w:hAnsiTheme="majorBidi" w:cstheme="majorBidi"/>
           <w:noProof/>
+          <w:color w:val="000000" w:themeColor="text1"/>
           <w:lang w:val="en-GB"/>
         </w:rPr>
         <w:drawing>
@@ -1695,7 +2037,7 @@
                     <pic:cNvPicPr/>
                   </pic:nvPicPr>
                   <pic:blipFill>
-                    <a:blip r:embed="rId8" cstate="print">
+                    <a:blip r:embed="rId10" cstate="print">
                       <a:extLst>
                         <a:ext uri="{28A0092B-C50C-407E-A947-70E740481C1C}">
                           <a14:useLocalDpi xmlns:a14="http://schemas.microsoft.com/office/drawing/2010/main" val="0"/>
@@ -1725,23 +2067,61 @@
     <w:p>
       <w:pPr>
         <w:pStyle w:val="Caption"/>
-        <w:rPr>
-          <w:lang w:val="en-GB"/>
-        </w:rPr>
-      </w:pPr>
-      <w:r>
+        <w:contextualSpacing/>
+        <w:rPr>
+          <w:rFonts w:asciiTheme="majorBidi" w:hAnsiTheme="majorBidi" w:cstheme="majorBidi"/>
+          <w:color w:val="000000" w:themeColor="text1"/>
+          <w:lang w:val="en-GB"/>
+        </w:rPr>
+      </w:pPr>
+      <w:r>
+        <w:rPr>
+          <w:rFonts w:asciiTheme="majorBidi" w:hAnsiTheme="majorBidi" w:cstheme="majorBidi"/>
+          <w:color w:val="000000" w:themeColor="text1"/>
+        </w:rPr>
         <w:t xml:space="preserve">Figure </w:t>
       </w:r>
-      <w:fldSimple w:instr=" SEQ Figure \* ARABIC ">
-        <w:r>
-          <w:rPr>
-            <w:noProof/>
-          </w:rPr>
-          <w:t>3</w:t>
-        </w:r>
-      </w:fldSimple>
-      <w:r>
-        <w:rPr>
+      <w:r>
+        <w:rPr>
+          <w:rFonts w:asciiTheme="majorBidi" w:hAnsiTheme="majorBidi" w:cstheme="majorBidi"/>
+          <w:color w:val="000000" w:themeColor="text1"/>
+        </w:rPr>
+        <w:fldChar w:fldCharType="begin"/>
+      </w:r>
+      <w:r>
+        <w:rPr>
+          <w:rFonts w:asciiTheme="majorBidi" w:hAnsiTheme="majorBidi" w:cstheme="majorBidi"/>
+          <w:color w:val="000000" w:themeColor="text1"/>
+        </w:rPr>
+        <w:instrText xml:space="preserve"> SEQ Figure \* ARABIC </w:instrText>
+      </w:r>
+      <w:r>
+        <w:rPr>
+          <w:rFonts w:asciiTheme="majorBidi" w:hAnsiTheme="majorBidi" w:cstheme="majorBidi"/>
+          <w:color w:val="000000" w:themeColor="text1"/>
+        </w:rPr>
+        <w:fldChar w:fldCharType="separate"/>
+      </w:r>
+      <w:r>
+        <w:rPr>
+          <w:rFonts w:asciiTheme="majorBidi" w:hAnsiTheme="majorBidi" w:cstheme="majorBidi"/>
+          <w:noProof/>
+          <w:color w:val="000000" w:themeColor="text1"/>
+        </w:rPr>
+        <w:t>3</w:t>
+      </w:r>
+      <w:r>
+        <w:rPr>
+          <w:rFonts w:asciiTheme="majorBidi" w:hAnsiTheme="majorBidi" w:cstheme="majorBidi"/>
+          <w:noProof/>
+          <w:color w:val="000000" w:themeColor="text1"/>
+        </w:rPr>
+        <w:fldChar w:fldCharType="end"/>
+      </w:r>
+      <w:r>
+        <w:rPr>
+          <w:rFonts w:asciiTheme="majorBidi" w:hAnsiTheme="majorBidi" w:cstheme="majorBidi"/>
+          <w:color w:val="000000" w:themeColor="text1"/>
           <w:lang w:val="en-GB"/>
         </w:rPr>
         <w:t>:Class diagram</w:t>
@@ -1749,12 +2129,18 @@
     </w:p>
     <w:p>
       <w:pPr>
-        <w:rPr>
-          <w:lang w:val="en-GB"/>
-        </w:rPr>
-      </w:pPr>
-      <w:r>
-        <w:rPr>
+        <w:pStyle w:val="Heading2"/>
+        <w:contextualSpacing/>
+        <w:rPr>
+          <w:rFonts w:asciiTheme="majorBidi" w:hAnsiTheme="majorBidi"/>
+          <w:color w:val="000000" w:themeColor="text1"/>
+          <w:lang w:val="en-GB"/>
+        </w:rPr>
+      </w:pPr>
+      <w:r>
+        <w:rPr>
+          <w:rFonts w:asciiTheme="majorBidi" w:hAnsiTheme="majorBidi"/>
+          <w:color w:val="000000" w:themeColor="text1"/>
           <w:lang w:val="en-GB"/>
         </w:rPr>
         <w:t>2.4 ER diagram</w:t>
@@ -1762,30 +2148,41 @@
     </w:p>
     <w:p>
       <w:pPr>
-        <w:rPr>
-          <w:lang w:val="en-GB"/>
-        </w:rPr>
-      </w:pPr>
-      <w:r>
-        <w:rPr>
+        <w:contextualSpacing/>
+        <w:rPr>
+          <w:rFonts w:asciiTheme="majorBidi" w:hAnsiTheme="majorBidi" w:cstheme="majorBidi"/>
+          <w:color w:val="000000" w:themeColor="text1"/>
+          <w:lang w:val="en-GB"/>
+        </w:rPr>
+      </w:pPr>
+      <w:r>
+        <w:rPr>
+          <w:rFonts w:asciiTheme="majorBidi" w:hAnsiTheme="majorBidi" w:cstheme="majorBidi"/>
+          <w:color w:val="000000" w:themeColor="text1"/>
           <w:lang w:val="en-GB"/>
         </w:rPr>
         <w:t>T</w:t>
       </w:r>
       <w:r>
         <w:rPr>
+          <w:rFonts w:asciiTheme="majorBidi" w:hAnsiTheme="majorBidi" w:cstheme="majorBidi"/>
+          <w:color w:val="000000" w:themeColor="text1"/>
           <w:lang w:val="en-GB"/>
         </w:rPr>
         <w:t>he ER diagram</w:t>
       </w:r>
       <w:r>
         <w:rPr>
+          <w:rFonts w:asciiTheme="majorBidi" w:hAnsiTheme="majorBidi" w:cstheme="majorBidi"/>
+          <w:color w:val="000000" w:themeColor="text1"/>
           <w:lang w:val="en-GB"/>
         </w:rPr>
         <w:t xml:space="preserve"> below</w:t>
       </w:r>
       <w:r>
         <w:rPr>
+          <w:rFonts w:asciiTheme="majorBidi" w:hAnsiTheme="majorBidi" w:cstheme="majorBidi"/>
+          <w:color w:val="000000" w:themeColor="text1"/>
           <w:lang w:val="en-GB"/>
         </w:rPr>
         <w:t xml:space="preserve"> shows four tables of </w:t>
@@ -1793,6 +2190,8 @@
       <w:proofErr w:type="spellStart"/>
       <w:r>
         <w:rPr>
+          <w:rFonts w:asciiTheme="majorBidi" w:hAnsiTheme="majorBidi" w:cstheme="majorBidi"/>
+          <w:color w:val="000000" w:themeColor="text1"/>
           <w:lang w:val="en-GB"/>
         </w:rPr>
         <w:t>MaziwaTrack</w:t>
@@ -1800,18 +2199,24 @@
       <w:proofErr w:type="spellEnd"/>
       <w:r>
         <w:rPr>
+          <w:rFonts w:asciiTheme="majorBidi" w:hAnsiTheme="majorBidi" w:cstheme="majorBidi"/>
+          <w:color w:val="000000" w:themeColor="text1"/>
           <w:lang w:val="en-GB"/>
         </w:rPr>
         <w:t>:</w:t>
       </w:r>
       <w:r>
         <w:rPr>
+          <w:rFonts w:asciiTheme="majorBidi" w:hAnsiTheme="majorBidi" w:cstheme="majorBidi"/>
+          <w:color w:val="000000" w:themeColor="text1"/>
           <w:lang w:val="en-GB"/>
         </w:rPr>
         <w:t xml:space="preserve"> users, batches</w:t>
       </w:r>
       <w:r>
         <w:rPr>
+          <w:rFonts w:asciiTheme="majorBidi" w:hAnsiTheme="majorBidi" w:cstheme="majorBidi"/>
+          <w:color w:val="000000" w:themeColor="text1"/>
           <w:lang w:val="en-GB"/>
         </w:rPr>
         <w:t xml:space="preserve">, payments and </w:t>
@@ -1819,6 +2224,8 @@
       <w:proofErr w:type="spellStart"/>
       <w:r>
         <w:rPr>
+          <w:rFonts w:asciiTheme="majorBidi" w:hAnsiTheme="majorBidi" w:cstheme="majorBidi"/>
+          <w:color w:val="000000" w:themeColor="text1"/>
           <w:lang w:val="en-GB"/>
         </w:rPr>
         <w:t>audit_logs</w:t>
@@ -1826,30 +2233,40 @@
       <w:proofErr w:type="spellEnd"/>
       <w:r>
         <w:rPr>
+          <w:rFonts w:asciiTheme="majorBidi" w:hAnsiTheme="majorBidi" w:cstheme="majorBidi"/>
+          <w:color w:val="000000" w:themeColor="text1"/>
           <w:lang w:val="en-GB"/>
         </w:rPr>
         <w:t>.</w:t>
       </w:r>
       <w:r>
         <w:rPr>
+          <w:rFonts w:asciiTheme="majorBidi" w:hAnsiTheme="majorBidi" w:cstheme="majorBidi"/>
+          <w:color w:val="000000" w:themeColor="text1"/>
           <w:lang w:val="en-GB"/>
         </w:rPr>
         <w:t xml:space="preserve"> </w:t>
       </w:r>
       <w:r>
         <w:rPr>
+          <w:rFonts w:asciiTheme="majorBidi" w:hAnsiTheme="majorBidi" w:cstheme="majorBidi"/>
+          <w:color w:val="000000" w:themeColor="text1"/>
           <w:lang w:val="en-GB"/>
         </w:rPr>
         <w:t>The users table stores the</w:t>
       </w:r>
       <w:r>
         <w:rPr>
+          <w:rFonts w:asciiTheme="majorBidi" w:hAnsiTheme="majorBidi" w:cstheme="majorBidi"/>
+          <w:color w:val="000000" w:themeColor="text1"/>
           <w:lang w:val="en-GB"/>
         </w:rPr>
         <w:t xml:space="preserve"> farmers</w:t>
       </w:r>
       <w:r>
         <w:rPr>
+          <w:rFonts w:asciiTheme="majorBidi" w:hAnsiTheme="majorBidi" w:cstheme="majorBidi"/>
+          <w:color w:val="000000" w:themeColor="text1"/>
           <w:lang w:val="en-GB"/>
         </w:rPr>
         <w:t xml:space="preserve">’, </w:t>
@@ -1857,6 +2274,8 @@
       <w:proofErr w:type="gramStart"/>
       <w:r>
         <w:rPr>
+          <w:rFonts w:asciiTheme="majorBidi" w:hAnsiTheme="majorBidi" w:cstheme="majorBidi"/>
+          <w:color w:val="000000" w:themeColor="text1"/>
           <w:lang w:val="en-GB"/>
         </w:rPr>
         <w:t>graders’</w:t>
@@ -1864,42 +2283,56 @@
       <w:proofErr w:type="gramEnd"/>
       <w:r>
         <w:rPr>
+          <w:rFonts w:asciiTheme="majorBidi" w:hAnsiTheme="majorBidi" w:cstheme="majorBidi"/>
+          <w:color w:val="000000" w:themeColor="text1"/>
           <w:lang w:val="en-GB"/>
         </w:rPr>
         <w:t xml:space="preserve"> and</w:t>
       </w:r>
       <w:r>
         <w:rPr>
+          <w:rFonts w:asciiTheme="majorBidi" w:hAnsiTheme="majorBidi" w:cstheme="majorBidi"/>
+          <w:color w:val="000000" w:themeColor="text1"/>
           <w:lang w:val="en-GB"/>
         </w:rPr>
         <w:t xml:space="preserve"> </w:t>
       </w:r>
       <w:r>
         <w:rPr>
+          <w:rFonts w:asciiTheme="majorBidi" w:hAnsiTheme="majorBidi" w:cstheme="majorBidi"/>
+          <w:color w:val="000000" w:themeColor="text1"/>
           <w:lang w:val="en-GB"/>
         </w:rPr>
         <w:t>administrators’</w:t>
       </w:r>
       <w:r>
         <w:rPr>
+          <w:rFonts w:asciiTheme="majorBidi" w:hAnsiTheme="majorBidi" w:cstheme="majorBidi"/>
+          <w:color w:val="000000" w:themeColor="text1"/>
           <w:lang w:val="en-GB"/>
         </w:rPr>
         <w:t xml:space="preserve"> data</w:t>
       </w:r>
       <w:r>
         <w:rPr>
+          <w:rFonts w:asciiTheme="majorBidi" w:hAnsiTheme="majorBidi" w:cstheme="majorBidi"/>
+          <w:color w:val="000000" w:themeColor="text1"/>
           <w:lang w:val="en-GB"/>
         </w:rPr>
         <w:t>, able to be identified by their role.</w:t>
       </w:r>
       <w:r>
         <w:rPr>
+          <w:rFonts w:asciiTheme="majorBidi" w:hAnsiTheme="majorBidi" w:cstheme="majorBidi"/>
+          <w:color w:val="000000" w:themeColor="text1"/>
           <w:lang w:val="en-GB"/>
         </w:rPr>
         <w:t xml:space="preserve"> </w:t>
       </w:r>
       <w:r>
         <w:rPr>
+          <w:rFonts w:asciiTheme="majorBidi" w:hAnsiTheme="majorBidi" w:cstheme="majorBidi"/>
+          <w:color w:val="000000" w:themeColor="text1"/>
           <w:lang w:val="en-GB"/>
         </w:rPr>
         <w:t xml:space="preserve">Each batch is uniquely identified by a </w:t>
@@ -1907,8 +2340,10 @@
       <w:proofErr w:type="spellStart"/>
       <w:r>
         <w:rPr>
+          <w:rFonts w:asciiTheme="majorBidi" w:hAnsiTheme="majorBidi" w:cstheme="majorBidi"/>
           <w:i/>
           <w:iCs/>
+          <w:color w:val="000000" w:themeColor="text1"/>
           <w:lang w:val="en-GB"/>
         </w:rPr>
         <w:t>batch_id</w:t>
@@ -1916,6 +2351,8 @@
       <w:proofErr w:type="spellEnd"/>
       <w:r>
         <w:rPr>
+          <w:rFonts w:asciiTheme="majorBidi" w:hAnsiTheme="majorBidi" w:cstheme="majorBidi"/>
+          <w:color w:val="000000" w:themeColor="text1"/>
           <w:lang w:val="en-GB"/>
         </w:rPr>
         <w:t xml:space="preserve"> and is linked to a farmer by a </w:t>
@@ -1923,8 +2360,10 @@
       <w:proofErr w:type="spellStart"/>
       <w:r>
         <w:rPr>
+          <w:rFonts w:asciiTheme="majorBidi" w:hAnsiTheme="majorBidi" w:cstheme="majorBidi"/>
           <w:i/>
           <w:iCs/>
+          <w:color w:val="000000" w:themeColor="text1"/>
           <w:lang w:val="en-GB"/>
         </w:rPr>
         <w:t>farmer_id</w:t>
@@ -1932,26 +2371,34 @@
       <w:proofErr w:type="spellEnd"/>
       <w:r>
         <w:rPr>
+          <w:rFonts w:asciiTheme="majorBidi" w:hAnsiTheme="majorBidi" w:cstheme="majorBidi"/>
           <w:i/>
           <w:iCs/>
+          <w:color w:val="000000" w:themeColor="text1"/>
           <w:lang w:val="en-GB"/>
         </w:rPr>
         <w:t>.</w:t>
       </w:r>
       <w:r>
         <w:rPr>
+          <w:rFonts w:asciiTheme="majorBidi" w:hAnsiTheme="majorBidi" w:cstheme="majorBidi"/>
+          <w:color w:val="000000" w:themeColor="text1"/>
           <w:lang w:val="en-GB"/>
         </w:rPr>
         <w:t xml:space="preserve"> </w:t>
       </w:r>
       <w:r>
         <w:rPr>
+          <w:rFonts w:asciiTheme="majorBidi" w:hAnsiTheme="majorBidi" w:cstheme="majorBidi"/>
+          <w:color w:val="000000" w:themeColor="text1"/>
           <w:lang w:val="en-GB"/>
         </w:rPr>
         <w:t xml:space="preserve">The payments table uniquely </w:t>
       </w:r>
       <w:r>
         <w:rPr>
+          <w:rFonts w:asciiTheme="majorBidi" w:hAnsiTheme="majorBidi" w:cstheme="majorBidi"/>
+          <w:color w:val="000000" w:themeColor="text1"/>
           <w:lang w:val="en-GB"/>
         </w:rPr>
         <w:t xml:space="preserve">identifies each payment using a </w:t>
@@ -1959,8 +2406,10 @@
       <w:proofErr w:type="spellStart"/>
       <w:r>
         <w:rPr>
+          <w:rFonts w:asciiTheme="majorBidi" w:hAnsiTheme="majorBidi" w:cstheme="majorBidi"/>
           <w:i/>
           <w:iCs/>
+          <w:color w:val="000000" w:themeColor="text1"/>
           <w:lang w:val="en-GB"/>
         </w:rPr>
         <w:t>payment_id</w:t>
@@ -1968,6 +2417,8 @@
       <w:proofErr w:type="spellEnd"/>
       <w:r>
         <w:rPr>
+          <w:rFonts w:asciiTheme="majorBidi" w:hAnsiTheme="majorBidi" w:cstheme="majorBidi"/>
+          <w:color w:val="000000" w:themeColor="text1"/>
           <w:lang w:val="en-GB"/>
         </w:rPr>
         <w:t xml:space="preserve"> and uses an </w:t>
@@ -1975,8 +2426,10 @@
       <w:proofErr w:type="spellStart"/>
       <w:r>
         <w:rPr>
+          <w:rFonts w:asciiTheme="majorBidi" w:hAnsiTheme="majorBidi" w:cstheme="majorBidi"/>
           <w:i/>
           <w:iCs/>
+          <w:color w:val="000000" w:themeColor="text1"/>
           <w:lang w:val="en-GB"/>
         </w:rPr>
         <w:t>admin_id</w:t>
@@ -1984,6 +2437,8 @@
       <w:proofErr w:type="spellEnd"/>
       <w:r>
         <w:rPr>
+          <w:rFonts w:asciiTheme="majorBidi" w:hAnsiTheme="majorBidi" w:cstheme="majorBidi"/>
+          <w:color w:val="000000" w:themeColor="text1"/>
           <w:lang w:val="en-GB"/>
         </w:rPr>
         <w:t xml:space="preserve"> to identify who made approved the payment.</w:t>
@@ -1992,10 +2447,17 @@
     <w:p>
       <w:pPr>
         <w:keepNext/>
-      </w:pPr>
-      <w:r>
-        <w:rPr>
+        <w:contextualSpacing/>
+        <w:rPr>
+          <w:rFonts w:asciiTheme="majorBidi" w:hAnsiTheme="majorBidi" w:cstheme="majorBidi"/>
+          <w:color w:val="000000" w:themeColor="text1"/>
+        </w:rPr>
+      </w:pPr>
+      <w:r>
+        <w:rPr>
+          <w:rFonts w:asciiTheme="majorBidi" w:hAnsiTheme="majorBidi" w:cstheme="majorBidi"/>
           <w:noProof/>
+          <w:color w:val="000000" w:themeColor="text1"/>
           <w:lang w:val="en-GB"/>
         </w:rPr>
         <w:lastRenderedPageBreak/>
@@ -2015,7 +2477,7 @@
                     <pic:cNvPicPr/>
                   </pic:nvPicPr>
                   <pic:blipFill>
-                    <a:blip r:embed="rId9">
+                    <a:blip r:embed="rId11">
                       <a:extLst>
                         <a:ext uri="{28A0092B-C50C-407E-A947-70E740481C1C}">
                           <a14:useLocalDpi xmlns:a14="http://schemas.microsoft.com/office/drawing/2010/main" val="0"/>
@@ -2045,23 +2507,61 @@
     <w:p>
       <w:pPr>
         <w:pStyle w:val="Caption"/>
-        <w:rPr>
-          <w:lang w:val="en-GB"/>
-        </w:rPr>
-      </w:pPr>
-      <w:r>
+        <w:contextualSpacing/>
+        <w:rPr>
+          <w:rFonts w:asciiTheme="majorBidi" w:hAnsiTheme="majorBidi" w:cstheme="majorBidi"/>
+          <w:color w:val="000000" w:themeColor="text1"/>
+          <w:lang w:val="en-GB"/>
+        </w:rPr>
+      </w:pPr>
+      <w:r>
+        <w:rPr>
+          <w:rFonts w:asciiTheme="majorBidi" w:hAnsiTheme="majorBidi" w:cstheme="majorBidi"/>
+          <w:color w:val="000000" w:themeColor="text1"/>
+        </w:rPr>
         <w:t xml:space="preserve">Figure </w:t>
       </w:r>
-      <w:fldSimple w:instr=" SEQ Figure \* ARABIC ">
-        <w:r>
-          <w:rPr>
-            <w:noProof/>
-          </w:rPr>
-          <w:t>4</w:t>
-        </w:r>
-      </w:fldSimple>
-      <w:r>
-        <w:rPr>
+      <w:r>
+        <w:rPr>
+          <w:rFonts w:asciiTheme="majorBidi" w:hAnsiTheme="majorBidi" w:cstheme="majorBidi"/>
+          <w:color w:val="000000" w:themeColor="text1"/>
+        </w:rPr>
+        <w:fldChar w:fldCharType="begin"/>
+      </w:r>
+      <w:r>
+        <w:rPr>
+          <w:rFonts w:asciiTheme="majorBidi" w:hAnsiTheme="majorBidi" w:cstheme="majorBidi"/>
+          <w:color w:val="000000" w:themeColor="text1"/>
+        </w:rPr>
+        <w:instrText xml:space="preserve"> SEQ Figure \* ARABIC </w:instrText>
+      </w:r>
+      <w:r>
+        <w:rPr>
+          <w:rFonts w:asciiTheme="majorBidi" w:hAnsiTheme="majorBidi" w:cstheme="majorBidi"/>
+          <w:color w:val="000000" w:themeColor="text1"/>
+        </w:rPr>
+        <w:fldChar w:fldCharType="separate"/>
+      </w:r>
+      <w:r>
+        <w:rPr>
+          <w:rFonts w:asciiTheme="majorBidi" w:hAnsiTheme="majorBidi" w:cstheme="majorBidi"/>
+          <w:noProof/>
+          <w:color w:val="000000" w:themeColor="text1"/>
+        </w:rPr>
+        <w:t>4</w:t>
+      </w:r>
+      <w:r>
+        <w:rPr>
+          <w:rFonts w:asciiTheme="majorBidi" w:hAnsiTheme="majorBidi" w:cstheme="majorBidi"/>
+          <w:noProof/>
+          <w:color w:val="000000" w:themeColor="text1"/>
+        </w:rPr>
+        <w:fldChar w:fldCharType="end"/>
+      </w:r>
+      <w:r>
+        <w:rPr>
+          <w:rFonts w:asciiTheme="majorBidi" w:hAnsiTheme="majorBidi" w:cstheme="majorBidi"/>
+          <w:color w:val="000000" w:themeColor="text1"/>
           <w:lang w:val="en-GB"/>
         </w:rPr>
         <w:t>:ER diagram</w:t>
@@ -2069,12 +2569,18 @@
     </w:p>
     <w:p>
       <w:pPr>
-        <w:rPr>
-          <w:lang w:val="en-GB"/>
-        </w:rPr>
-      </w:pPr>
-      <w:r>
-        <w:rPr>
+        <w:pStyle w:val="Heading2"/>
+        <w:contextualSpacing/>
+        <w:rPr>
+          <w:rFonts w:asciiTheme="majorBidi" w:hAnsiTheme="majorBidi"/>
+          <w:color w:val="000000" w:themeColor="text1"/>
+          <w:lang w:val="en-GB"/>
+        </w:rPr>
+      </w:pPr>
+      <w:r>
+        <w:rPr>
+          <w:rFonts w:asciiTheme="majorBidi" w:hAnsiTheme="majorBidi"/>
+          <w:color w:val="000000" w:themeColor="text1"/>
           <w:lang w:val="en-GB"/>
         </w:rPr>
         <w:t>2.5 DB Schema</w:t>
@@ -2082,12 +2588,17 @@
     </w:p>
     <w:p>
       <w:pPr>
-        <w:rPr>
-          <w:lang w:val="en-GB"/>
-        </w:rPr>
-      </w:pPr>
-      <w:r>
-        <w:rPr>
+        <w:contextualSpacing/>
+        <w:rPr>
+          <w:rFonts w:asciiTheme="majorBidi" w:hAnsiTheme="majorBidi" w:cstheme="majorBidi"/>
+          <w:color w:val="000000" w:themeColor="text1"/>
+          <w:lang w:val="en-GB"/>
+        </w:rPr>
+      </w:pPr>
+      <w:r>
+        <w:rPr>
+          <w:rFonts w:asciiTheme="majorBidi" w:hAnsiTheme="majorBidi" w:cstheme="majorBidi"/>
+          <w:color w:val="000000" w:themeColor="text1"/>
           <w:lang w:val="en-GB"/>
         </w:rPr>
         <w:t xml:space="preserve">The group decided to use </w:t>
@@ -2095,6 +2606,8 @@
       <w:proofErr w:type="spellStart"/>
       <w:r>
         <w:rPr>
+          <w:rFonts w:asciiTheme="majorBidi" w:hAnsiTheme="majorBidi" w:cstheme="majorBidi"/>
+          <w:color w:val="000000" w:themeColor="text1"/>
           <w:lang w:val="en-GB"/>
         </w:rPr>
         <w:t>postgresql</w:t>
@@ -2102,13 +2615,17 @@
       <w:proofErr w:type="spellEnd"/>
       <w:r>
         <w:rPr>
-          <w:lang w:val="en-GB"/>
-        </w:rPr>
-        <w:t xml:space="preserve"> as for the database part of the project. The figure below is the </w:t>
+          <w:rFonts w:asciiTheme="majorBidi" w:hAnsiTheme="majorBidi" w:cstheme="majorBidi"/>
+          <w:color w:val="000000" w:themeColor="text1"/>
+          <w:lang w:val="en-GB"/>
+        </w:rPr>
+        <w:t xml:space="preserve"> for the database part of the project. The figure below is the </w:t>
       </w:r>
       <w:proofErr w:type="spellStart"/>
       <w:r>
         <w:rPr>
+          <w:rFonts w:asciiTheme="majorBidi" w:hAnsiTheme="majorBidi" w:cstheme="majorBidi"/>
+          <w:color w:val="000000" w:themeColor="text1"/>
           <w:lang w:val="en-GB"/>
         </w:rPr>
         <w:t>db</w:t>
@@ -2116,6 +2633,8 @@
       <w:proofErr w:type="spellEnd"/>
       <w:r>
         <w:rPr>
+          <w:rFonts w:asciiTheme="majorBidi" w:hAnsiTheme="majorBidi" w:cstheme="majorBidi"/>
+          <w:color w:val="000000" w:themeColor="text1"/>
           <w:lang w:val="en-GB"/>
         </w:rPr>
         <w:t xml:space="preserve"> schema we came up with</w:t>
@@ -2124,18 +2643,24 @@
     <w:p>
       <w:pPr>
         <w:keepNext/>
-      </w:pPr>
-      <w:r>
-        <w:rPr>
+        <w:contextualSpacing/>
+        <w:rPr>
+          <w:rFonts w:asciiTheme="majorBidi" w:hAnsiTheme="majorBidi" w:cstheme="majorBidi"/>
+          <w:color w:val="000000" w:themeColor="text1"/>
+        </w:rPr>
+      </w:pPr>
+      <w:r>
+        <w:rPr>
+          <w:rFonts w:asciiTheme="majorBidi" w:hAnsiTheme="majorBidi" w:cstheme="majorBidi"/>
           <w:noProof/>
-          <w:lang w:val="en-GB"/>
+          <w:color w:val="000000" w:themeColor="text1"/>
         </w:rPr>
         <w:lastRenderedPageBreak/>
         <w:drawing>
-          <wp:inline distT="0" distB="0" distL="0" distR="0" wp14:anchorId="112E9ABC" wp14:editId="794B1CF6">
-            <wp:extent cx="6093207" cy="4867275"/>
-            <wp:effectExtent l="0" t="0" r="3175" b="0"/>
-            <wp:docPr id="166681712" name="Picture 5"/>
+          <wp:inline distT="0" distB="0" distL="0" distR="0" wp14:anchorId="768608C8" wp14:editId="674CD0C1">
+            <wp:extent cx="5731510" cy="4587875"/>
+            <wp:effectExtent l="0" t="0" r="2540" b="3175"/>
+            <wp:docPr id="2128703521" name="Picture 2"/>
             <wp:cNvGraphicFramePr>
               <a:graphicFrameLocks xmlns:a="http://schemas.openxmlformats.org/drawingml/2006/main" noChangeAspect="1"/>
             </wp:cNvGraphicFramePr>
@@ -2143,11 +2668,11 @@
               <a:graphicData uri="http://schemas.openxmlformats.org/drawingml/2006/picture">
                 <pic:pic xmlns:pic="http://schemas.openxmlformats.org/drawingml/2006/picture">
                   <pic:nvPicPr>
-                    <pic:cNvPr id="166681712" name="Picture 166681712"/>
+                    <pic:cNvPr id="2128703521" name="Picture 2128703521"/>
                     <pic:cNvPicPr/>
                   </pic:nvPicPr>
                   <pic:blipFill>
-                    <a:blip r:embed="rId10" cstate="print">
+                    <a:blip r:embed="rId12" cstate="print">
                       <a:extLst>
                         <a:ext uri="{28A0092B-C50C-407E-A947-70E740481C1C}">
                           <a14:useLocalDpi xmlns:a14="http://schemas.microsoft.com/office/drawing/2010/main" val="0"/>
@@ -2161,7 +2686,7 @@
                   <pic:spPr>
                     <a:xfrm>
                       <a:off x="0" y="0"/>
-                      <a:ext cx="6096890" cy="4870217"/>
+                      <a:ext cx="5731510" cy="4587875"/>
                     </a:xfrm>
                     <a:prstGeom prst="rect">
                       <a:avLst/>
@@ -2177,23 +2702,61 @@
     <w:p>
       <w:pPr>
         <w:pStyle w:val="Caption"/>
-        <w:rPr>
-          <w:lang w:val="en-GB"/>
-        </w:rPr>
-      </w:pPr>
-      <w:r>
+        <w:contextualSpacing/>
+        <w:rPr>
+          <w:rFonts w:asciiTheme="majorBidi" w:hAnsiTheme="majorBidi" w:cstheme="majorBidi"/>
+          <w:color w:val="000000" w:themeColor="text1"/>
+          <w:lang w:val="en-GB"/>
+        </w:rPr>
+      </w:pPr>
+      <w:r>
+        <w:rPr>
+          <w:rFonts w:asciiTheme="majorBidi" w:hAnsiTheme="majorBidi" w:cstheme="majorBidi"/>
+          <w:color w:val="000000" w:themeColor="text1"/>
+        </w:rPr>
         <w:t xml:space="preserve">Figure </w:t>
       </w:r>
-      <w:fldSimple w:instr=" SEQ Figure \* ARABIC ">
-        <w:r>
-          <w:rPr>
-            <w:noProof/>
-          </w:rPr>
-          <w:t>5</w:t>
-        </w:r>
-      </w:fldSimple>
-      <w:r>
-        <w:rPr>
+      <w:r>
+        <w:rPr>
+          <w:rFonts w:asciiTheme="majorBidi" w:hAnsiTheme="majorBidi" w:cstheme="majorBidi"/>
+          <w:color w:val="000000" w:themeColor="text1"/>
+        </w:rPr>
+        <w:fldChar w:fldCharType="begin"/>
+      </w:r>
+      <w:r>
+        <w:rPr>
+          <w:rFonts w:asciiTheme="majorBidi" w:hAnsiTheme="majorBidi" w:cstheme="majorBidi"/>
+          <w:color w:val="000000" w:themeColor="text1"/>
+        </w:rPr>
+        <w:instrText xml:space="preserve"> SEQ Figure \* ARABIC </w:instrText>
+      </w:r>
+      <w:r>
+        <w:rPr>
+          <w:rFonts w:asciiTheme="majorBidi" w:hAnsiTheme="majorBidi" w:cstheme="majorBidi"/>
+          <w:color w:val="000000" w:themeColor="text1"/>
+        </w:rPr>
+        <w:fldChar w:fldCharType="separate"/>
+      </w:r>
+      <w:r>
+        <w:rPr>
+          <w:rFonts w:asciiTheme="majorBidi" w:hAnsiTheme="majorBidi" w:cstheme="majorBidi"/>
+          <w:noProof/>
+          <w:color w:val="000000" w:themeColor="text1"/>
+        </w:rPr>
+        <w:t>5</w:t>
+      </w:r>
+      <w:r>
+        <w:rPr>
+          <w:rFonts w:asciiTheme="majorBidi" w:hAnsiTheme="majorBidi" w:cstheme="majorBidi"/>
+          <w:noProof/>
+          <w:color w:val="000000" w:themeColor="text1"/>
+        </w:rPr>
+        <w:fldChar w:fldCharType="end"/>
+      </w:r>
+      <w:r>
+        <w:rPr>
+          <w:rFonts w:asciiTheme="majorBidi" w:hAnsiTheme="majorBidi" w:cstheme="majorBidi"/>
+          <w:color w:val="000000" w:themeColor="text1"/>
           <w:lang w:val="en-GB"/>
         </w:rPr>
         <w:t>:DB Schema</w:t>
@@ -2201,19 +2764,36 @@
     </w:p>
     <w:p>
       <w:pPr>
-        <w:rPr>
-          <w:lang w:val="en-GB"/>
-        </w:rPr>
-      </w:pPr>
-      <w:r>
-        <w:rPr>
-          <w:lang w:val="en-GB"/>
-        </w:rPr>
+        <w:contextualSpacing/>
+        <w:rPr>
+          <w:lang w:val="en-GB"/>
+        </w:rPr>
+      </w:pPr>
+    </w:p>
+    <w:p>
+      <w:pPr>
+        <w:pStyle w:val="Heading2"/>
+        <w:contextualSpacing/>
+        <w:rPr>
+          <w:rFonts w:asciiTheme="majorBidi" w:hAnsiTheme="majorBidi"/>
+          <w:color w:val="000000" w:themeColor="text1"/>
+          <w:lang w:val="en-GB"/>
+        </w:rPr>
+      </w:pPr>
+      <w:r>
+        <w:rPr>
+          <w:rFonts w:asciiTheme="majorBidi" w:hAnsiTheme="majorBidi"/>
+          <w:color w:val="000000" w:themeColor="text1"/>
+          <w:lang w:val="en-GB"/>
+        </w:rPr>
+        <w:lastRenderedPageBreak/>
         <w:t xml:space="preserve">2.6 UI </w:t>
       </w:r>
       <w:proofErr w:type="spellStart"/>
       <w:r>
         <w:rPr>
+          <w:rFonts w:asciiTheme="majorBidi" w:hAnsiTheme="majorBidi"/>
+          <w:color w:val="000000" w:themeColor="text1"/>
           <w:lang w:val="en-GB"/>
         </w:rPr>
         <w:t>Mockup</w:t>
@@ -2221,6 +2801,8 @@
       <w:proofErr w:type="spellEnd"/>
       <w:r>
         <w:rPr>
+          <w:rFonts w:asciiTheme="majorBidi" w:hAnsiTheme="majorBidi"/>
+          <w:color w:val="000000" w:themeColor="text1"/>
           <w:lang w:val="en-GB"/>
         </w:rPr>
         <w:t>-Wireframes</w:t>
@@ -2228,12 +2810,18 @@
     </w:p>
     <w:p>
       <w:pPr>
-        <w:rPr>
-          <w:lang w:val="en-GB"/>
-        </w:rPr>
-      </w:pPr>
-      <w:r>
-        <w:rPr>
+        <w:pStyle w:val="Heading3"/>
+        <w:contextualSpacing/>
+        <w:rPr>
+          <w:rFonts w:asciiTheme="majorBidi" w:hAnsiTheme="majorBidi"/>
+          <w:color w:val="000000" w:themeColor="text1"/>
+          <w:lang w:val="en-GB"/>
+        </w:rPr>
+      </w:pPr>
+      <w:r>
+        <w:rPr>
+          <w:rFonts w:asciiTheme="majorBidi" w:hAnsiTheme="majorBidi"/>
+          <w:color w:val="000000" w:themeColor="text1"/>
           <w:lang w:val="en-GB"/>
         </w:rPr>
         <w:t>2.6.1 Login, Register and Help Pages</w:t>
@@ -2242,13 +2830,19 @@
     <w:p>
       <w:pPr>
         <w:keepNext/>
-      </w:pPr>
-      <w:r>
-        <w:rPr>
+        <w:contextualSpacing/>
+        <w:rPr>
+          <w:rFonts w:asciiTheme="majorBidi" w:hAnsiTheme="majorBidi" w:cstheme="majorBidi"/>
+          <w:color w:val="000000" w:themeColor="text1"/>
+        </w:rPr>
+      </w:pPr>
+      <w:r>
+        <w:rPr>
+          <w:rFonts w:asciiTheme="majorBidi" w:hAnsiTheme="majorBidi" w:cstheme="majorBidi"/>
           <w:noProof/>
-          <w:lang w:val="en-GB"/>
-        </w:rPr>
-        <w:lastRenderedPageBreak/>
+          <w:color w:val="000000" w:themeColor="text1"/>
+          <w:lang w:val="en-GB"/>
+        </w:rPr>
         <w:drawing>
           <wp:inline distT="0" distB="0" distL="0" distR="0" wp14:anchorId="632BCA54" wp14:editId="517B5739">
             <wp:extent cx="5731510" cy="3690620"/>
@@ -2265,7 +2859,7 @@
                     <pic:cNvPicPr/>
                   </pic:nvPicPr>
                   <pic:blipFill>
-                    <a:blip r:embed="rId11" cstate="print">
+                    <a:blip r:embed="rId13" cstate="print">
                       <a:extLst>
                         <a:ext uri="{28A0092B-C50C-407E-A947-70E740481C1C}">
                           <a14:useLocalDpi xmlns:a14="http://schemas.microsoft.com/office/drawing/2010/main" val="0"/>
@@ -2295,62 +2889,116 @@
     <w:p>
       <w:pPr>
         <w:pStyle w:val="Caption"/>
-        <w:rPr>
-          <w:lang w:val="en-GB"/>
-        </w:rPr>
-      </w:pPr>
-      <w:r>
+        <w:contextualSpacing/>
+        <w:rPr>
+          <w:rFonts w:asciiTheme="majorBidi" w:hAnsiTheme="majorBidi" w:cstheme="majorBidi"/>
+          <w:color w:val="000000" w:themeColor="text1"/>
+          <w:lang w:val="en-GB"/>
+        </w:rPr>
+      </w:pPr>
+      <w:r>
+        <w:rPr>
+          <w:rFonts w:asciiTheme="majorBidi" w:hAnsiTheme="majorBidi" w:cstheme="majorBidi"/>
+          <w:color w:val="000000" w:themeColor="text1"/>
+        </w:rPr>
         <w:t xml:space="preserve">Figure </w:t>
       </w:r>
-      <w:fldSimple w:instr=" SEQ Figure \* ARABIC ">
-        <w:r>
-          <w:rPr>
-            <w:noProof/>
-          </w:rPr>
-          <w:t>6</w:t>
-        </w:r>
-      </w:fldSimple>
-      <w:r>
-        <w:rPr>
-          <w:lang w:val="en-GB"/>
-        </w:rPr>
-        <w:t>:Login</w:t>
-      </w:r>
-      <w:proofErr w:type="gramStart"/>
-      <w:r>
-        <w:rPr>
-          <w:lang w:val="en-GB"/>
-        </w:rPr>
-        <w:t xml:space="preserve"> ,Register</w:t>
-      </w:r>
-      <w:proofErr w:type="gramEnd"/>
-      <w:r>
-        <w:rPr>
-          <w:lang w:val="en-GB"/>
-        </w:rPr>
-        <w:t xml:space="preserve"> and Help Page Wireframe</w:t>
-      </w:r>
-    </w:p>
-    <w:p>
-      <w:pPr>
-        <w:rPr>
-          <w:lang w:val="en-GB"/>
-        </w:rPr>
-      </w:pPr>
-      <w:r>
-        <w:rPr>
-          <w:lang w:val="en-GB"/>
-        </w:rPr>
+      <w:r>
+        <w:rPr>
+          <w:rFonts w:asciiTheme="majorBidi" w:hAnsiTheme="majorBidi" w:cstheme="majorBidi"/>
+          <w:color w:val="000000" w:themeColor="text1"/>
+        </w:rPr>
+        <w:fldChar w:fldCharType="begin"/>
+      </w:r>
+      <w:r>
+        <w:rPr>
+          <w:rFonts w:asciiTheme="majorBidi" w:hAnsiTheme="majorBidi" w:cstheme="majorBidi"/>
+          <w:color w:val="000000" w:themeColor="text1"/>
+        </w:rPr>
+        <w:instrText xml:space="preserve"> SEQ Figure \* ARABIC </w:instrText>
+      </w:r>
+      <w:r>
+        <w:rPr>
+          <w:rFonts w:asciiTheme="majorBidi" w:hAnsiTheme="majorBidi" w:cstheme="majorBidi"/>
+          <w:color w:val="000000" w:themeColor="text1"/>
+        </w:rPr>
+        <w:fldChar w:fldCharType="separate"/>
+      </w:r>
+      <w:r>
+        <w:rPr>
+          <w:rFonts w:asciiTheme="majorBidi" w:hAnsiTheme="majorBidi" w:cstheme="majorBidi"/>
+          <w:noProof/>
+          <w:color w:val="000000" w:themeColor="text1"/>
+        </w:rPr>
+        <w:t>6</w:t>
+      </w:r>
+      <w:r>
+        <w:rPr>
+          <w:rFonts w:asciiTheme="majorBidi" w:hAnsiTheme="majorBidi" w:cstheme="majorBidi"/>
+          <w:noProof/>
+          <w:color w:val="000000" w:themeColor="text1"/>
+        </w:rPr>
+        <w:fldChar w:fldCharType="end"/>
+      </w:r>
+      <w:r>
+        <w:rPr>
+          <w:rFonts w:asciiTheme="majorBidi" w:hAnsiTheme="majorBidi" w:cstheme="majorBidi"/>
+          <w:color w:val="000000" w:themeColor="text1"/>
+          <w:lang w:val="en-GB"/>
+        </w:rPr>
+        <w:t>:Login ,</w:t>
+      </w:r>
+      <w:r>
+        <w:rPr>
+          <w:rFonts w:asciiTheme="majorBidi" w:hAnsiTheme="majorBidi" w:cstheme="majorBidi"/>
+          <w:color w:val="000000" w:themeColor="text1"/>
+          <w:lang w:val="en-GB"/>
+        </w:rPr>
+        <w:t xml:space="preserve"> </w:t>
+      </w:r>
+      <w:r>
+        <w:rPr>
+          <w:rFonts w:asciiTheme="majorBidi" w:hAnsiTheme="majorBidi" w:cstheme="majorBidi"/>
+          <w:color w:val="000000" w:themeColor="text1"/>
+          <w:lang w:val="en-GB"/>
+        </w:rPr>
+        <w:t>Register and Help Page Wireframe</w:t>
+      </w:r>
+    </w:p>
+    <w:p>
+      <w:pPr>
+        <w:pStyle w:val="Heading3"/>
+        <w:contextualSpacing/>
+        <w:rPr>
+          <w:rFonts w:asciiTheme="majorBidi" w:hAnsiTheme="majorBidi"/>
+          <w:color w:val="000000" w:themeColor="text1"/>
+          <w:lang w:val="en-GB"/>
+        </w:rPr>
+      </w:pPr>
+      <w:r>
+        <w:rPr>
+          <w:rFonts w:asciiTheme="majorBidi" w:hAnsiTheme="majorBidi"/>
+          <w:color w:val="000000" w:themeColor="text1"/>
+          <w:lang w:val="en-GB"/>
+        </w:rPr>
+        <w:lastRenderedPageBreak/>
         <w:t>2.6.2 Farmer Page</w:t>
       </w:r>
     </w:p>
     <w:p>
       <w:pPr>
         <w:keepNext/>
-      </w:pPr>
-      <w:r>
-        <w:rPr>
+        <w:contextualSpacing/>
+        <w:rPr>
+          <w:rFonts w:asciiTheme="majorBidi" w:hAnsiTheme="majorBidi" w:cstheme="majorBidi"/>
+          <w:color w:val="000000" w:themeColor="text1"/>
+        </w:rPr>
+      </w:pPr>
+      <w:r>
+        <w:rPr>
+          <w:rFonts w:asciiTheme="majorBidi" w:hAnsiTheme="majorBidi" w:cstheme="majorBidi"/>
           <w:noProof/>
+          <w:color w:val="000000" w:themeColor="text1"/>
           <w:lang w:val="en-GB"/>
         </w:rPr>
         <w:drawing>
@@ -2366,188 +3014,6 @@
                 <pic:pic xmlns:pic="http://schemas.openxmlformats.org/drawingml/2006/picture">
                   <pic:nvPicPr>
                     <pic:cNvPr id="851917148" name="Picture 851917148"/>
-                    <pic:cNvPicPr/>
-                  </pic:nvPicPr>
-                  <pic:blipFill>
-                    <a:blip r:embed="rId12" cstate="print">
-                      <a:extLst>
-                        <a:ext uri="{28A0092B-C50C-407E-A947-70E740481C1C}">
-                          <a14:useLocalDpi xmlns:a14="http://schemas.microsoft.com/office/drawing/2010/main" val="0"/>
-                        </a:ext>
-                      </a:extLst>
-                    </a:blip>
-                    <a:stretch>
-                      <a:fillRect/>
-                    </a:stretch>
-                  </pic:blipFill>
-                  <pic:spPr>
-                    <a:xfrm>
-                      <a:off x="0" y="0"/>
-                      <a:ext cx="5731510" cy="4024630"/>
-                    </a:xfrm>
-                    <a:prstGeom prst="rect">
-                      <a:avLst/>
-                    </a:prstGeom>
-                  </pic:spPr>
-                </pic:pic>
-              </a:graphicData>
-            </a:graphic>
-          </wp:inline>
-        </w:drawing>
-      </w:r>
-    </w:p>
-    <w:p>
-      <w:pPr>
-        <w:pStyle w:val="Caption"/>
-        <w:rPr>
-          <w:lang w:val="en-GB"/>
-        </w:rPr>
-      </w:pPr>
-      <w:r>
-        <w:t xml:space="preserve">Figure </w:t>
-      </w:r>
-      <w:fldSimple w:instr=" SEQ Figure \* ARABIC ">
-        <w:r>
-          <w:rPr>
-            <w:noProof/>
-          </w:rPr>
-          <w:t>7</w:t>
-        </w:r>
-      </w:fldSimple>
-      <w:r>
-        <w:rPr>
-          <w:lang w:val="en-GB"/>
-        </w:rPr>
-        <w:t>:Farmer Dashboard Wireframe</w:t>
-      </w:r>
-    </w:p>
-    <w:p>
-      <w:pPr>
-        <w:rPr>
-          <w:lang w:val="en-GB"/>
-        </w:rPr>
-      </w:pPr>
-      <w:r>
-        <w:rPr>
-          <w:lang w:val="en-GB"/>
-        </w:rPr>
-        <w:lastRenderedPageBreak/>
-        <w:t>2.6.3 Grader Page</w:t>
-      </w:r>
-    </w:p>
-    <w:p>
-      <w:pPr>
-        <w:keepNext/>
-      </w:pPr>
-      <w:r>
-        <w:rPr>
-          <w:noProof/>
-          <w:lang w:val="en-GB"/>
-        </w:rPr>
-        <w:drawing>
-          <wp:inline distT="0" distB="0" distL="0" distR="0" wp14:anchorId="4BA7890A" wp14:editId="655AB168">
-            <wp:extent cx="5731510" cy="4024630"/>
-            <wp:effectExtent l="0" t="0" r="2540" b="0"/>
-            <wp:docPr id="1995454567" name="Picture 8"/>
-            <wp:cNvGraphicFramePr>
-              <a:graphicFrameLocks xmlns:a="http://schemas.openxmlformats.org/drawingml/2006/main" noChangeAspect="1"/>
-            </wp:cNvGraphicFramePr>
-            <a:graphic xmlns:a="http://schemas.openxmlformats.org/drawingml/2006/main">
-              <a:graphicData uri="http://schemas.openxmlformats.org/drawingml/2006/picture">
-                <pic:pic xmlns:pic="http://schemas.openxmlformats.org/drawingml/2006/picture">
-                  <pic:nvPicPr>
-                    <pic:cNvPr id="1995454567" name="Picture 1995454567"/>
-                    <pic:cNvPicPr/>
-                  </pic:nvPicPr>
-                  <pic:blipFill>
-                    <a:blip r:embed="rId13" cstate="print">
-                      <a:extLst>
-                        <a:ext uri="{28A0092B-C50C-407E-A947-70E740481C1C}">
-                          <a14:useLocalDpi xmlns:a14="http://schemas.microsoft.com/office/drawing/2010/main" val="0"/>
-                        </a:ext>
-                      </a:extLst>
-                    </a:blip>
-                    <a:stretch>
-                      <a:fillRect/>
-                    </a:stretch>
-                  </pic:blipFill>
-                  <pic:spPr>
-                    <a:xfrm>
-                      <a:off x="0" y="0"/>
-                      <a:ext cx="5731510" cy="4024630"/>
-                    </a:xfrm>
-                    <a:prstGeom prst="rect">
-                      <a:avLst/>
-                    </a:prstGeom>
-                  </pic:spPr>
-                </pic:pic>
-              </a:graphicData>
-            </a:graphic>
-          </wp:inline>
-        </w:drawing>
-      </w:r>
-    </w:p>
-    <w:p>
-      <w:pPr>
-        <w:pStyle w:val="Caption"/>
-        <w:rPr>
-          <w:lang w:val="en-GB"/>
-        </w:rPr>
-      </w:pPr>
-      <w:r>
-        <w:t xml:space="preserve">Figure </w:t>
-      </w:r>
-      <w:fldSimple w:instr=" SEQ Figure \* ARABIC ">
-        <w:r>
-          <w:rPr>
-            <w:noProof/>
-          </w:rPr>
-          <w:t>8</w:t>
-        </w:r>
-      </w:fldSimple>
-      <w:r>
-        <w:rPr>
-          <w:lang w:val="en-GB"/>
-        </w:rPr>
-        <w:t>:Grader Dashboard Wireframe</w:t>
-      </w:r>
-    </w:p>
-    <w:p>
-      <w:pPr>
-        <w:rPr>
-          <w:lang w:val="en-GB"/>
-        </w:rPr>
-      </w:pPr>
-      <w:r>
-        <w:rPr>
-          <w:lang w:val="en-GB"/>
-        </w:rPr>
-        <w:t>2.6.4 Admin Approval page</w:t>
-      </w:r>
-    </w:p>
-    <w:p>
-      <w:pPr>
-        <w:keepNext/>
-      </w:pPr>
-      <w:r>
-        <w:rPr>
-          <w:noProof/>
-          <w:lang w:val="en-GB"/>
-        </w:rPr>
-        <w:lastRenderedPageBreak/>
-        <w:drawing>
-          <wp:inline distT="0" distB="0" distL="0" distR="0" wp14:anchorId="3EACD548" wp14:editId="0C604C45">
-            <wp:extent cx="5731510" cy="4024630"/>
-            <wp:effectExtent l="0" t="0" r="2540" b="0"/>
-            <wp:docPr id="2066408993" name="Picture 9"/>
-            <wp:cNvGraphicFramePr>
-              <a:graphicFrameLocks xmlns:a="http://schemas.openxmlformats.org/drawingml/2006/main" noChangeAspect="1"/>
-            </wp:cNvGraphicFramePr>
-            <a:graphic xmlns:a="http://schemas.openxmlformats.org/drawingml/2006/main">
-              <a:graphicData uri="http://schemas.openxmlformats.org/drawingml/2006/picture">
-                <pic:pic xmlns:pic="http://schemas.openxmlformats.org/drawingml/2006/picture">
-                  <pic:nvPicPr>
-                    <pic:cNvPr id="2066408993" name="Picture 2066408993"/>
                     <pic:cNvPicPr/>
                   </pic:nvPicPr>
                   <pic:blipFill>
@@ -2581,62 +3047,107 @@
     <w:p>
       <w:pPr>
         <w:pStyle w:val="Caption"/>
-        <w:rPr>
-          <w:lang w:val="en-GB"/>
-        </w:rPr>
-      </w:pPr>
-      <w:r>
+        <w:contextualSpacing/>
+        <w:rPr>
+          <w:rFonts w:asciiTheme="majorBidi" w:hAnsiTheme="majorBidi" w:cstheme="majorBidi"/>
+          <w:color w:val="000000" w:themeColor="text1"/>
+          <w:lang w:val="en-GB"/>
+        </w:rPr>
+      </w:pPr>
+      <w:r>
+        <w:rPr>
+          <w:rFonts w:asciiTheme="majorBidi" w:hAnsiTheme="majorBidi" w:cstheme="majorBidi"/>
+          <w:color w:val="000000" w:themeColor="text1"/>
+        </w:rPr>
         <w:t xml:space="preserve">Figure </w:t>
       </w:r>
-      <w:fldSimple w:instr=" SEQ Figure \* ARABIC ">
-        <w:r>
-          <w:rPr>
-            <w:noProof/>
-          </w:rPr>
-          <w:t>9</w:t>
-        </w:r>
-      </w:fldSimple>
-      <w:r>
-        <w:rPr>
-          <w:lang w:val="en-GB"/>
-        </w:rPr>
-        <w:t>:Admin Approval Wireframe</w:t>
-      </w:r>
-    </w:p>
-    <w:p>
-      <w:pPr>
-        <w:rPr>
-          <w:lang w:val="en-GB"/>
-        </w:rPr>
-      </w:pPr>
-      <w:r>
-        <w:rPr>
-          <w:lang w:val="en-GB"/>
-        </w:rPr>
-        <w:t>2.6.5 Admin Reports</w:t>
-      </w:r>
-      <w:r>
-        <w:rPr>
-          <w:lang w:val="en-GB"/>
-        </w:rPr>
-        <w:t xml:space="preserve"> and Audit pages</w:t>
+      <w:r>
+        <w:rPr>
+          <w:rFonts w:asciiTheme="majorBidi" w:hAnsiTheme="majorBidi" w:cstheme="majorBidi"/>
+          <w:color w:val="000000" w:themeColor="text1"/>
+        </w:rPr>
+        <w:fldChar w:fldCharType="begin"/>
+      </w:r>
+      <w:r>
+        <w:rPr>
+          <w:rFonts w:asciiTheme="majorBidi" w:hAnsiTheme="majorBidi" w:cstheme="majorBidi"/>
+          <w:color w:val="000000" w:themeColor="text1"/>
+        </w:rPr>
+        <w:instrText xml:space="preserve"> SEQ Figure \* ARABIC </w:instrText>
+      </w:r>
+      <w:r>
+        <w:rPr>
+          <w:rFonts w:asciiTheme="majorBidi" w:hAnsiTheme="majorBidi" w:cstheme="majorBidi"/>
+          <w:color w:val="000000" w:themeColor="text1"/>
+        </w:rPr>
+        <w:fldChar w:fldCharType="separate"/>
+      </w:r>
+      <w:r>
+        <w:rPr>
+          <w:rFonts w:asciiTheme="majorBidi" w:hAnsiTheme="majorBidi" w:cstheme="majorBidi"/>
+          <w:noProof/>
+          <w:color w:val="000000" w:themeColor="text1"/>
+        </w:rPr>
+        <w:t>7</w:t>
+      </w:r>
+      <w:r>
+        <w:rPr>
+          <w:rFonts w:asciiTheme="majorBidi" w:hAnsiTheme="majorBidi" w:cstheme="majorBidi"/>
+          <w:noProof/>
+          <w:color w:val="000000" w:themeColor="text1"/>
+        </w:rPr>
+        <w:fldChar w:fldCharType="end"/>
+      </w:r>
+      <w:r>
+        <w:rPr>
+          <w:rFonts w:asciiTheme="majorBidi" w:hAnsiTheme="majorBidi" w:cstheme="majorBidi"/>
+          <w:color w:val="000000" w:themeColor="text1"/>
+          <w:lang w:val="en-GB"/>
+        </w:rPr>
+        <w:t>:Farmer Dashboard Wireframe</w:t>
+      </w:r>
+    </w:p>
+    <w:p>
+      <w:pPr>
+        <w:pStyle w:val="Heading3"/>
+        <w:contextualSpacing/>
+        <w:rPr>
+          <w:rFonts w:asciiTheme="majorBidi" w:hAnsiTheme="majorBidi"/>
+          <w:color w:val="000000" w:themeColor="text1"/>
+          <w:lang w:val="en-GB"/>
+        </w:rPr>
+      </w:pPr>
+      <w:r>
+        <w:rPr>
+          <w:rFonts w:asciiTheme="majorBidi" w:hAnsiTheme="majorBidi"/>
+          <w:color w:val="000000" w:themeColor="text1"/>
+          <w:lang w:val="en-GB"/>
+        </w:rPr>
+        <w:lastRenderedPageBreak/>
+        <w:t>2.6.3 Grader Page</w:t>
       </w:r>
     </w:p>
     <w:p>
       <w:pPr>
         <w:keepNext/>
-      </w:pPr>
-      <w:r>
-        <w:rPr>
+        <w:contextualSpacing/>
+        <w:rPr>
+          <w:rFonts w:asciiTheme="majorBidi" w:hAnsiTheme="majorBidi" w:cstheme="majorBidi"/>
+          <w:color w:val="000000" w:themeColor="text1"/>
+        </w:rPr>
+      </w:pPr>
+      <w:r>
+        <w:rPr>
+          <w:rFonts w:asciiTheme="majorBidi" w:hAnsiTheme="majorBidi" w:cstheme="majorBidi"/>
           <w:noProof/>
-          <w:lang w:val="en-GB"/>
-        </w:rPr>
-        <w:lastRenderedPageBreak/>
+          <w:color w:val="000000" w:themeColor="text1"/>
+          <w:lang w:val="en-GB"/>
+        </w:rPr>
         <w:drawing>
-          <wp:inline distT="0" distB="0" distL="0" distR="0" wp14:anchorId="0FD4D096" wp14:editId="4C80DA61">
+          <wp:inline distT="0" distB="0" distL="0" distR="0" wp14:anchorId="4BA7890A" wp14:editId="655AB168">
             <wp:extent cx="5731510" cy="4024630"/>
             <wp:effectExtent l="0" t="0" r="2540" b="0"/>
-            <wp:docPr id="1238149749" name="Picture 10"/>
+            <wp:docPr id="1995454567" name="Picture 8"/>
             <wp:cNvGraphicFramePr>
               <a:graphicFrameLocks xmlns:a="http://schemas.openxmlformats.org/drawingml/2006/main" noChangeAspect="1"/>
             </wp:cNvGraphicFramePr>
@@ -2644,7 +3155,7 @@
               <a:graphicData uri="http://schemas.openxmlformats.org/drawingml/2006/picture">
                 <pic:pic xmlns:pic="http://schemas.openxmlformats.org/drawingml/2006/picture">
                   <pic:nvPicPr>
-                    <pic:cNvPr id="1238149749" name="Picture 1238149749"/>
+                    <pic:cNvPr id="1995454567" name="Picture 1995454567"/>
                     <pic:cNvPicPr/>
                   </pic:nvPicPr>
                   <pic:blipFill>
@@ -2678,29 +3189,361 @@
     <w:p>
       <w:pPr>
         <w:pStyle w:val="Caption"/>
-        <w:rPr>
-          <w:lang w:val="en-GB"/>
-        </w:rPr>
-      </w:pPr>
-      <w:r>
+        <w:contextualSpacing/>
+        <w:rPr>
+          <w:rFonts w:asciiTheme="majorBidi" w:hAnsiTheme="majorBidi" w:cstheme="majorBidi"/>
+          <w:color w:val="000000" w:themeColor="text1"/>
+          <w:lang w:val="en-GB"/>
+        </w:rPr>
+      </w:pPr>
+      <w:r>
+        <w:rPr>
+          <w:rFonts w:asciiTheme="majorBidi" w:hAnsiTheme="majorBidi" w:cstheme="majorBidi"/>
+          <w:color w:val="000000" w:themeColor="text1"/>
+        </w:rPr>
         <w:t xml:space="preserve">Figure </w:t>
       </w:r>
-      <w:fldSimple w:instr=" SEQ Figure \* ARABIC ">
-        <w:r>
-          <w:rPr>
-            <w:noProof/>
-          </w:rPr>
-          <w:t>10</w:t>
-        </w:r>
-      </w:fldSimple>
-      <w:r>
-        <w:rPr>
+      <w:r>
+        <w:rPr>
+          <w:rFonts w:asciiTheme="majorBidi" w:hAnsiTheme="majorBidi" w:cstheme="majorBidi"/>
+          <w:color w:val="000000" w:themeColor="text1"/>
+        </w:rPr>
+        <w:fldChar w:fldCharType="begin"/>
+      </w:r>
+      <w:r>
+        <w:rPr>
+          <w:rFonts w:asciiTheme="majorBidi" w:hAnsiTheme="majorBidi" w:cstheme="majorBidi"/>
+          <w:color w:val="000000" w:themeColor="text1"/>
+        </w:rPr>
+        <w:instrText xml:space="preserve"> SEQ Figure \* ARABIC </w:instrText>
+      </w:r>
+      <w:r>
+        <w:rPr>
+          <w:rFonts w:asciiTheme="majorBidi" w:hAnsiTheme="majorBidi" w:cstheme="majorBidi"/>
+          <w:color w:val="000000" w:themeColor="text1"/>
+        </w:rPr>
+        <w:fldChar w:fldCharType="separate"/>
+      </w:r>
+      <w:r>
+        <w:rPr>
+          <w:rFonts w:asciiTheme="majorBidi" w:hAnsiTheme="majorBidi" w:cstheme="majorBidi"/>
+          <w:noProof/>
+          <w:color w:val="000000" w:themeColor="text1"/>
+        </w:rPr>
+        <w:t>8</w:t>
+      </w:r>
+      <w:r>
+        <w:rPr>
+          <w:rFonts w:asciiTheme="majorBidi" w:hAnsiTheme="majorBidi" w:cstheme="majorBidi"/>
+          <w:noProof/>
+          <w:color w:val="000000" w:themeColor="text1"/>
+        </w:rPr>
+        <w:fldChar w:fldCharType="end"/>
+      </w:r>
+      <w:r>
+        <w:rPr>
+          <w:rFonts w:asciiTheme="majorBidi" w:hAnsiTheme="majorBidi" w:cstheme="majorBidi"/>
+          <w:color w:val="000000" w:themeColor="text1"/>
+          <w:lang w:val="en-GB"/>
+        </w:rPr>
+        <w:t>:Grader Dashboard Wireframe</w:t>
+      </w:r>
+    </w:p>
+    <w:p>
+      <w:pPr>
+        <w:pStyle w:val="Heading3"/>
+        <w:contextualSpacing/>
+        <w:rPr>
+          <w:rFonts w:asciiTheme="majorBidi" w:hAnsiTheme="majorBidi"/>
+          <w:color w:val="000000" w:themeColor="text1"/>
+          <w:lang w:val="en-GB"/>
+        </w:rPr>
+      </w:pPr>
+      <w:r>
+        <w:rPr>
+          <w:rFonts w:asciiTheme="majorBidi" w:hAnsiTheme="majorBidi"/>
+          <w:color w:val="000000" w:themeColor="text1"/>
+          <w:lang w:val="en-GB"/>
+        </w:rPr>
+        <w:lastRenderedPageBreak/>
+        <w:t>2.6.4 Admin Approval page</w:t>
+      </w:r>
+    </w:p>
+    <w:p>
+      <w:pPr>
+        <w:keepNext/>
+        <w:contextualSpacing/>
+        <w:rPr>
+          <w:rFonts w:asciiTheme="majorBidi" w:hAnsiTheme="majorBidi" w:cstheme="majorBidi"/>
+          <w:color w:val="000000" w:themeColor="text1"/>
+        </w:rPr>
+      </w:pPr>
+      <w:r>
+        <w:rPr>
+          <w:rFonts w:asciiTheme="majorBidi" w:hAnsiTheme="majorBidi" w:cstheme="majorBidi"/>
+          <w:noProof/>
+          <w:color w:val="000000" w:themeColor="text1"/>
+          <w:lang w:val="en-GB"/>
+        </w:rPr>
+        <w:drawing>
+          <wp:inline distT="0" distB="0" distL="0" distR="0" wp14:anchorId="3EACD548" wp14:editId="0C604C45">
+            <wp:extent cx="5731510" cy="4024630"/>
+            <wp:effectExtent l="0" t="0" r="2540" b="0"/>
+            <wp:docPr id="2066408993" name="Picture 9"/>
+            <wp:cNvGraphicFramePr>
+              <a:graphicFrameLocks xmlns:a="http://schemas.openxmlformats.org/drawingml/2006/main" noChangeAspect="1"/>
+            </wp:cNvGraphicFramePr>
+            <a:graphic xmlns:a="http://schemas.openxmlformats.org/drawingml/2006/main">
+              <a:graphicData uri="http://schemas.openxmlformats.org/drawingml/2006/picture">
+                <pic:pic xmlns:pic="http://schemas.openxmlformats.org/drawingml/2006/picture">
+                  <pic:nvPicPr>
+                    <pic:cNvPr id="2066408993" name="Picture 2066408993"/>
+                    <pic:cNvPicPr/>
+                  </pic:nvPicPr>
+                  <pic:blipFill>
+                    <a:blip r:embed="rId16" cstate="print">
+                      <a:extLst>
+                        <a:ext uri="{28A0092B-C50C-407E-A947-70E740481C1C}">
+                          <a14:useLocalDpi xmlns:a14="http://schemas.microsoft.com/office/drawing/2010/main" val="0"/>
+                        </a:ext>
+                      </a:extLst>
+                    </a:blip>
+                    <a:stretch>
+                      <a:fillRect/>
+                    </a:stretch>
+                  </pic:blipFill>
+                  <pic:spPr>
+                    <a:xfrm>
+                      <a:off x="0" y="0"/>
+                      <a:ext cx="5731510" cy="4024630"/>
+                    </a:xfrm>
+                    <a:prstGeom prst="rect">
+                      <a:avLst/>
+                    </a:prstGeom>
+                  </pic:spPr>
+                </pic:pic>
+              </a:graphicData>
+            </a:graphic>
+          </wp:inline>
+        </w:drawing>
+      </w:r>
+    </w:p>
+    <w:p>
+      <w:pPr>
+        <w:pStyle w:val="Caption"/>
+        <w:contextualSpacing/>
+        <w:rPr>
+          <w:rFonts w:asciiTheme="majorBidi" w:hAnsiTheme="majorBidi" w:cstheme="majorBidi"/>
+          <w:color w:val="000000" w:themeColor="text1"/>
+          <w:lang w:val="en-GB"/>
+        </w:rPr>
+      </w:pPr>
+      <w:r>
+        <w:rPr>
+          <w:rFonts w:asciiTheme="majorBidi" w:hAnsiTheme="majorBidi" w:cstheme="majorBidi"/>
+          <w:color w:val="000000" w:themeColor="text1"/>
+        </w:rPr>
+        <w:t xml:space="preserve">Figure </w:t>
+      </w:r>
+      <w:r>
+        <w:rPr>
+          <w:rFonts w:asciiTheme="majorBidi" w:hAnsiTheme="majorBidi" w:cstheme="majorBidi"/>
+          <w:color w:val="000000" w:themeColor="text1"/>
+        </w:rPr>
+        <w:fldChar w:fldCharType="begin"/>
+      </w:r>
+      <w:r>
+        <w:rPr>
+          <w:rFonts w:asciiTheme="majorBidi" w:hAnsiTheme="majorBidi" w:cstheme="majorBidi"/>
+          <w:color w:val="000000" w:themeColor="text1"/>
+        </w:rPr>
+        <w:instrText xml:space="preserve"> SEQ Figure \* ARABIC </w:instrText>
+      </w:r>
+      <w:r>
+        <w:rPr>
+          <w:rFonts w:asciiTheme="majorBidi" w:hAnsiTheme="majorBidi" w:cstheme="majorBidi"/>
+          <w:color w:val="000000" w:themeColor="text1"/>
+        </w:rPr>
+        <w:fldChar w:fldCharType="separate"/>
+      </w:r>
+      <w:r>
+        <w:rPr>
+          <w:rFonts w:asciiTheme="majorBidi" w:hAnsiTheme="majorBidi" w:cstheme="majorBidi"/>
+          <w:noProof/>
+          <w:color w:val="000000" w:themeColor="text1"/>
+        </w:rPr>
+        <w:t>9</w:t>
+      </w:r>
+      <w:r>
+        <w:rPr>
+          <w:rFonts w:asciiTheme="majorBidi" w:hAnsiTheme="majorBidi" w:cstheme="majorBidi"/>
+          <w:noProof/>
+          <w:color w:val="000000" w:themeColor="text1"/>
+        </w:rPr>
+        <w:fldChar w:fldCharType="end"/>
+      </w:r>
+      <w:r>
+        <w:rPr>
+          <w:rFonts w:asciiTheme="majorBidi" w:hAnsiTheme="majorBidi" w:cstheme="majorBidi"/>
+          <w:color w:val="000000" w:themeColor="text1"/>
+          <w:lang w:val="en-GB"/>
+        </w:rPr>
+        <w:t>:Admin Approval Wireframe</w:t>
+      </w:r>
+    </w:p>
+    <w:p>
+      <w:pPr>
+        <w:pStyle w:val="Heading3"/>
+        <w:contextualSpacing/>
+        <w:rPr>
+          <w:rFonts w:asciiTheme="majorBidi" w:hAnsiTheme="majorBidi"/>
+          <w:color w:val="000000" w:themeColor="text1"/>
+          <w:lang w:val="en-GB"/>
+        </w:rPr>
+      </w:pPr>
+      <w:r>
+        <w:rPr>
+          <w:rFonts w:asciiTheme="majorBidi" w:hAnsiTheme="majorBidi"/>
+          <w:color w:val="000000" w:themeColor="text1"/>
+          <w:lang w:val="en-GB"/>
+        </w:rPr>
+        <w:lastRenderedPageBreak/>
+        <w:t>2.6.5 Admin Reports</w:t>
+      </w:r>
+      <w:r>
+        <w:rPr>
+          <w:rFonts w:asciiTheme="majorBidi" w:hAnsiTheme="majorBidi"/>
+          <w:color w:val="000000" w:themeColor="text1"/>
+          <w:lang w:val="en-GB"/>
+        </w:rPr>
+        <w:t xml:space="preserve"> and Audit pages</w:t>
+      </w:r>
+    </w:p>
+    <w:p>
+      <w:pPr>
+        <w:keepNext/>
+        <w:contextualSpacing/>
+        <w:rPr>
+          <w:rFonts w:asciiTheme="majorBidi" w:hAnsiTheme="majorBidi" w:cstheme="majorBidi"/>
+          <w:color w:val="000000" w:themeColor="text1"/>
+        </w:rPr>
+      </w:pPr>
+      <w:r>
+        <w:rPr>
+          <w:rFonts w:asciiTheme="majorBidi" w:hAnsiTheme="majorBidi" w:cstheme="majorBidi"/>
+          <w:noProof/>
+          <w:color w:val="000000" w:themeColor="text1"/>
+          <w:lang w:val="en-GB"/>
+        </w:rPr>
+        <w:drawing>
+          <wp:inline distT="0" distB="0" distL="0" distR="0" wp14:anchorId="0FD4D096" wp14:editId="4C80DA61">
+            <wp:extent cx="5731510" cy="4024630"/>
+            <wp:effectExtent l="0" t="0" r="2540" b="0"/>
+            <wp:docPr id="1238149749" name="Picture 10"/>
+            <wp:cNvGraphicFramePr>
+              <a:graphicFrameLocks xmlns:a="http://schemas.openxmlformats.org/drawingml/2006/main" noChangeAspect="1"/>
+            </wp:cNvGraphicFramePr>
+            <a:graphic xmlns:a="http://schemas.openxmlformats.org/drawingml/2006/main">
+              <a:graphicData uri="http://schemas.openxmlformats.org/drawingml/2006/picture">
+                <pic:pic xmlns:pic="http://schemas.openxmlformats.org/drawingml/2006/picture">
+                  <pic:nvPicPr>
+                    <pic:cNvPr id="1238149749" name="Picture 1238149749"/>
+                    <pic:cNvPicPr/>
+                  </pic:nvPicPr>
+                  <pic:blipFill>
+                    <a:blip r:embed="rId17" cstate="print">
+                      <a:extLst>
+                        <a:ext uri="{28A0092B-C50C-407E-A947-70E740481C1C}">
+                          <a14:useLocalDpi xmlns:a14="http://schemas.microsoft.com/office/drawing/2010/main" val="0"/>
+                        </a:ext>
+                      </a:extLst>
+                    </a:blip>
+                    <a:stretch>
+                      <a:fillRect/>
+                    </a:stretch>
+                  </pic:blipFill>
+                  <pic:spPr>
+                    <a:xfrm>
+                      <a:off x="0" y="0"/>
+                      <a:ext cx="5731510" cy="4024630"/>
+                    </a:xfrm>
+                    <a:prstGeom prst="rect">
+                      <a:avLst/>
+                    </a:prstGeom>
+                  </pic:spPr>
+                </pic:pic>
+              </a:graphicData>
+            </a:graphic>
+          </wp:inline>
+        </w:drawing>
+      </w:r>
+    </w:p>
+    <w:p>
+      <w:pPr>
+        <w:pStyle w:val="Caption"/>
+        <w:contextualSpacing/>
+        <w:rPr>
+          <w:rFonts w:asciiTheme="majorBidi" w:hAnsiTheme="majorBidi" w:cstheme="majorBidi"/>
+          <w:color w:val="000000" w:themeColor="text1"/>
+          <w:lang w:val="en-GB"/>
+        </w:rPr>
+      </w:pPr>
+      <w:r>
+        <w:rPr>
+          <w:rFonts w:asciiTheme="majorBidi" w:hAnsiTheme="majorBidi" w:cstheme="majorBidi"/>
+          <w:color w:val="000000" w:themeColor="text1"/>
+        </w:rPr>
+        <w:t xml:space="preserve">Figure </w:t>
+      </w:r>
+      <w:r>
+        <w:rPr>
+          <w:rFonts w:asciiTheme="majorBidi" w:hAnsiTheme="majorBidi" w:cstheme="majorBidi"/>
+          <w:color w:val="000000" w:themeColor="text1"/>
+        </w:rPr>
+        <w:fldChar w:fldCharType="begin"/>
+      </w:r>
+      <w:r>
+        <w:rPr>
+          <w:rFonts w:asciiTheme="majorBidi" w:hAnsiTheme="majorBidi" w:cstheme="majorBidi"/>
+          <w:color w:val="000000" w:themeColor="text1"/>
+        </w:rPr>
+        <w:instrText xml:space="preserve"> SEQ Figure \* ARABIC </w:instrText>
+      </w:r>
+      <w:r>
+        <w:rPr>
+          <w:rFonts w:asciiTheme="majorBidi" w:hAnsiTheme="majorBidi" w:cstheme="majorBidi"/>
+          <w:color w:val="000000" w:themeColor="text1"/>
+        </w:rPr>
+        <w:fldChar w:fldCharType="separate"/>
+      </w:r>
+      <w:r>
+        <w:rPr>
+          <w:rFonts w:asciiTheme="majorBidi" w:hAnsiTheme="majorBidi" w:cstheme="majorBidi"/>
+          <w:noProof/>
+          <w:color w:val="000000" w:themeColor="text1"/>
+        </w:rPr>
+        <w:t>10</w:t>
+      </w:r>
+      <w:r>
+        <w:rPr>
+          <w:rFonts w:asciiTheme="majorBidi" w:hAnsiTheme="majorBidi" w:cstheme="majorBidi"/>
+          <w:noProof/>
+          <w:color w:val="000000" w:themeColor="text1"/>
+        </w:rPr>
+        <w:fldChar w:fldCharType="end"/>
+      </w:r>
+      <w:r>
+        <w:rPr>
+          <w:rFonts w:asciiTheme="majorBidi" w:hAnsiTheme="majorBidi" w:cstheme="majorBidi"/>
+          <w:color w:val="000000" w:themeColor="text1"/>
           <w:lang w:val="en-GB"/>
         </w:rPr>
         <w:t>:Audit and Report Wireframe</w:t>
       </w:r>
       <w:r>
         <w:rPr>
+          <w:rFonts w:asciiTheme="majorBidi" w:hAnsiTheme="majorBidi" w:cstheme="majorBidi"/>
+          <w:color w:val="000000" w:themeColor="text1"/>
           <w:lang w:val="en-GB"/>
         </w:rPr>
         <w:br/>
@@ -2708,7 +3551,10 @@
     </w:p>
     <w:p>
       <w:pPr>
-        <w:rPr>
+        <w:contextualSpacing/>
+        <w:rPr>
+          <w:rFonts w:asciiTheme="majorBidi" w:hAnsiTheme="majorBidi" w:cstheme="majorBidi"/>
+          <w:color w:val="000000" w:themeColor="text1"/>
           <w:lang w:val="en-GB"/>
         </w:rPr>
       </w:pPr>
@@ -2721,6 +3567,56 @@
     </w:sectPr>
   </w:body>
 </w:document>
+</file>
+
+<file path=word/endnotes.xml><?xml version="1.0" encoding="utf-8"?>
+<w:endnotes xmlns:wpc="http://schemas.microsoft.com/office/word/2010/wordprocessingCanvas" xmlns:cx="http://schemas.microsoft.com/office/drawing/2014/chartex" xmlns:cx1="http://schemas.microsoft.com/office/drawing/2015/9/8/chartex" xmlns:cx2="http://schemas.microsoft.com/office/drawing/2015/10/21/chartex" xmlns:cx3="http://schemas.microsoft.com/office/drawing/2016/5/9/chartex" xmlns:cx4="http://schemas.microsoft.com/office/drawing/2016/5/10/chartex" xmlns:cx5="http://schemas.microsoft.com/office/drawing/2016/5/11/chartex" xmlns:cx6="http://schemas.microsoft.com/office/drawing/2016/5/12/chartex" xmlns:cx7="http://schemas.microsoft.com/office/drawing/2016/5/13/chartex" xmlns:cx8="http://schemas.microsoft.com/office/drawing/2016/5/14/chartex" xmlns:mc="http://schemas.openxmlformats.org/markup-compatibility/2006" xmlns:aink="http://schemas.microsoft.com/office/drawing/2016/ink" xmlns:am3d="http://schemas.microsoft.com/office/drawing/2017/model3d" xmlns:o="urn:schemas-microsoft-com:office:office" xmlns:oel="http://schemas.microsoft.com/office/2019/extlst" xmlns:r="http://schemas.openxmlformats.org/officeDocument/2006/relationships" xmlns:m="http://schemas.openxmlformats.org/officeDocument/2006/math" xmlns:v="urn:schemas-microsoft-com:vml" xmlns:wp14="http://schemas.microsoft.com/office/word/2010/wordprocessingDrawing" xmlns:wp="http://schemas.openxmlformats.org/drawingml/2006/wordprocessingDrawing" xmlns:w10="urn:schemas-microsoft-com:office:word" xmlns:w="http://schemas.openxmlformats.org/wordprocessingml/2006/main" xmlns:w14="http://schemas.microsoft.com/office/word/2010/wordml" xmlns:w15="http://schemas.microsoft.com/office/word/2012/wordml" xmlns:w16cex="http://schemas.microsoft.com/office/word/2018/wordml/cex" xmlns:w16cid="http://schemas.microsoft.com/office/word/2016/wordml/cid" xmlns:w16="http://schemas.microsoft.com/office/word/2018/wordml" xmlns:w16du="http://schemas.microsoft.com/office/word/2023/wordml/word16du" xmlns:w16sdtdh="http://schemas.microsoft.com/office/word/2020/wordml/sdtdatahash" xmlns:w16sdtfl="http://schemas.microsoft.com/office/word/2024/wordml/sdtformatlock" xmlns:w16se="http://schemas.microsoft.com/office/word/2015/wordml/symex" xmlns:wpg="http://schemas.microsoft.com/office/word/2010/wordprocessingGroup" xmlns:wpi="http://schemas.microsoft.com/office/word/2010/wordprocessingInk" xmlns:wne="http://schemas.microsoft.com/office/word/2006/wordml" xmlns:wps="http://schemas.microsoft.com/office/word/2010/wordprocessingShape" mc:Ignorable="w14 w15 w16se w16cid w16 w16cex w16sdtdh w16sdtfl w16du wp14">
+  <w:endnote w:type="separator" w:id="-1">
+    <w:p>
+      <w:pPr>
+        <w:spacing w:after="0" w:line="240" w:lineRule="auto"/>
+      </w:pPr>
+      <w:r>
+        <w:separator/>
+      </w:r>
+    </w:p>
+  </w:endnote>
+  <w:endnote w:type="continuationSeparator" w:id="0">
+    <w:p>
+      <w:pPr>
+        <w:spacing w:after="0" w:line="240" w:lineRule="auto"/>
+      </w:pPr>
+      <w:r>
+        <w:continuationSeparator/>
+      </w:r>
+    </w:p>
+  </w:endnote>
+</w:endnotes>
+</file>
+
+<file path=word/footnotes.xml><?xml version="1.0" encoding="utf-8"?>
+<w:footnotes xmlns:wpc="http://schemas.microsoft.com/office/word/2010/wordprocessingCanvas" xmlns:cx="http://schemas.microsoft.com/office/drawing/2014/chartex" xmlns:cx1="http://schemas.microsoft.com/office/drawing/2015/9/8/chartex" xmlns:cx2="http://schemas.microsoft.com/office/drawing/2015/10/21/chartex" xmlns:cx3="http://schemas.microsoft.com/office/drawing/2016/5/9/chartex" xmlns:cx4="http://schemas.microsoft.com/office/drawing/2016/5/10/chartex" xmlns:cx5="http://schemas.microsoft.com/office/drawing/2016/5/11/chartex" xmlns:cx6="http://schemas.microsoft.com/office/drawing/2016/5/12/chartex" xmlns:cx7="http://schemas.microsoft.com/office/drawing/2016/5/13/chartex" xmlns:cx8="http://schemas.microsoft.com/office/drawing/2016/5/14/chartex" xmlns:mc="http://schemas.openxmlformats.org/markup-compatibility/2006" xmlns:aink="http://schemas.microsoft.com/office/drawing/2016/ink" xmlns:am3d="http://schemas.microsoft.com/office/drawing/2017/model3d" xmlns:o="urn:schemas-microsoft-com:office:office" xmlns:oel="http://schemas.microsoft.com/office/2019/extlst" xmlns:r="http://schemas.openxmlformats.org/officeDocument/2006/relationships" xmlns:m="http://schemas.openxmlformats.org/officeDocument/2006/math" xmlns:v="urn:schemas-microsoft-com:vml" xmlns:wp14="http://schemas.microsoft.com/office/word/2010/wordprocessingDrawing" xmlns:wp="http://schemas.openxmlformats.org/drawingml/2006/wordprocessingDrawing" xmlns:w10="urn:schemas-microsoft-com:office:word" xmlns:w="http://schemas.openxmlformats.org/wordprocessingml/2006/main" xmlns:w14="http://schemas.microsoft.com/office/word/2010/wordml" xmlns:w15="http://schemas.microsoft.com/office/word/2012/wordml" xmlns:w16cex="http://schemas.microsoft.com/office/word/2018/wordml/cex" xmlns:w16cid="http://schemas.microsoft.com/office/word/2016/wordml/cid" xmlns:w16="http://schemas.microsoft.com/office/word/2018/wordml" xmlns:w16du="http://schemas.microsoft.com/office/word/2023/wordml/word16du" xmlns:w16sdtdh="http://schemas.microsoft.com/office/word/2020/wordml/sdtdatahash" xmlns:w16sdtfl="http://schemas.microsoft.com/office/word/2024/wordml/sdtformatlock" xmlns:w16se="http://schemas.microsoft.com/office/word/2015/wordml/symex" xmlns:wpg="http://schemas.microsoft.com/office/word/2010/wordprocessingGroup" xmlns:wpi="http://schemas.microsoft.com/office/word/2010/wordprocessingInk" xmlns:wne="http://schemas.microsoft.com/office/word/2006/wordml" xmlns:wps="http://schemas.microsoft.com/office/word/2010/wordprocessingShape" mc:Ignorable="w14 w15 w16se w16cid w16 w16cex w16sdtdh w16sdtfl w16du wp14">
+  <w:footnote w:type="separator" w:id="-1">
+    <w:p>
+      <w:pPr>
+        <w:spacing w:after="0" w:line="240" w:lineRule="auto"/>
+      </w:pPr>
+      <w:r>
+        <w:separator/>
+      </w:r>
+    </w:p>
+  </w:footnote>
+  <w:footnote w:type="continuationSeparator" w:id="0">
+    <w:p>
+      <w:pPr>
+        <w:spacing w:after="0" w:line="240" w:lineRule="auto"/>
+      </w:pPr>
+      <w:r>
+        <w:continuationSeparator/>
+      </w:r>
+    </w:p>
+  </w:footnote>
+</w:footnotes>
 </file>
 
 <file path=word/numbering.xml><?xml version="1.0" encoding="utf-8"?>
@@ -3524,7 +4420,6 @@
     <w:next w:val="Normal"/>
     <w:link w:val="Heading2Char"/>
     <w:uiPriority w:val="9"/>
-    <w:semiHidden/>
     <w:unhideWhenUsed/>
     <w:qFormat/>
     <w:rsid w:val="001E670A"/>
@@ -3547,7 +4442,6 @@
     <w:next w:val="Normal"/>
     <w:link w:val="Heading3Char"/>
     <w:uiPriority w:val="9"/>
-    <w:semiHidden/>
     <w:unhideWhenUsed/>
     <w:qFormat/>
     <w:rsid w:val="001E670A"/>
@@ -3741,7 +4635,6 @@
     <w:basedOn w:val="DefaultParagraphFont"/>
     <w:link w:val="Heading2"/>
     <w:uiPriority w:val="9"/>
-    <w:semiHidden/>
     <w:rsid w:val="001E670A"/>
     <w:rPr>
       <w:rFonts w:asciiTheme="majorHAnsi" w:eastAsiaTheme="majorEastAsia" w:hAnsiTheme="majorHAnsi" w:cstheme="majorBidi"/>
@@ -3755,7 +4648,6 @@
     <w:basedOn w:val="DefaultParagraphFont"/>
     <w:link w:val="Heading3"/>
     <w:uiPriority w:val="9"/>
-    <w:semiHidden/>
     <w:rsid w:val="001E670A"/>
     <w:rPr>
       <w:rFonts w:asciiTheme="minorHAnsi" w:eastAsiaTheme="majorEastAsia" w:hAnsiTheme="minorHAnsi" w:cstheme="majorBidi"/>
@@ -4031,6 +4923,50 @@
       <w:sz w:val="18"/>
       <w:szCs w:val="18"/>
     </w:rPr>
+  </w:style>
+  <w:style w:type="paragraph" w:styleId="Header">
+    <w:name w:val="header"/>
+    <w:basedOn w:val="Normal"/>
+    <w:link w:val="HeaderChar"/>
+    <w:uiPriority w:val="99"/>
+    <w:unhideWhenUsed/>
+    <w:rsid w:val="0090671C"/>
+    <w:pPr>
+      <w:tabs>
+        <w:tab w:val="center" w:pos="4513"/>
+        <w:tab w:val="right" w:pos="9026"/>
+      </w:tabs>
+      <w:spacing w:after="0" w:line="240" w:lineRule="auto"/>
+    </w:pPr>
+  </w:style>
+  <w:style w:type="character" w:customStyle="1" w:styleId="HeaderChar">
+    <w:name w:val="Header Char"/>
+    <w:basedOn w:val="DefaultParagraphFont"/>
+    <w:link w:val="Header"/>
+    <w:uiPriority w:val="99"/>
+    <w:rsid w:val="0090671C"/>
+  </w:style>
+  <w:style w:type="paragraph" w:styleId="Footer">
+    <w:name w:val="footer"/>
+    <w:basedOn w:val="Normal"/>
+    <w:link w:val="FooterChar"/>
+    <w:uiPriority w:val="99"/>
+    <w:unhideWhenUsed/>
+    <w:rsid w:val="0090671C"/>
+    <w:pPr>
+      <w:tabs>
+        <w:tab w:val="center" w:pos="4513"/>
+        <w:tab w:val="right" w:pos="9026"/>
+      </w:tabs>
+      <w:spacing w:after="0" w:line="240" w:lineRule="auto"/>
+    </w:pPr>
+  </w:style>
+  <w:style w:type="character" w:customStyle="1" w:styleId="FooterChar">
+    <w:name w:val="Footer Char"/>
+    <w:basedOn w:val="DefaultParagraphFont"/>
+    <w:link w:val="Footer"/>
+    <w:uiPriority w:val="99"/>
+    <w:rsid w:val="0090671C"/>
   </w:style>
 </w:styles>
 </file>

</xml_diff>